<commit_message>
Improve Arabic MLOps report formatting
</commit_message>
<xml_diff>
--- a/output/doc/MLOps_Report_AR.docx
+++ b/output/doc/MLOps_Report_AR.docx
@@ -5,28 +5,44 @@
     <w:p>
       <w:pPr>
         <w:bidi w:val="1"/>
-        <w:spacing w:after="120"/>
+        <w:spacing w:before="0" w:after="40" w:line="324" w:lineRule="auto"/>
         <w:jc w:val="center"/>
       </w:pPr>
       <w:r>
         <w:rPr>
-          <w:rFonts w:ascii="Arial" w:hAnsi="Arial" w:cs="Arial"/>
+          <w:rFonts w:ascii="Tahoma" w:hAnsi="Tahoma" w:cs="Tahoma"/>
           <w:b/>
           <w:color w:val="1F4E79"/>
-          <w:sz w:val="40"/>
+          <w:sz w:val="48"/>
         </w:rPr>
-        <w:t>تقرير MLOps - FITE Classification Challenge</w:t>
+        <w:t>تقرير MLOps</w:t>
       </w:r>
     </w:p>
     <w:p>
       <w:pPr>
         <w:bidi w:val="1"/>
-        <w:spacing w:after="120"/>
+        <w:spacing w:before="0" w:after="120" w:line="324" w:lineRule="auto"/>
         <w:jc w:val="center"/>
       </w:pPr>
       <w:r>
         <w:rPr>
-          <w:rFonts w:ascii="Arial" w:hAnsi="Arial" w:cs="Arial"/>
+          <w:rFonts w:ascii="Tahoma" w:hAnsi="Tahoma" w:cs="Tahoma"/>
+          <w:b/>
+          <w:color w:val="5A5A5A"/>
+          <w:sz w:val="32"/>
+        </w:rPr>
+        <w:t>FITE Classification Challenge</w:t>
+      </w:r>
+    </w:p>
+    <w:p>
+      <w:pPr>
+        <w:bidi w:val="1"/>
+        <w:spacing w:before="0" w:after="320" w:line="324" w:lineRule="auto"/>
+        <w:jc w:val="center"/>
+      </w:pPr>
+      <w:r>
+        <w:rPr>
+          <w:rFonts w:ascii="Tahoma" w:hAnsi="Tahoma" w:cs="Tahoma"/>
           <w:b w:val="0"/>
           <w:color w:val="5A5A5A"/>
           <w:sz w:val="26"/>
@@ -37,15 +53,15 @@
     <w:p>
       <w:pPr>
         <w:bidi w:val="1"/>
-        <w:spacing w:before="200" w:after="120"/>
+        <w:spacing w:before="280" w:after="160" w:line="288" w:lineRule="auto"/>
         <w:jc w:val="right"/>
       </w:pPr>
       <w:r>
         <w:rPr>
-          <w:rFonts w:ascii="Arial" w:hAnsi="Arial" w:cs="Arial"/>
+          <w:rFonts w:ascii="Tahoma" w:hAnsi="Tahoma" w:cs="Tahoma"/>
           <w:b/>
           <w:color w:val="1F4E79"/>
-          <w:sz w:val="36"/>
+          <w:sz w:val="40"/>
         </w:rPr>
         <w:t>1. ملخص المشروع</w:t>
       </w:r>
@@ -53,45 +69,60 @@
     <w:p>
       <w:pPr>
         <w:bidi w:val="1"/>
-        <w:spacing w:after="120"/>
+        <w:spacing w:before="0" w:after="160" w:line="324" w:lineRule="auto"/>
         <w:jc w:val="right"/>
       </w:pPr>
       <w:r>
         <w:rPr>
-          <w:rFonts w:ascii="Arial" w:hAnsi="Arial" w:cs="Arial"/>
+          <w:rFonts w:ascii="Tahoma" w:hAnsi="Tahoma" w:cs="Tahoma"/>
           <w:b w:val="0"/>
           <w:sz w:val="24"/>
         </w:rPr>
-        <w:t>المشروع عبارة عن مسألة تصنيف متعدد الكلاسات على بيانات جدولية مجهولة المعنى. الهدف هو تدريب نموذج يتنبأ بقيمة target لكل صف في test_data.csv ثم توليد ملف submission.csv مطابق لصيغة Kaggle.</w:t>
+        <w:t>المشروع عبارة عن مسألة تصنيف متعدد الكلاسات على بيانات جدولية مجهولة المعنى. الهدف هو تدريب نموذج يتنبأ بالعمود الهدف لكل صف في ملف الاختبار، ثم توليد ملف رفع مطابق لصيغة Kaggle.</w:t>
+      </w:r>
+    </w:p>
+    <w:p>
+      <w:pPr>
+        <w:spacing w:after="160"/>
+        <w:ind w:left="283" w:right="283"/>
+        <w:jc w:val="left"/>
+        <w:shd w:fill="F2F2F2"/>
+      </w:pPr>
+      <w:r>
+        <w:rPr>
+          <w:rFonts w:ascii="Consolas" w:hAnsi="Consolas"/>
+          <w:sz w:val="21"/>
+        </w:rPr>
+        <w:t>target, test_data.csv, submission.csv</w:t>
       </w:r>
     </w:p>
     <w:p>
       <w:pPr>
         <w:bidi w:val="1"/>
-        <w:spacing w:after="120"/>
+        <w:spacing w:before="0" w:after="160" w:line="324" w:lineRule="auto"/>
         <w:jc w:val="right"/>
       </w:pPr>
       <w:r>
         <w:rPr>
-          <w:rFonts w:ascii="Arial" w:hAnsi="Arial" w:cs="Arial"/>
+          <w:rFonts w:ascii="Tahoma" w:hAnsi="Tahoma" w:cs="Tahoma"/>
           <w:b w:val="0"/>
           <w:sz w:val="24"/>
         </w:rPr>
-        <w:t>بسبب عدم توازن الكلاسات، لم نعتمد على Accuracy فقط، بل كان Macro F1 هو المعيار الأساسي للمقارنة، مع استخدام Balanced Accuracy وConfusion Matrix لفهم أخطاء النموذج.</w:t>
+        <w:t>بسبب عدم توازن الكلاسات، لم نعتمد على Accuracy فقط. استخدمنا Macro F1 كمعيار أساسي، مع Balanced Accuracy وConfusion Matrix لفهم أخطاء النموذج بشكل أوضح.</w:t>
       </w:r>
     </w:p>
     <w:p>
       <w:pPr>
         <w:bidi w:val="1"/>
-        <w:spacing w:before="200" w:after="120"/>
+        <w:spacing w:before="280" w:after="160" w:line="288" w:lineRule="auto"/>
         <w:jc w:val="right"/>
       </w:pPr>
       <w:r>
         <w:rPr>
-          <w:rFonts w:ascii="Arial" w:hAnsi="Arial" w:cs="Arial"/>
+          <w:rFonts w:ascii="Tahoma" w:hAnsi="Tahoma" w:cs="Tahoma"/>
           <w:b/>
           <w:color w:val="1F4E79"/>
-          <w:sz w:val="36"/>
+          <w:sz w:val="40"/>
         </w:rPr>
         <w:t>2. الملفات المطلوبة للتسليم</w:t>
       </w:r>
@@ -102,16 +133,26 @@
         <w:tblW w:type="auto" w:w="0"/>
         <w:jc w:val="center"/>
         <w:tblLook w:firstColumn="1" w:firstRow="1" w:lastColumn="0" w:lastRow="0" w:noHBand="0" w:noVBand="1" w:val="04A0"/>
+        <w:bidiVisual w:val="1"/>
       </w:tblPr>
       <w:tblGrid>
-        <w:gridCol w:w="5040"/>
-        <w:gridCol w:w="5040"/>
+        <w:gridCol w:w="3402"/>
+        <w:gridCol w:w="5669"/>
       </w:tblGrid>
       <w:tr>
+        <w:trPr>
+          <w:trHeight w:val="425" w:hRule="atLeast"/>
+        </w:trPr>
         <w:tc>
           <w:tcPr>
-            <w:tcW w:type="dxa" w:w="5040"/>
+            <w:tcW w:type="dxa" w:w="5156"/>
             <w:shd w:fill="1F4E79"/>
+            <w:tcMar>
+              <w:top w:w="120" w:type="dxa"/>
+              <w:start w:w="140" w:type="dxa"/>
+              <w:bottom w:w="120" w:type="dxa"/>
+              <w:end w:w="140" w:type="dxa"/>
+            </w:tcMar>
             <w:vAlign w:val="center"/>
           </w:tcPr>
           <w:p>
@@ -122,7 +163,7 @@
             <w:r/>
             <w:r>
               <w:rPr>
-                <w:rFonts w:ascii="Arial" w:hAnsi="Arial" w:cs="Arial"/>
+                <w:rFonts w:ascii="Tahoma" w:hAnsi="Tahoma" w:cs="Tahoma"/>
                 <w:b/>
                 <w:color w:val="FFFFFF"/>
                 <w:sz w:val="21"/>
@@ -133,8 +174,14 @@
         </w:tc>
         <w:tc>
           <w:tcPr>
-            <w:tcW w:type="dxa" w:w="5040"/>
+            <w:tcW w:type="dxa" w:w="5156"/>
             <w:shd w:fill="1F4E79"/>
+            <w:tcMar>
+              <w:top w:w="120" w:type="dxa"/>
+              <w:start w:w="140" w:type="dxa"/>
+              <w:bottom w:w="120" w:type="dxa"/>
+              <w:end w:w="140" w:type="dxa"/>
+            </w:tcMar>
             <w:vAlign w:val="center"/>
           </w:tcPr>
           <w:p>
@@ -145,7 +192,7 @@
             <w:r/>
             <w:r>
               <w:rPr>
-                <w:rFonts w:ascii="Arial" w:hAnsi="Arial" w:cs="Arial"/>
+                <w:rFonts w:ascii="Tahoma" w:hAnsi="Tahoma" w:cs="Tahoma"/>
                 <w:b/>
                 <w:color w:val="FFFFFF"/>
                 <w:sz w:val="21"/>
@@ -156,9 +203,356 @@
         </w:tc>
       </w:tr>
       <w:tr>
+        <w:trPr>
+          <w:trHeight w:val="386" w:hRule="atLeast"/>
+        </w:trPr>
         <w:tc>
           <w:tcPr>
-            <w:tcW w:type="dxa" w:w="5040"/>
+            <w:tcW w:type="dxa" w:w="3402"/>
+            <w:tcMar>
+              <w:top w:w="120" w:type="dxa"/>
+              <w:start w:w="140" w:type="dxa"/>
+              <w:bottom w:w="120" w:type="dxa"/>
+              <w:end w:w="140" w:type="dxa"/>
+            </w:tcMar>
+            <w:shd w:fill="F8FBFD"/>
+            <w:vAlign w:val="center"/>
+          </w:tcPr>
+          <w:p>
+            <w:pPr>
+              <w:bidi w:val="1"/>
+              <w:spacing w:after="60" w:line="276" w:lineRule="auto"/>
+              <w:jc w:val="right"/>
+            </w:pPr>
+            <w:r/>
+            <w:r>
+              <w:rPr>
+                <w:rFonts w:ascii="Tahoma" w:hAnsi="Tahoma" w:cs="Tahoma"/>
+                <w:b w:val="0"/>
+                <w:sz w:val="20"/>
+              </w:rPr>
+              <w:t>classification_pipeline.ipynb</w:t>
+            </w:r>
+          </w:p>
+        </w:tc>
+        <w:tc>
+          <w:tcPr>
+            <w:tcW w:type="dxa" w:w="5669"/>
+            <w:tcMar>
+              <w:top w:w="120" w:type="dxa"/>
+              <w:start w:w="140" w:type="dxa"/>
+              <w:bottom w:w="120" w:type="dxa"/>
+              <w:end w:w="140" w:type="dxa"/>
+            </w:tcMar>
+            <w:shd w:fill="F8FBFD"/>
+            <w:vAlign w:val="center"/>
+          </w:tcPr>
+          <w:p>
+            <w:pPr>
+              <w:bidi w:val="1"/>
+              <w:spacing w:after="60" w:line="276" w:lineRule="auto"/>
+              <w:jc w:val="right"/>
+            </w:pPr>
+            <w:r/>
+            <w:r>
+              <w:rPr>
+                <w:rFonts w:ascii="Tahoma" w:hAnsi="Tahoma" w:cs="Tahoma"/>
+                <w:b w:val="0"/>
+                <w:sz w:val="20"/>
+              </w:rPr>
+              <w:t>النوتبوك الكامل: تحليل البيانات، التدريب، التقييم، MLflow، وتوليد ملف الرفع.</w:t>
+            </w:r>
+          </w:p>
+        </w:tc>
+      </w:tr>
+      <w:tr>
+        <w:trPr>
+          <w:trHeight w:val="386" w:hRule="atLeast"/>
+        </w:trPr>
+        <w:tc>
+          <w:tcPr>
+            <w:tcW w:type="dxa" w:w="3402"/>
+            <w:tcMar>
+              <w:top w:w="120" w:type="dxa"/>
+              <w:start w:w="140" w:type="dxa"/>
+              <w:bottom w:w="120" w:type="dxa"/>
+              <w:end w:w="140" w:type="dxa"/>
+            </w:tcMar>
+            <w:vAlign w:val="center"/>
+          </w:tcPr>
+          <w:p>
+            <w:pPr>
+              <w:bidi w:val="1"/>
+              <w:spacing w:after="60" w:line="276" w:lineRule="auto"/>
+              <w:jc w:val="right"/>
+            </w:pPr>
+            <w:r/>
+            <w:r>
+              <w:rPr>
+                <w:rFonts w:ascii="Tahoma" w:hAnsi="Tahoma" w:cs="Tahoma"/>
+                <w:b w:val="0"/>
+                <w:sz w:val="20"/>
+              </w:rPr>
+              <w:t>classification_pipeline.py</w:t>
+            </w:r>
+          </w:p>
+        </w:tc>
+        <w:tc>
+          <w:tcPr>
+            <w:tcW w:type="dxa" w:w="5669"/>
+            <w:tcMar>
+              <w:top w:w="120" w:type="dxa"/>
+              <w:start w:w="140" w:type="dxa"/>
+              <w:bottom w:w="120" w:type="dxa"/>
+              <w:end w:w="140" w:type="dxa"/>
+            </w:tcMar>
+            <w:vAlign w:val="center"/>
+          </w:tcPr>
+          <w:p>
+            <w:pPr>
+              <w:bidi w:val="1"/>
+              <w:spacing w:after="60" w:line="276" w:lineRule="auto"/>
+              <w:jc w:val="right"/>
+            </w:pPr>
+            <w:r/>
+            <w:r>
+              <w:rPr>
+                <w:rFonts w:ascii="Tahoma" w:hAnsi="Tahoma" w:cs="Tahoma"/>
+                <w:b w:val="0"/>
+                <w:sz w:val="20"/>
+              </w:rPr>
+              <w:t>نسخة Python مستقلة من نفس الـ pipeline قابلة للتشغيل المباشر.</w:t>
+            </w:r>
+          </w:p>
+        </w:tc>
+      </w:tr>
+      <w:tr>
+        <w:trPr>
+          <w:trHeight w:val="386" w:hRule="atLeast"/>
+        </w:trPr>
+        <w:tc>
+          <w:tcPr>
+            <w:tcW w:type="dxa" w:w="3402"/>
+            <w:tcMar>
+              <w:top w:w="120" w:type="dxa"/>
+              <w:start w:w="140" w:type="dxa"/>
+              <w:bottom w:w="120" w:type="dxa"/>
+              <w:end w:w="140" w:type="dxa"/>
+            </w:tcMar>
+            <w:shd w:fill="F8FBFD"/>
+            <w:vAlign w:val="center"/>
+          </w:tcPr>
+          <w:p>
+            <w:pPr>
+              <w:bidi w:val="1"/>
+              <w:spacing w:after="60" w:line="276" w:lineRule="auto"/>
+              <w:jc w:val="right"/>
+            </w:pPr>
+            <w:r/>
+            <w:r>
+              <w:rPr>
+                <w:rFonts w:ascii="Tahoma" w:hAnsi="Tahoma" w:cs="Tahoma"/>
+                <w:b w:val="0"/>
+                <w:sz w:val="20"/>
+              </w:rPr>
+              <w:t>MLOps_Report_AR.docx</w:t>
+            </w:r>
+          </w:p>
+        </w:tc>
+        <w:tc>
+          <w:tcPr>
+            <w:tcW w:type="dxa" w:w="5669"/>
+            <w:tcMar>
+              <w:top w:w="120" w:type="dxa"/>
+              <w:start w:w="140" w:type="dxa"/>
+              <w:bottom w:w="120" w:type="dxa"/>
+              <w:end w:w="140" w:type="dxa"/>
+            </w:tcMar>
+            <w:shd w:fill="F8FBFD"/>
+            <w:vAlign w:val="center"/>
+          </w:tcPr>
+          <w:p>
+            <w:pPr>
+              <w:bidi w:val="1"/>
+              <w:spacing w:after="60" w:line="276" w:lineRule="auto"/>
+              <w:jc w:val="right"/>
+            </w:pPr>
+            <w:r/>
+            <w:r>
+              <w:rPr>
+                <w:rFonts w:ascii="Tahoma" w:hAnsi="Tahoma" w:cs="Tahoma"/>
+                <w:b w:val="0"/>
+                <w:sz w:val="20"/>
+              </w:rPr>
+              <w:t>تقرير MLOps بالعربية يشرح التجارب، MLflow، DVC، والقرار النهائي.</w:t>
+            </w:r>
+          </w:p>
+        </w:tc>
+      </w:tr>
+    </w:tbl>
+    <w:p>
+      <w:pPr>
+        <w:bidi w:val="1"/>
+        <w:spacing w:before="280" w:after="160" w:line="288" w:lineRule="auto"/>
+        <w:jc w:val="right"/>
+      </w:pPr>
+      <w:r>
+        <w:rPr>
+          <w:rFonts w:ascii="Tahoma" w:hAnsi="Tahoma" w:cs="Tahoma"/>
+          <w:b/>
+          <w:color w:val="1F4E79"/>
+          <w:sz w:val="40"/>
+        </w:rPr>
+        <w:t>3. تتبع التجارب باستخدام MLflow</w:t>
+      </w:r>
+    </w:p>
+    <w:p>
+      <w:pPr>
+        <w:bidi w:val="1"/>
+        <w:spacing w:before="0" w:after="160" w:line="324" w:lineRule="auto"/>
+        <w:jc w:val="right"/>
+      </w:pPr>
+      <w:r>
+        <w:rPr>
+          <w:rFonts w:ascii="Tahoma" w:hAnsi="Tahoma" w:cs="Tahoma"/>
+          <w:b w:val="0"/>
+          <w:sz w:val="24"/>
+        </w:rPr>
+        <w:t>تم دمج MLflow داخل كود التدريب حتى يتم تسجيل التجارب بطريقة قابلة للمراجعة. كل تجربة تسجل اسم النموذج، عدد folds، قيمة random state، ونتائج Accuracy وBalanced Accuracy وMacro F1.</w:t>
+      </w:r>
+    </w:p>
+    <w:p>
+      <w:pPr>
+        <w:bidi w:val="1"/>
+        <w:spacing w:before="0" w:after="160" w:line="324" w:lineRule="auto"/>
+        <w:jc w:val="right"/>
+      </w:pPr>
+      <w:r>
+        <w:rPr>
+          <w:rFonts w:ascii="Tahoma" w:hAnsi="Tahoma" w:cs="Tahoma"/>
+          <w:b w:val="0"/>
+          <w:sz w:val="24"/>
+        </w:rPr>
+        <w:t>تجربة الـ ensemble النهائي تسجل أيضاً أسماء النماذج، الأوزان، نتيجة OOF، وملفات المخرجات.</w:t>
+      </w:r>
+    </w:p>
+    <w:p>
+      <w:pPr>
+        <w:bidi w:val="1"/>
+        <w:spacing w:before="0" w:after="160" w:line="324" w:lineRule="auto"/>
+        <w:jc w:val="right"/>
+      </w:pPr>
+      <w:r>
+        <w:rPr>
+          <w:rFonts w:ascii="Tahoma" w:hAnsi="Tahoma" w:cs="Tahoma"/>
+          <w:b w:val="0"/>
+          <w:sz w:val="24"/>
+        </w:rPr>
+        <w:t>لتشغيل واجهة MLflow محلياً، نستخدم الأمر التالي:</w:t>
+      </w:r>
+    </w:p>
+    <w:p>
+      <w:pPr>
+        <w:spacing w:after="160"/>
+        <w:ind w:left="283" w:right="283"/>
+        <w:jc w:val="left"/>
+        <w:shd w:fill="F2F2F2"/>
+      </w:pPr>
+      <w:r>
+        <w:rPr>
+          <w:rFonts w:ascii="Consolas" w:hAnsi="Consolas"/>
+          <w:sz w:val="21"/>
+        </w:rPr>
+        <w:t>mlflow ui --backend-store-uri sqlite:///mlflow.db</w:t>
+      </w:r>
+    </w:p>
+    <w:p>
+      <w:pPr>
+        <w:bidi w:val="1"/>
+        <w:spacing w:before="0" w:after="160" w:line="324" w:lineRule="auto"/>
+        <w:jc w:val="right"/>
+      </w:pPr>
+      <w:r>
+        <w:rPr>
+          <w:rFonts w:ascii="Tahoma" w:hAnsi="Tahoma" w:cs="Tahoma"/>
+          <w:b w:val="0"/>
+          <w:sz w:val="24"/>
+        </w:rPr>
+        <w:t>بعدها نفتح الرابط المحلي ونلتقط صورة شاشة من جدول التجارب:</w:t>
+      </w:r>
+    </w:p>
+    <w:p>
+      <w:pPr>
+        <w:spacing w:after="160"/>
+        <w:ind w:left="283" w:right="283"/>
+        <w:jc w:val="left"/>
+        <w:shd w:fill="F2F2F2"/>
+      </w:pPr>
+      <w:r>
+        <w:rPr>
+          <w:rFonts w:ascii="Consolas" w:hAnsi="Consolas"/>
+          <w:sz w:val="21"/>
+        </w:rPr>
+        <w:t>http://127.0.0.1:5000</w:t>
+      </w:r>
+    </w:p>
+    <w:p>
+      <w:pPr>
+        <w:bidi w:val="1"/>
+        <w:spacing w:before="160" w:after="160" w:line="288" w:lineRule="auto"/>
+        <w:jc w:val="right"/>
+      </w:pPr>
+      <w:r>
+        <w:rPr>
+          <w:rFonts w:ascii="Tahoma" w:hAnsi="Tahoma" w:cs="Tahoma"/>
+          <w:b/>
+          <w:color w:val="366092"/>
+          <w:sz w:val="30"/>
+        </w:rPr>
+        <w:t>مكان إضافة Screenshot MLflow</w:t>
+      </w:r>
+    </w:p>
+    <w:p>
+      <w:pPr>
+        <w:bidi w:val="1"/>
+        <w:spacing w:before="0" w:after="160" w:line="324" w:lineRule="auto"/>
+        <w:jc w:val="right"/>
+      </w:pPr>
+      <w:r>
+        <w:rPr>
+          <w:rFonts w:ascii="Tahoma" w:hAnsi="Tahoma" w:cs="Tahoma"/>
+          <w:b/>
+          <w:color w:val="B40000"/>
+          <w:sz w:val="24"/>
+        </w:rPr>
+        <w:t>الصق هنا صورة شاشة من واجهة MLflow تظهر جدول التجارب والمقاييس. يجب أن يظهر في الصورة أكثر من run حتى يكون واضحاً أننا جربنا عدة نماذج.</w:t>
+      </w:r>
+    </w:p>
+    <w:tbl>
+      <w:tblPr>
+        <w:tblStyle w:val="TableGrid"/>
+        <w:tblW w:type="auto" w:w="0"/>
+        <w:jc w:val="center"/>
+        <w:tblLook w:firstColumn="1" w:firstRow="1" w:lastColumn="0" w:lastRow="0" w:noHBand="0" w:noVBand="1" w:val="04A0"/>
+        <w:bidiVisual w:val="1"/>
+      </w:tblPr>
+      <w:tblGrid>
+        <w:gridCol w:w="8787"/>
+      </w:tblGrid>
+      <w:tr>
+        <w:trPr>
+          <w:trHeight w:val="425" w:hRule="atLeast"/>
+        </w:trPr>
+        <w:tc>
+          <w:tcPr>
+            <w:tcW w:type="dxa" w:w="10312"/>
+            <w:shd w:fill="1F4E79"/>
+            <w:tcMar>
+              <w:top w:w="120" w:type="dxa"/>
+              <w:start w:w="140" w:type="dxa"/>
+              <w:bottom w:w="120" w:type="dxa"/>
+              <w:end w:w="140" w:type="dxa"/>
+            </w:tcMar>
             <w:vAlign w:val="center"/>
           </w:tcPr>
           <w:p>
@@ -169,120 +563,46 @@
             <w:r/>
             <w:r>
               <w:rPr>
-                <w:rFonts w:ascii="Arial" w:hAnsi="Arial" w:cs="Arial"/>
-                <w:b w:val="0"/>
-                <w:sz w:val="20"/>
+                <w:rFonts w:ascii="Tahoma" w:hAnsi="Tahoma" w:cs="Tahoma"/>
+                <w:b/>
+                <w:color w:val="FFFFFF"/>
+                <w:sz w:val="21"/>
               </w:rPr>
-              <w:t>classification_pipeline.ipynb</w:t>
+              <w:t>مكان الصورة</w:t>
             </w:r>
           </w:p>
         </w:tc>
+      </w:tr>
+      <w:tr>
+        <w:trPr>
+          <w:trHeight w:val="386" w:hRule="atLeast"/>
+        </w:trPr>
         <w:tc>
           <w:tcPr>
-            <w:tcW w:type="dxa" w:w="5040"/>
+            <w:tcW w:type="dxa" w:w="8787"/>
+            <w:tcMar>
+              <w:top w:w="120" w:type="dxa"/>
+              <w:start w:w="140" w:type="dxa"/>
+              <w:bottom w:w="120" w:type="dxa"/>
+              <w:end w:w="140" w:type="dxa"/>
+            </w:tcMar>
+            <w:shd w:fill="F8FBFD"/>
             <w:vAlign w:val="center"/>
           </w:tcPr>
           <w:p>
             <w:pPr>
               <w:bidi w:val="1"/>
+              <w:spacing w:after="60" w:line="276" w:lineRule="auto"/>
               <w:jc w:val="right"/>
             </w:pPr>
             <w:r/>
             <w:r>
               <w:rPr>
-                <w:rFonts w:ascii="Arial" w:hAnsi="Arial" w:cs="Arial"/>
+                <w:rFonts w:ascii="Tahoma" w:hAnsi="Tahoma" w:cs="Tahoma"/>
                 <w:b w:val="0"/>
                 <w:sz w:val="20"/>
               </w:rPr>
-              <w:t>النوتبوك الكامل: تحليل، تدريب، تقييم، MLflow، وتوليد submission.csv.</w:t>
-            </w:r>
-          </w:p>
-        </w:tc>
-      </w:tr>
-      <w:tr>
-        <w:tc>
-          <w:tcPr>
-            <w:tcW w:type="dxa" w:w="5040"/>
-            <w:vAlign w:val="center"/>
-          </w:tcPr>
-          <w:p>
-            <w:pPr>
-              <w:bidi w:val="1"/>
-              <w:jc w:val="right"/>
-            </w:pPr>
-            <w:r/>
-            <w:r>
-              <w:rPr>
-                <w:rFonts w:ascii="Arial" w:hAnsi="Arial" w:cs="Arial"/>
-                <w:b w:val="0"/>
-                <w:sz w:val="20"/>
-              </w:rPr>
-              <w:t>classification_pipeline.py</w:t>
-            </w:r>
-          </w:p>
-        </w:tc>
-        <w:tc>
-          <w:tcPr>
-            <w:tcW w:type="dxa" w:w="5040"/>
-            <w:vAlign w:val="center"/>
-          </w:tcPr>
-          <w:p>
-            <w:pPr>
-              <w:bidi w:val="1"/>
-              <w:jc w:val="right"/>
-            </w:pPr>
-            <w:r/>
-            <w:r>
-              <w:rPr>
-                <w:rFonts w:ascii="Arial" w:hAnsi="Arial" w:cs="Arial"/>
-                <w:b w:val="0"/>
-                <w:sz w:val="20"/>
-              </w:rPr>
-              <w:t>نسخة Python مستقلة من نفس الـ pipeline قابلة للتشغيل المباشر.</w:t>
-            </w:r>
-          </w:p>
-        </w:tc>
-      </w:tr>
-      <w:tr>
-        <w:tc>
-          <w:tcPr>
-            <w:tcW w:type="dxa" w:w="5040"/>
-            <w:vAlign w:val="center"/>
-          </w:tcPr>
-          <w:p>
-            <w:pPr>
-              <w:bidi w:val="1"/>
-              <w:jc w:val="right"/>
-            </w:pPr>
-            <w:r/>
-            <w:r>
-              <w:rPr>
-                <w:rFonts w:ascii="Arial" w:hAnsi="Arial" w:cs="Arial"/>
-                <w:b w:val="0"/>
-                <w:sz w:val="20"/>
-              </w:rPr>
-              <w:t>MLOps_Report_AR.docx</w:t>
-            </w:r>
-          </w:p>
-        </w:tc>
-        <w:tc>
-          <w:tcPr>
-            <w:tcW w:type="dxa" w:w="5040"/>
-            <w:vAlign w:val="center"/>
-          </w:tcPr>
-          <w:p>
-            <w:pPr>
-              <w:bidi w:val="1"/>
-              <w:jc w:val="right"/>
-            </w:pPr>
-            <w:r/>
-            <w:r>
-              <w:rPr>
-                <w:rFonts w:ascii="Arial" w:hAnsi="Arial" w:cs="Arial"/>
-                <w:b w:val="0"/>
-                <w:sz w:val="20"/>
-              </w:rPr>
-              <w:t>هذا التقرير: يشرح MLflow وDVC والتجارب والنتائج.</w:t>
+              <w:t>الصق Screenshot MLflow هنا قبل التسليم النهائي</w:t>
             </w:r>
           </w:p>
         </w:tc>
@@ -291,197 +611,15 @@
     <w:p>
       <w:pPr>
         <w:bidi w:val="1"/>
-        <w:spacing w:before="200" w:after="120"/>
+        <w:spacing w:before="280" w:after="160" w:line="288" w:lineRule="auto"/>
         <w:jc w:val="right"/>
       </w:pPr>
       <w:r>
         <w:rPr>
-          <w:rFonts w:ascii="Arial" w:hAnsi="Arial" w:cs="Arial"/>
+          <w:rFonts w:ascii="Tahoma" w:hAnsi="Tahoma" w:cs="Tahoma"/>
           <w:b/>
           <w:color w:val="1F4E79"/>
-          <w:sz w:val="36"/>
-        </w:rPr>
-        <w:t>3. تتبع التجارب باستخدام MLflow</w:t>
-      </w:r>
-    </w:p>
-    <w:p>
-      <w:pPr>
-        <w:bidi w:val="1"/>
-        <w:spacing w:after="120"/>
-        <w:jc w:val="right"/>
-      </w:pPr>
-      <w:r>
-        <w:rPr>
-          <w:rFonts w:ascii="Arial" w:hAnsi="Arial" w:cs="Arial"/>
-          <w:b w:val="0"/>
-          <w:sz w:val="24"/>
-        </w:rPr>
-        <w:t>تم دمج MLflow داخل كود التدريب حتى نسجل التجارب بطريقة قابلة للمراجعة. كل تجربة تسجل اسم النموذج، عدد folds، random state، Accuracy، Balanced Accuracy، Macro F1، ونتائج folds.</w:t>
-      </w:r>
-    </w:p>
-    <w:p>
-      <w:pPr>
-        <w:bidi w:val="1"/>
-        <w:spacing w:after="120"/>
-        <w:jc w:val="right"/>
-      </w:pPr>
-      <w:r>
-        <w:rPr>
-          <w:rFonts w:ascii="Arial" w:hAnsi="Arial" w:cs="Arial"/>
-          <w:b w:val="0"/>
-          <w:sz w:val="24"/>
-        </w:rPr>
-        <w:t>كما يتم تسجيل تجربة الـ ensemble النهائي مع أسماء النماذج، الأوزان، OOF Accuracy، OOF Macro F1، وملفات artifacts الناتجة.</w:t>
-      </w:r>
-    </w:p>
-    <w:p>
-      <w:pPr>
-        <w:bidi w:val="1"/>
-        <w:spacing w:after="120"/>
-        <w:jc w:val="right"/>
-      </w:pPr>
-      <w:r>
-        <w:rPr>
-          <w:rFonts w:ascii="Arial" w:hAnsi="Arial" w:cs="Arial"/>
-          <w:b w:val="0"/>
-          <w:sz w:val="24"/>
-        </w:rPr>
-        <w:t>لتشغيل واجهة MLflow محلياً:</w:t>
-      </w:r>
-    </w:p>
-    <w:p>
-      <w:pPr>
-        <w:bidi w:val="1"/>
-        <w:spacing w:after="120"/>
-        <w:jc w:val="right"/>
-      </w:pPr>
-      <w:r>
-        <w:rPr>
-          <w:rFonts w:ascii="Arial" w:hAnsi="Arial" w:cs="Arial"/>
-          <w:b/>
-          <w:sz w:val="24"/>
-        </w:rPr>
-        <w:t>mlflow ui --backend-store-uri sqlite:///mlflow.db</w:t>
-      </w:r>
-    </w:p>
-    <w:p>
-      <w:pPr>
-        <w:bidi w:val="1"/>
-        <w:spacing w:after="120"/>
-        <w:jc w:val="right"/>
-      </w:pPr>
-      <w:r>
-        <w:rPr>
-          <w:rFonts w:ascii="Arial" w:hAnsi="Arial" w:cs="Arial"/>
-          <w:b w:val="0"/>
-          <w:sz w:val="24"/>
-        </w:rPr>
-        <w:t>ثم نفتح الرابط المحلي http://127.0.0.1:5000 ونأخذ screenshot لجدول التجارب.</w:t>
-      </w:r>
-    </w:p>
-    <w:p>
-      <w:pPr>
-        <w:bidi w:val="1"/>
-        <w:spacing w:before="120" w:after="120"/>
-        <w:jc w:val="right"/>
-      </w:pPr>
-      <w:r>
-        <w:rPr>
-          <w:rFonts w:ascii="Arial" w:hAnsi="Arial" w:cs="Arial"/>
-          <w:b/>
-          <w:color w:val="366092"/>
-          <w:sz w:val="30"/>
-        </w:rPr>
-        <w:t>مكان إضافة Screenshot MLflow</w:t>
-      </w:r>
-    </w:p>
-    <w:p>
-      <w:pPr>
-        <w:bidi w:val="1"/>
-        <w:spacing w:after="120"/>
-        <w:jc w:val="right"/>
-      </w:pPr>
-      <w:r>
-        <w:rPr>
-          <w:rFonts w:ascii="Arial" w:hAnsi="Arial" w:cs="Arial"/>
-          <w:b/>
-          <w:color w:val="B40000"/>
-          <w:sz w:val="24"/>
-        </w:rPr>
-        <w:t>ضع هنا صورة شاشة من واجهة MLflow تظهر جدول التجارب والمقاييس. يجب أن يظهر في الصورة أكثر من run حتى يكون واضحاً أننا جربنا عدة نماذج وليس نموذجاً واحداً فقط.</w:t>
-      </w:r>
-    </w:p>
-    <w:tbl>
-      <w:tblPr>
-        <w:tblStyle w:val="TableGrid"/>
-        <w:tblW w:type="auto" w:w="0"/>
-        <w:jc w:val="center"/>
-        <w:tblLook w:firstColumn="1" w:firstRow="1" w:lastColumn="0" w:lastRow="0" w:noHBand="0" w:noVBand="1" w:val="04A0"/>
-      </w:tblPr>
-      <w:tblGrid>
-        <w:gridCol w:w="10080"/>
-      </w:tblGrid>
-      <w:tr>
-        <w:tc>
-          <w:tcPr>
-            <w:tcW w:type="dxa" w:w="10080"/>
-            <w:shd w:fill="1F4E79"/>
-            <w:vAlign w:val="center"/>
-          </w:tcPr>
-          <w:p>
-            <w:pPr>
-              <w:bidi w:val="1"/>
-              <w:jc w:val="right"/>
-            </w:pPr>
-            <w:r/>
-            <w:r>
-              <w:rPr>
-                <w:rFonts w:ascii="Arial" w:hAnsi="Arial" w:cs="Arial"/>
-                <w:b/>
-                <w:color w:val="FFFFFF"/>
-                <w:sz w:val="21"/>
-              </w:rPr>
-              <w:t>Screenshot Placeholder</w:t>
-            </w:r>
-          </w:p>
-        </w:tc>
-      </w:tr>
-      <w:tr>
-        <w:tc>
-          <w:tcPr>
-            <w:tcW w:type="dxa" w:w="10080"/>
-            <w:vAlign w:val="center"/>
-          </w:tcPr>
-          <w:p>
-            <w:pPr>
-              <w:bidi w:val="1"/>
-              <w:jc w:val="right"/>
-            </w:pPr>
-            <w:r/>
-            <w:r>
-              <w:rPr>
-                <w:rFonts w:ascii="Arial" w:hAnsi="Arial" w:cs="Arial"/>
-                <w:b w:val="0"/>
-                <w:sz w:val="20"/>
-              </w:rPr>
-              <w:t>الصق صورة MLflow UI هنا قبل التسليم النهائي</w:t>
-            </w:r>
-          </w:p>
-        </w:tc>
-      </w:tr>
-    </w:tbl>
-    <w:p>
-      <w:pPr>
-        <w:bidi w:val="1"/>
-        <w:spacing w:before="200" w:after="120"/>
-        <w:jc w:val="right"/>
-      </w:pPr>
-      <w:r>
-        <w:rPr>
-          <w:rFonts w:ascii="Arial" w:hAnsi="Arial" w:cs="Arial"/>
-          <w:b/>
-          <w:color w:val="1F4E79"/>
-          <w:sz w:val="36"/>
+          <w:sz w:val="40"/>
         </w:rPr>
         <w:t>4. التجارب التي تم تنفيذها</w:t>
       </w:r>
@@ -489,30 +627,30 @@
     <w:p>
       <w:pPr>
         <w:bidi w:val="1"/>
-        <w:spacing w:after="120"/>
+        <w:spacing w:before="0" w:after="160" w:line="324" w:lineRule="auto"/>
         <w:jc w:val="right"/>
       </w:pPr>
       <w:r>
         <w:rPr>
-          <w:rFonts w:ascii="Arial" w:hAnsi="Arial" w:cs="Arial"/>
+          <w:rFonts w:ascii="Tahoma" w:hAnsi="Tahoma" w:cs="Tahoma"/>
           <w:b w:val="0"/>
           <w:sz w:val="24"/>
         </w:rPr>
-        <w:t>تمت تجربة عدة عائلات من النماذج، وليس الاعتماد مباشرة على نموذج واحد. هذا مهم لأن البيانات anonymized ولا نستطيع استخدام معنى الأعمدة لبناء حل يدوي.</w:t>
+        <w:t>لم نعتمد مباشرة على نموذج واحد. جربنا عدة عائلات من النماذج لأن الأعمدة مجهولة المعنى ولا نملك تفسيراً مجالياً مباشراً لها.</w:t>
       </w:r>
     </w:p>
     <w:p>
       <w:pPr>
         <w:bidi w:val="1"/>
-        <w:spacing w:after="60"/>
-        <w:ind w:right="360"/>
+        <w:spacing w:after="100" w:line="300" w:lineRule="auto"/>
+        <w:ind w:right="255"/>
         <w:jc w:val="right"/>
       </w:pPr>
       <w:r>
         <w:rPr>
-          <w:rFonts w:ascii="Arial" w:hAnsi="Arial" w:cs="Arial"/>
+          <w:rFonts w:ascii="Tahoma" w:hAnsi="Tahoma" w:cs="Tahoma"/>
           <w:b w:val="0"/>
-          <w:sz w:val="24"/>
+          <w:sz w:val="23"/>
         </w:rPr>
         <w:t>• LightGBM</w:t>
       </w:r>
@@ -520,15 +658,15 @@
     <w:p>
       <w:pPr>
         <w:bidi w:val="1"/>
-        <w:spacing w:after="60"/>
-        <w:ind w:right="360"/>
+        <w:spacing w:after="100" w:line="300" w:lineRule="auto"/>
+        <w:ind w:right="255"/>
         <w:jc w:val="right"/>
       </w:pPr>
       <w:r>
         <w:rPr>
-          <w:rFonts w:ascii="Arial" w:hAnsi="Arial" w:cs="Arial"/>
+          <w:rFonts w:ascii="Tahoma" w:hAnsi="Tahoma" w:cs="Tahoma"/>
           <w:b w:val="0"/>
-          <w:sz w:val="24"/>
+          <w:sz w:val="23"/>
         </w:rPr>
         <w:t>• Random Forest</w:t>
       </w:r>
@@ -536,15 +674,15 @@
     <w:p>
       <w:pPr>
         <w:bidi w:val="1"/>
-        <w:spacing w:after="60"/>
-        <w:ind w:right="360"/>
+        <w:spacing w:after="100" w:line="300" w:lineRule="auto"/>
+        <w:ind w:right="255"/>
         <w:jc w:val="right"/>
       </w:pPr>
       <w:r>
         <w:rPr>
-          <w:rFonts w:ascii="Arial" w:hAnsi="Arial" w:cs="Arial"/>
+          <w:rFonts w:ascii="Tahoma" w:hAnsi="Tahoma" w:cs="Tahoma"/>
           <w:b w:val="0"/>
-          <w:sz w:val="24"/>
+          <w:sz w:val="23"/>
         </w:rPr>
         <w:t>• Extra Trees</w:t>
       </w:r>
@@ -552,15 +690,15 @@
     <w:p>
       <w:pPr>
         <w:bidi w:val="1"/>
-        <w:spacing w:after="60"/>
-        <w:ind w:right="360"/>
+        <w:spacing w:after="100" w:line="300" w:lineRule="auto"/>
+        <w:ind w:right="255"/>
         <w:jc w:val="right"/>
       </w:pPr>
       <w:r>
         <w:rPr>
-          <w:rFonts w:ascii="Arial" w:hAnsi="Arial" w:cs="Arial"/>
+          <w:rFonts w:ascii="Tahoma" w:hAnsi="Tahoma" w:cs="Tahoma"/>
           <w:b w:val="0"/>
-          <w:sz w:val="24"/>
+          <w:sz w:val="23"/>
         </w:rPr>
         <w:t>• HistGradientBoosting</w:t>
       </w:r>
@@ -568,15 +706,15 @@
     <w:p>
       <w:pPr>
         <w:bidi w:val="1"/>
-        <w:spacing w:after="60"/>
-        <w:ind w:right="360"/>
+        <w:spacing w:after="100" w:line="300" w:lineRule="auto"/>
+        <w:ind w:right="255"/>
         <w:jc w:val="right"/>
       </w:pPr>
       <w:r>
         <w:rPr>
-          <w:rFonts w:ascii="Arial" w:hAnsi="Arial" w:cs="Arial"/>
+          <w:rFonts w:ascii="Tahoma" w:hAnsi="Tahoma" w:cs="Tahoma"/>
           <w:b w:val="0"/>
-          <w:sz w:val="24"/>
+          <w:sz w:val="23"/>
         </w:rPr>
         <w:t>• XGBoost</w:t>
       </w:r>
@@ -584,15 +722,15 @@
     <w:p>
       <w:pPr>
         <w:bidi w:val="1"/>
-        <w:spacing w:after="60"/>
-        <w:ind w:right="360"/>
+        <w:spacing w:after="100" w:line="300" w:lineRule="auto"/>
+        <w:ind w:right="255"/>
         <w:jc w:val="right"/>
       </w:pPr>
       <w:r>
         <w:rPr>
-          <w:rFonts w:ascii="Arial" w:hAnsi="Arial" w:cs="Arial"/>
+          <w:rFonts w:ascii="Tahoma" w:hAnsi="Tahoma" w:cs="Tahoma"/>
           <w:b w:val="0"/>
-          <w:sz w:val="24"/>
+          <w:sz w:val="23"/>
         </w:rPr>
         <w:t>• Gradient Boosting</w:t>
       </w:r>
@@ -600,15 +738,15 @@
     <w:p>
       <w:pPr>
         <w:bidi w:val="1"/>
-        <w:spacing w:after="60"/>
-        <w:ind w:right="360"/>
+        <w:spacing w:after="100" w:line="300" w:lineRule="auto"/>
+        <w:ind w:right="255"/>
         <w:jc w:val="right"/>
       </w:pPr>
       <w:r>
         <w:rPr>
-          <w:rFonts w:ascii="Arial" w:hAnsi="Arial" w:cs="Arial"/>
+          <w:rFonts w:ascii="Tahoma" w:hAnsi="Tahoma" w:cs="Tahoma"/>
           <w:b w:val="0"/>
-          <w:sz w:val="24"/>
+          <w:sz w:val="23"/>
         </w:rPr>
         <w:t>• Logistic Regression</w:t>
       </w:r>
@@ -616,15 +754,15 @@
     <w:p>
       <w:pPr>
         <w:bidi w:val="1"/>
-        <w:spacing w:after="60"/>
-        <w:ind w:right="360"/>
+        <w:spacing w:after="100" w:line="300" w:lineRule="auto"/>
+        <w:ind w:right="255"/>
         <w:jc w:val="right"/>
       </w:pPr>
       <w:r>
         <w:rPr>
-          <w:rFonts w:ascii="Arial" w:hAnsi="Arial" w:cs="Arial"/>
+          <w:rFonts w:ascii="Tahoma" w:hAnsi="Tahoma" w:cs="Tahoma"/>
           <w:b w:val="0"/>
-          <w:sz w:val="24"/>
+          <w:sz w:val="23"/>
         </w:rPr>
         <w:t>• Decision Tree</w:t>
       </w:r>
@@ -632,15 +770,15 @@
     <w:p>
       <w:pPr>
         <w:bidi w:val="1"/>
-        <w:spacing w:after="60"/>
-        <w:ind w:right="360"/>
+        <w:spacing w:after="100" w:line="300" w:lineRule="auto"/>
+        <w:ind w:right="255"/>
         <w:jc w:val="right"/>
       </w:pPr>
       <w:r>
         <w:rPr>
-          <w:rFonts w:ascii="Arial" w:hAnsi="Arial" w:cs="Arial"/>
+          <w:rFonts w:ascii="Tahoma" w:hAnsi="Tahoma" w:cs="Tahoma"/>
           <w:b w:val="0"/>
-          <w:sz w:val="24"/>
+          <w:sz w:val="23"/>
         </w:rPr>
         <w:t>• Bagging</w:t>
       </w:r>
@@ -648,15 +786,15 @@
     <w:p>
       <w:pPr>
         <w:bidi w:val="1"/>
-        <w:spacing w:after="60"/>
-        <w:ind w:right="360"/>
+        <w:spacing w:after="100" w:line="300" w:lineRule="auto"/>
+        <w:ind w:right="255"/>
         <w:jc w:val="right"/>
       </w:pPr>
       <w:r>
         <w:rPr>
-          <w:rFonts w:ascii="Arial" w:hAnsi="Arial" w:cs="Arial"/>
+          <w:rFonts w:ascii="Tahoma" w:hAnsi="Tahoma" w:cs="Tahoma"/>
           <w:b w:val="0"/>
-          <w:sz w:val="24"/>
+          <w:sz w:val="23"/>
         </w:rPr>
         <w:t>• KNN</w:t>
       </w:r>
@@ -664,15 +802,15 @@
     <w:p>
       <w:pPr>
         <w:bidi w:val="1"/>
-        <w:spacing w:after="60"/>
-        <w:ind w:right="360"/>
+        <w:spacing w:after="100" w:line="300" w:lineRule="auto"/>
+        <w:ind w:right="255"/>
         <w:jc w:val="right"/>
       </w:pPr>
       <w:r>
         <w:rPr>
-          <w:rFonts w:ascii="Arial" w:hAnsi="Arial" w:cs="Arial"/>
+          <w:rFonts w:ascii="Tahoma" w:hAnsi="Tahoma" w:cs="Tahoma"/>
           <w:b w:val="0"/>
-          <w:sz w:val="24"/>
+          <w:sz w:val="23"/>
         </w:rPr>
         <w:t>• AdaBoost</w:t>
       </w:r>
@@ -680,12 +818,12 @@
     <w:p>
       <w:pPr>
         <w:bidi w:val="1"/>
-        <w:spacing w:before="120" w:after="120"/>
+        <w:spacing w:before="160" w:after="160" w:line="288" w:lineRule="auto"/>
         <w:jc w:val="right"/>
       </w:pPr>
       <w:r>
         <w:rPr>
-          <w:rFonts w:ascii="Arial" w:hAnsi="Arial" w:cs="Arial"/>
+          <w:rFonts w:ascii="Tahoma" w:hAnsi="Tahoma" w:cs="Tahoma"/>
           <w:b/>
           <w:color w:val="366092"/>
           <w:sz w:val="30"/>
@@ -699,17 +837,27 @@
         <w:tblW w:type="auto" w:w="0"/>
         <w:jc w:val="center"/>
         <w:tblLook w:firstColumn="1" w:firstRow="1" w:lastColumn="0" w:lastRow="0" w:noHBand="0" w:noVBand="1" w:val="04A0"/>
+        <w:bidiVisual w:val="1"/>
       </w:tblPr>
       <w:tblGrid>
-        <w:gridCol w:w="3360"/>
-        <w:gridCol w:w="3360"/>
-        <w:gridCol w:w="3360"/>
+        <w:gridCol w:w="4252"/>
+        <w:gridCol w:w="2268"/>
+        <w:gridCol w:w="2268"/>
       </w:tblGrid>
       <w:tr>
+        <w:trPr>
+          <w:trHeight w:val="425" w:hRule="atLeast"/>
+        </w:trPr>
         <w:tc>
           <w:tcPr>
-            <w:tcW w:type="dxa" w:w="3360"/>
+            <w:tcW w:type="dxa" w:w="3437"/>
             <w:shd w:fill="1F4E79"/>
+            <w:tcMar>
+              <w:top w:w="120" w:type="dxa"/>
+              <w:start w:w="140" w:type="dxa"/>
+              <w:bottom w:w="120" w:type="dxa"/>
+              <w:end w:w="140" w:type="dxa"/>
+            </w:tcMar>
             <w:vAlign w:val="center"/>
           </w:tcPr>
           <w:p>
@@ -720,7 +868,7 @@
             <w:r/>
             <w:r>
               <w:rPr>
-                <w:rFonts w:ascii="Arial" w:hAnsi="Arial" w:cs="Arial"/>
+                <w:rFonts w:ascii="Tahoma" w:hAnsi="Tahoma" w:cs="Tahoma"/>
                 <w:b/>
                 <w:color w:val="FFFFFF"/>
                 <w:sz w:val="21"/>
@@ -731,8 +879,14 @@
         </w:tc>
         <w:tc>
           <w:tcPr>
-            <w:tcW w:type="dxa" w:w="3360"/>
+            <w:tcW w:type="dxa" w:w="3437"/>
             <w:shd w:fill="1F4E79"/>
+            <w:tcMar>
+              <w:top w:w="120" w:type="dxa"/>
+              <w:start w:w="140" w:type="dxa"/>
+              <w:bottom w:w="120" w:type="dxa"/>
+              <w:end w:w="140" w:type="dxa"/>
+            </w:tcMar>
             <w:vAlign w:val="center"/>
           </w:tcPr>
           <w:p>
@@ -743,7 +897,7 @@
             <w:r/>
             <w:r>
               <w:rPr>
-                <w:rFonts w:ascii="Arial" w:hAnsi="Arial" w:cs="Arial"/>
+                <w:rFonts w:ascii="Tahoma" w:hAnsi="Tahoma" w:cs="Tahoma"/>
                 <w:b/>
                 <w:color w:val="FFFFFF"/>
                 <w:sz w:val="21"/>
@@ -754,8 +908,14 @@
         </w:tc>
         <w:tc>
           <w:tcPr>
-            <w:tcW w:type="dxa" w:w="3360"/>
+            <w:tcW w:type="dxa" w:w="3437"/>
             <w:shd w:fill="1F4E79"/>
+            <w:tcMar>
+              <w:top w:w="120" w:type="dxa"/>
+              <w:start w:w="140" w:type="dxa"/>
+              <w:bottom w:w="120" w:type="dxa"/>
+              <w:end w:w="140" w:type="dxa"/>
+            </w:tcMar>
             <w:vAlign w:val="center"/>
           </w:tcPr>
           <w:p>
@@ -766,7 +926,7 @@
             <w:r/>
             <w:r>
               <w:rPr>
-                <w:rFonts w:ascii="Arial" w:hAnsi="Arial" w:cs="Arial"/>
+                <w:rFonts w:ascii="Tahoma" w:hAnsi="Tahoma" w:cs="Tahoma"/>
                 <w:b/>
                 <w:color w:val="FFFFFF"/>
                 <w:sz w:val="21"/>
@@ -777,20 +937,31 @@
         </w:tc>
       </w:tr>
       <w:tr>
+        <w:trPr>
+          <w:trHeight w:val="386" w:hRule="atLeast"/>
+        </w:trPr>
         <w:tc>
           <w:tcPr>
-            <w:tcW w:type="dxa" w:w="3360"/>
+            <w:tcW w:type="dxa" w:w="4252"/>
+            <w:tcMar>
+              <w:top w:w="120" w:type="dxa"/>
+              <w:start w:w="140" w:type="dxa"/>
+              <w:bottom w:w="120" w:type="dxa"/>
+              <w:end w:w="140" w:type="dxa"/>
+            </w:tcMar>
+            <w:shd w:fill="F8FBFD"/>
             <w:vAlign w:val="center"/>
           </w:tcPr>
           <w:p>
             <w:pPr>
               <w:bidi w:val="1"/>
+              <w:spacing w:after="60" w:line="276" w:lineRule="auto"/>
               <w:jc w:val="right"/>
             </w:pPr>
             <w:r/>
             <w:r>
               <w:rPr>
-                <w:rFonts w:ascii="Arial" w:hAnsi="Arial" w:cs="Arial"/>
+                <w:rFonts w:ascii="Tahoma" w:hAnsi="Tahoma" w:cs="Tahoma"/>
                 <w:b w:val="0"/>
                 <w:sz w:val="20"/>
               </w:rPr>
@@ -800,18 +971,26 @@
         </w:tc>
         <w:tc>
           <w:tcPr>
-            <w:tcW w:type="dxa" w:w="3360"/>
+            <w:tcW w:type="dxa" w:w="2268"/>
+            <w:tcMar>
+              <w:top w:w="120" w:type="dxa"/>
+              <w:start w:w="140" w:type="dxa"/>
+              <w:bottom w:w="120" w:type="dxa"/>
+              <w:end w:w="140" w:type="dxa"/>
+            </w:tcMar>
+            <w:shd w:fill="F8FBFD"/>
             <w:vAlign w:val="center"/>
           </w:tcPr>
           <w:p>
             <w:pPr>
               <w:bidi w:val="1"/>
+              <w:spacing w:after="60" w:line="276" w:lineRule="auto"/>
               <w:jc w:val="right"/>
             </w:pPr>
             <w:r/>
             <w:r>
               <w:rPr>
-                <w:rFonts w:ascii="Arial" w:hAnsi="Arial" w:cs="Arial"/>
+                <w:rFonts w:ascii="Tahoma" w:hAnsi="Tahoma" w:cs="Tahoma"/>
                 <w:b w:val="0"/>
                 <w:sz w:val="20"/>
               </w:rPr>
@@ -821,18 +1000,26 @@
         </w:tc>
         <w:tc>
           <w:tcPr>
-            <w:tcW w:type="dxa" w:w="3360"/>
+            <w:tcW w:type="dxa" w:w="2268"/>
+            <w:tcMar>
+              <w:top w:w="120" w:type="dxa"/>
+              <w:start w:w="140" w:type="dxa"/>
+              <w:bottom w:w="120" w:type="dxa"/>
+              <w:end w:w="140" w:type="dxa"/>
+            </w:tcMar>
+            <w:shd w:fill="F8FBFD"/>
             <w:vAlign w:val="center"/>
           </w:tcPr>
           <w:p>
             <w:pPr>
               <w:bidi w:val="1"/>
+              <w:spacing w:after="60" w:line="276" w:lineRule="auto"/>
               <w:jc w:val="right"/>
             </w:pPr>
             <w:r/>
             <w:r>
               <w:rPr>
-                <w:rFonts w:ascii="Arial" w:hAnsi="Arial" w:cs="Arial"/>
+                <w:rFonts w:ascii="Tahoma" w:hAnsi="Tahoma" w:cs="Tahoma"/>
                 <w:b w:val="0"/>
                 <w:sz w:val="20"/>
               </w:rPr>
@@ -842,20 +1029,30 @@
         </w:tc>
       </w:tr>
       <w:tr>
+        <w:trPr>
+          <w:trHeight w:val="386" w:hRule="atLeast"/>
+        </w:trPr>
         <w:tc>
           <w:tcPr>
-            <w:tcW w:type="dxa" w:w="3360"/>
+            <w:tcW w:type="dxa" w:w="4252"/>
+            <w:tcMar>
+              <w:top w:w="120" w:type="dxa"/>
+              <w:start w:w="140" w:type="dxa"/>
+              <w:bottom w:w="120" w:type="dxa"/>
+              <w:end w:w="140" w:type="dxa"/>
+            </w:tcMar>
             <w:vAlign w:val="center"/>
           </w:tcPr>
           <w:p>
             <w:pPr>
               <w:bidi w:val="1"/>
+              <w:spacing w:after="60" w:line="276" w:lineRule="auto"/>
               <w:jc w:val="right"/>
             </w:pPr>
             <w:r/>
             <w:r>
               <w:rPr>
-                <w:rFonts w:ascii="Arial" w:hAnsi="Arial" w:cs="Arial"/>
+                <w:rFonts w:ascii="Tahoma" w:hAnsi="Tahoma" w:cs="Tahoma"/>
                 <w:b w:val="0"/>
                 <w:sz w:val="20"/>
               </w:rPr>
@@ -865,18 +1062,25 @@
         </w:tc>
         <w:tc>
           <w:tcPr>
-            <w:tcW w:type="dxa" w:w="3360"/>
+            <w:tcW w:type="dxa" w:w="2268"/>
+            <w:tcMar>
+              <w:top w:w="120" w:type="dxa"/>
+              <w:start w:w="140" w:type="dxa"/>
+              <w:bottom w:w="120" w:type="dxa"/>
+              <w:end w:w="140" w:type="dxa"/>
+            </w:tcMar>
             <w:vAlign w:val="center"/>
           </w:tcPr>
           <w:p>
             <w:pPr>
               <w:bidi w:val="1"/>
+              <w:spacing w:after="60" w:line="276" w:lineRule="auto"/>
               <w:jc w:val="right"/>
             </w:pPr>
             <w:r/>
             <w:r>
               <w:rPr>
-                <w:rFonts w:ascii="Arial" w:hAnsi="Arial" w:cs="Arial"/>
+                <w:rFonts w:ascii="Tahoma" w:hAnsi="Tahoma" w:cs="Tahoma"/>
                 <w:b w:val="0"/>
                 <w:sz w:val="20"/>
               </w:rPr>
@@ -886,18 +1090,25 @@
         </w:tc>
         <w:tc>
           <w:tcPr>
-            <w:tcW w:type="dxa" w:w="3360"/>
+            <w:tcW w:type="dxa" w:w="2268"/>
+            <w:tcMar>
+              <w:top w:w="120" w:type="dxa"/>
+              <w:start w:w="140" w:type="dxa"/>
+              <w:bottom w:w="120" w:type="dxa"/>
+              <w:end w:w="140" w:type="dxa"/>
+            </w:tcMar>
             <w:vAlign w:val="center"/>
           </w:tcPr>
           <w:p>
             <w:pPr>
               <w:bidi w:val="1"/>
+              <w:spacing w:after="60" w:line="276" w:lineRule="auto"/>
               <w:jc w:val="right"/>
             </w:pPr>
             <w:r/>
             <w:r>
               <w:rPr>
-                <w:rFonts w:ascii="Arial" w:hAnsi="Arial" w:cs="Arial"/>
+                <w:rFonts w:ascii="Tahoma" w:hAnsi="Tahoma" w:cs="Tahoma"/>
                 <w:b w:val="0"/>
                 <w:sz w:val="20"/>
               </w:rPr>
@@ -907,20 +1118,31 @@
         </w:tc>
       </w:tr>
       <w:tr>
+        <w:trPr>
+          <w:trHeight w:val="386" w:hRule="atLeast"/>
+        </w:trPr>
         <w:tc>
           <w:tcPr>
-            <w:tcW w:type="dxa" w:w="3360"/>
+            <w:tcW w:type="dxa" w:w="4252"/>
+            <w:tcMar>
+              <w:top w:w="120" w:type="dxa"/>
+              <w:start w:w="140" w:type="dxa"/>
+              <w:bottom w:w="120" w:type="dxa"/>
+              <w:end w:w="140" w:type="dxa"/>
+            </w:tcMar>
+            <w:shd w:fill="F8FBFD"/>
             <w:vAlign w:val="center"/>
           </w:tcPr>
           <w:p>
             <w:pPr>
               <w:bidi w:val="1"/>
+              <w:spacing w:after="60" w:line="276" w:lineRule="auto"/>
               <w:jc w:val="right"/>
             </w:pPr>
             <w:r/>
             <w:r>
               <w:rPr>
-                <w:rFonts w:ascii="Arial" w:hAnsi="Arial" w:cs="Arial"/>
+                <w:rFonts w:ascii="Tahoma" w:hAnsi="Tahoma" w:cs="Tahoma"/>
                 <w:b w:val="0"/>
                 <w:sz w:val="20"/>
               </w:rPr>
@@ -930,18 +1152,26 @@
         </w:tc>
         <w:tc>
           <w:tcPr>
-            <w:tcW w:type="dxa" w:w="3360"/>
+            <w:tcW w:type="dxa" w:w="2268"/>
+            <w:tcMar>
+              <w:top w:w="120" w:type="dxa"/>
+              <w:start w:w="140" w:type="dxa"/>
+              <w:bottom w:w="120" w:type="dxa"/>
+              <w:end w:w="140" w:type="dxa"/>
+            </w:tcMar>
+            <w:shd w:fill="F8FBFD"/>
             <w:vAlign w:val="center"/>
           </w:tcPr>
           <w:p>
             <w:pPr>
               <w:bidi w:val="1"/>
+              <w:spacing w:after="60" w:line="276" w:lineRule="auto"/>
               <w:jc w:val="right"/>
             </w:pPr>
             <w:r/>
             <w:r>
               <w:rPr>
-                <w:rFonts w:ascii="Arial" w:hAnsi="Arial" w:cs="Arial"/>
+                <w:rFonts w:ascii="Tahoma" w:hAnsi="Tahoma" w:cs="Tahoma"/>
                 <w:b w:val="0"/>
                 <w:sz w:val="20"/>
               </w:rPr>
@@ -951,18 +1181,26 @@
         </w:tc>
         <w:tc>
           <w:tcPr>
-            <w:tcW w:type="dxa" w:w="3360"/>
+            <w:tcW w:type="dxa" w:w="2268"/>
+            <w:tcMar>
+              <w:top w:w="120" w:type="dxa"/>
+              <w:start w:w="140" w:type="dxa"/>
+              <w:bottom w:w="120" w:type="dxa"/>
+              <w:end w:w="140" w:type="dxa"/>
+            </w:tcMar>
+            <w:shd w:fill="F8FBFD"/>
             <w:vAlign w:val="center"/>
           </w:tcPr>
           <w:p>
             <w:pPr>
               <w:bidi w:val="1"/>
+              <w:spacing w:after="60" w:line="276" w:lineRule="auto"/>
               <w:jc w:val="right"/>
             </w:pPr>
             <w:r/>
             <w:r>
               <w:rPr>
-                <w:rFonts w:ascii="Arial" w:hAnsi="Arial" w:cs="Arial"/>
+                <w:rFonts w:ascii="Tahoma" w:hAnsi="Tahoma" w:cs="Tahoma"/>
                 <w:b w:val="0"/>
                 <w:sz w:val="20"/>
               </w:rPr>
@@ -972,20 +1210,30 @@
         </w:tc>
       </w:tr>
       <w:tr>
+        <w:trPr>
+          <w:trHeight w:val="386" w:hRule="atLeast"/>
+        </w:trPr>
         <w:tc>
           <w:tcPr>
-            <w:tcW w:type="dxa" w:w="3360"/>
+            <w:tcW w:type="dxa" w:w="4252"/>
+            <w:tcMar>
+              <w:top w:w="120" w:type="dxa"/>
+              <w:start w:w="140" w:type="dxa"/>
+              <w:bottom w:w="120" w:type="dxa"/>
+              <w:end w:w="140" w:type="dxa"/>
+            </w:tcMar>
             <w:vAlign w:val="center"/>
           </w:tcPr>
           <w:p>
             <w:pPr>
               <w:bidi w:val="1"/>
+              <w:spacing w:after="60" w:line="276" w:lineRule="auto"/>
               <w:jc w:val="right"/>
             </w:pPr>
             <w:r/>
             <w:r>
               <w:rPr>
-                <w:rFonts w:ascii="Arial" w:hAnsi="Arial" w:cs="Arial"/>
+                <w:rFonts w:ascii="Tahoma" w:hAnsi="Tahoma" w:cs="Tahoma"/>
                 <w:b w:val="0"/>
                 <w:sz w:val="20"/>
               </w:rPr>
@@ -995,18 +1243,25 @@
         </w:tc>
         <w:tc>
           <w:tcPr>
-            <w:tcW w:type="dxa" w:w="3360"/>
+            <w:tcW w:type="dxa" w:w="2268"/>
+            <w:tcMar>
+              <w:top w:w="120" w:type="dxa"/>
+              <w:start w:w="140" w:type="dxa"/>
+              <w:bottom w:w="120" w:type="dxa"/>
+              <w:end w:w="140" w:type="dxa"/>
+            </w:tcMar>
             <w:vAlign w:val="center"/>
           </w:tcPr>
           <w:p>
             <w:pPr>
               <w:bidi w:val="1"/>
+              <w:spacing w:after="60" w:line="276" w:lineRule="auto"/>
               <w:jc w:val="right"/>
             </w:pPr>
             <w:r/>
             <w:r>
               <w:rPr>
-                <w:rFonts w:ascii="Arial" w:hAnsi="Arial" w:cs="Arial"/>
+                <w:rFonts w:ascii="Tahoma" w:hAnsi="Tahoma" w:cs="Tahoma"/>
                 <w:b w:val="0"/>
                 <w:sz w:val="20"/>
               </w:rPr>
@@ -1016,18 +1271,25 @@
         </w:tc>
         <w:tc>
           <w:tcPr>
-            <w:tcW w:type="dxa" w:w="3360"/>
+            <w:tcW w:type="dxa" w:w="2268"/>
+            <w:tcMar>
+              <w:top w:w="120" w:type="dxa"/>
+              <w:start w:w="140" w:type="dxa"/>
+              <w:bottom w:w="120" w:type="dxa"/>
+              <w:end w:w="140" w:type="dxa"/>
+            </w:tcMar>
             <w:vAlign w:val="center"/>
           </w:tcPr>
           <w:p>
             <w:pPr>
               <w:bidi w:val="1"/>
+              <w:spacing w:after="60" w:line="276" w:lineRule="auto"/>
               <w:jc w:val="right"/>
             </w:pPr>
             <w:r/>
             <w:r>
               <w:rPr>
-                <w:rFonts w:ascii="Arial" w:hAnsi="Arial" w:cs="Arial"/>
+                <w:rFonts w:ascii="Tahoma" w:hAnsi="Tahoma" w:cs="Tahoma"/>
                 <w:b w:val="0"/>
                 <w:sz w:val="20"/>
               </w:rPr>
@@ -1037,20 +1299,31 @@
         </w:tc>
       </w:tr>
       <w:tr>
+        <w:trPr>
+          <w:trHeight w:val="386" w:hRule="atLeast"/>
+        </w:trPr>
         <w:tc>
           <w:tcPr>
-            <w:tcW w:type="dxa" w:w="3360"/>
+            <w:tcW w:type="dxa" w:w="4252"/>
+            <w:tcMar>
+              <w:top w:w="120" w:type="dxa"/>
+              <w:start w:w="140" w:type="dxa"/>
+              <w:bottom w:w="120" w:type="dxa"/>
+              <w:end w:w="140" w:type="dxa"/>
+            </w:tcMar>
+            <w:shd w:fill="F8FBFD"/>
             <w:vAlign w:val="center"/>
           </w:tcPr>
           <w:p>
             <w:pPr>
               <w:bidi w:val="1"/>
+              <w:spacing w:after="60" w:line="276" w:lineRule="auto"/>
               <w:jc w:val="right"/>
             </w:pPr>
             <w:r/>
             <w:r>
               <w:rPr>
-                <w:rFonts w:ascii="Arial" w:hAnsi="Arial" w:cs="Arial"/>
+                <w:rFonts w:ascii="Tahoma" w:hAnsi="Tahoma" w:cs="Tahoma"/>
                 <w:b w:val="0"/>
                 <w:sz w:val="20"/>
               </w:rPr>
@@ -1060,18 +1333,26 @@
         </w:tc>
         <w:tc>
           <w:tcPr>
-            <w:tcW w:type="dxa" w:w="3360"/>
+            <w:tcW w:type="dxa" w:w="2268"/>
+            <w:tcMar>
+              <w:top w:w="120" w:type="dxa"/>
+              <w:start w:w="140" w:type="dxa"/>
+              <w:bottom w:w="120" w:type="dxa"/>
+              <w:end w:w="140" w:type="dxa"/>
+            </w:tcMar>
+            <w:shd w:fill="F8FBFD"/>
             <w:vAlign w:val="center"/>
           </w:tcPr>
           <w:p>
             <w:pPr>
               <w:bidi w:val="1"/>
+              <w:spacing w:after="60" w:line="276" w:lineRule="auto"/>
               <w:jc w:val="right"/>
             </w:pPr>
             <w:r/>
             <w:r>
               <w:rPr>
-                <w:rFonts w:ascii="Arial" w:hAnsi="Arial" w:cs="Arial"/>
+                <w:rFonts w:ascii="Tahoma" w:hAnsi="Tahoma" w:cs="Tahoma"/>
                 <w:b w:val="0"/>
                 <w:sz w:val="20"/>
               </w:rPr>
@@ -1081,18 +1362,26 @@
         </w:tc>
         <w:tc>
           <w:tcPr>
-            <w:tcW w:type="dxa" w:w="3360"/>
+            <w:tcW w:type="dxa" w:w="2268"/>
+            <w:tcMar>
+              <w:top w:w="120" w:type="dxa"/>
+              <w:start w:w="140" w:type="dxa"/>
+              <w:bottom w:w="120" w:type="dxa"/>
+              <w:end w:w="140" w:type="dxa"/>
+            </w:tcMar>
+            <w:shd w:fill="F8FBFD"/>
             <w:vAlign w:val="center"/>
           </w:tcPr>
           <w:p>
             <w:pPr>
               <w:bidi w:val="1"/>
+              <w:spacing w:after="60" w:line="276" w:lineRule="auto"/>
               <w:jc w:val="right"/>
             </w:pPr>
             <w:r/>
             <w:r>
               <w:rPr>
-                <w:rFonts w:ascii="Arial" w:hAnsi="Arial" w:cs="Arial"/>
+                <w:rFonts w:ascii="Tahoma" w:hAnsi="Tahoma" w:cs="Tahoma"/>
                 <w:b w:val="0"/>
                 <w:sz w:val="20"/>
               </w:rPr>
@@ -1102,20 +1391,30 @@
         </w:tc>
       </w:tr>
       <w:tr>
+        <w:trPr>
+          <w:trHeight w:val="386" w:hRule="atLeast"/>
+        </w:trPr>
         <w:tc>
           <w:tcPr>
-            <w:tcW w:type="dxa" w:w="3360"/>
+            <w:tcW w:type="dxa" w:w="4252"/>
+            <w:tcMar>
+              <w:top w:w="120" w:type="dxa"/>
+              <w:start w:w="140" w:type="dxa"/>
+              <w:bottom w:w="120" w:type="dxa"/>
+              <w:end w:w="140" w:type="dxa"/>
+            </w:tcMar>
             <w:vAlign w:val="center"/>
           </w:tcPr>
           <w:p>
             <w:pPr>
               <w:bidi w:val="1"/>
+              <w:spacing w:after="60" w:line="276" w:lineRule="auto"/>
               <w:jc w:val="right"/>
             </w:pPr>
             <w:r/>
             <w:r>
               <w:rPr>
-                <w:rFonts w:ascii="Arial" w:hAnsi="Arial" w:cs="Arial"/>
+                <w:rFonts w:ascii="Tahoma" w:hAnsi="Tahoma" w:cs="Tahoma"/>
                 <w:b w:val="0"/>
                 <w:sz w:val="20"/>
               </w:rPr>
@@ -1125,18 +1424,25 @@
         </w:tc>
         <w:tc>
           <w:tcPr>
-            <w:tcW w:type="dxa" w:w="3360"/>
+            <w:tcW w:type="dxa" w:w="2268"/>
+            <w:tcMar>
+              <w:top w:w="120" w:type="dxa"/>
+              <w:start w:w="140" w:type="dxa"/>
+              <w:bottom w:w="120" w:type="dxa"/>
+              <w:end w:w="140" w:type="dxa"/>
+            </w:tcMar>
             <w:vAlign w:val="center"/>
           </w:tcPr>
           <w:p>
             <w:pPr>
               <w:bidi w:val="1"/>
+              <w:spacing w:after="60" w:line="276" w:lineRule="auto"/>
               <w:jc w:val="right"/>
             </w:pPr>
             <w:r/>
             <w:r>
               <w:rPr>
-                <w:rFonts w:ascii="Arial" w:hAnsi="Arial" w:cs="Arial"/>
+                <w:rFonts w:ascii="Tahoma" w:hAnsi="Tahoma" w:cs="Tahoma"/>
                 <w:b w:val="0"/>
                 <w:sz w:val="20"/>
               </w:rPr>
@@ -1146,18 +1452,25 @@
         </w:tc>
         <w:tc>
           <w:tcPr>
-            <w:tcW w:type="dxa" w:w="3360"/>
+            <w:tcW w:type="dxa" w:w="2268"/>
+            <w:tcMar>
+              <w:top w:w="120" w:type="dxa"/>
+              <w:start w:w="140" w:type="dxa"/>
+              <w:bottom w:w="120" w:type="dxa"/>
+              <w:end w:w="140" w:type="dxa"/>
+            </w:tcMar>
             <w:vAlign w:val="center"/>
           </w:tcPr>
           <w:p>
             <w:pPr>
               <w:bidi w:val="1"/>
+              <w:spacing w:after="60" w:line="276" w:lineRule="auto"/>
               <w:jc w:val="right"/>
             </w:pPr>
             <w:r/>
             <w:r>
               <w:rPr>
-                <w:rFonts w:ascii="Arial" w:hAnsi="Arial" w:cs="Arial"/>
+                <w:rFonts w:ascii="Tahoma" w:hAnsi="Tahoma" w:cs="Tahoma"/>
                 <w:b w:val="0"/>
                 <w:sz w:val="20"/>
               </w:rPr>
@@ -1170,15 +1483,15 @@
     <w:p>
       <w:pPr>
         <w:bidi w:val="1"/>
-        <w:spacing w:before="200" w:after="120"/>
+        <w:spacing w:before="280" w:after="160" w:line="288" w:lineRule="auto"/>
         <w:jc w:val="right"/>
       </w:pPr>
       <w:r>
         <w:rPr>
-          <w:rFonts w:ascii="Arial" w:hAnsi="Arial" w:cs="Arial"/>
+          <w:rFonts w:ascii="Tahoma" w:hAnsi="Tahoma" w:cs="Tahoma"/>
           <w:b/>
           <w:color w:val="1F4E79"/>
-          <w:sz w:val="36"/>
+          <w:sz w:val="40"/>
         </w:rPr>
         <w:t>5. استراتيجية التحقق Validation</w:t>
       </w:r>
@@ -1186,12 +1499,12 @@
     <w:p>
       <w:pPr>
         <w:bidi w:val="1"/>
-        <w:spacing w:after="120"/>
+        <w:spacing w:before="0" w:after="160" w:line="324" w:lineRule="auto"/>
         <w:jc w:val="right"/>
       </w:pPr>
       <w:r>
         <w:rPr>
-          <w:rFonts w:ascii="Arial" w:hAnsi="Arial" w:cs="Arial"/>
+          <w:rFonts w:ascii="Tahoma" w:hAnsi="Tahoma" w:cs="Tahoma"/>
           <w:b w:val="0"/>
           <w:sz w:val="24"/>
         </w:rPr>
@@ -1201,30 +1514,30 @@
     <w:p>
       <w:pPr>
         <w:bidi w:val="1"/>
-        <w:spacing w:after="120"/>
+        <w:spacing w:before="0" w:after="160" w:line="324" w:lineRule="auto"/>
         <w:jc w:val="right"/>
       </w:pPr>
       <w:r>
         <w:rPr>
-          <w:rFonts w:ascii="Arial" w:hAnsi="Arial" w:cs="Arial"/>
+          <w:rFonts w:ascii="Tahoma" w:hAnsi="Tahoma" w:cs="Tahoma"/>
           <w:b w:val="0"/>
           <w:sz w:val="24"/>
         </w:rPr>
-        <w:t>استخدمنا Macro F1 كمعيار أساسي لأنه يحاسب النموذج على أداء كل كلاس بشكل متوازن. هذا يمنع أن تكون النتيجة عالية فقط بسبب توقع الكلاس الأكبر.</w:t>
+        <w:t>استخدمنا Macro F1 كمعيار أساسي لأنه يحاسب النموذج على أداء كل كلاس بشكل متوازن، بدل أن يسمح للكلاس الأكبر أن يسيطر على النتيجة.</w:t>
       </w:r>
     </w:p>
     <w:p>
       <w:pPr>
         <w:bidi w:val="1"/>
-        <w:spacing w:before="200" w:after="120"/>
+        <w:spacing w:before="280" w:after="160" w:line="288" w:lineRule="auto"/>
         <w:jc w:val="right"/>
       </w:pPr>
       <w:r>
         <w:rPr>
-          <w:rFonts w:ascii="Arial" w:hAnsi="Arial" w:cs="Arial"/>
+          <w:rFonts w:ascii="Tahoma" w:hAnsi="Tahoma" w:cs="Tahoma"/>
           <w:b/>
           <w:color w:val="1F4E79"/>
-          <w:sz w:val="36"/>
+          <w:sz w:val="40"/>
         </w:rPr>
         <w:t>6. فحص الثبات Robust Validation</w:t>
       </w:r>
@@ -1232,16 +1545,16 @@
     <w:p>
       <w:pPr>
         <w:bidi w:val="1"/>
-        <w:spacing w:after="120"/>
+        <w:spacing w:before="0" w:after="160" w:line="324" w:lineRule="auto"/>
         <w:jc w:val="right"/>
       </w:pPr>
       <w:r>
         <w:rPr>
-          <w:rFonts w:ascii="Arial" w:hAnsi="Arial" w:cs="Arial"/>
+          <w:rFonts w:ascii="Tahoma" w:hAnsi="Tahoma" w:cs="Tahoma"/>
           <w:b w:val="0"/>
           <w:sz w:val="24"/>
         </w:rPr>
-        <w:t>حتى لا نعتمد على split واحد فقط، أعدنا تقييم النماذج على أكثر من random_state. الهدف هو معرفة هل النموذج قوي فعلاً أم محظوظ بتقسيم واحد.</w:t>
+        <w:t>حتى لا نعتمد على split واحد فقط، أعدنا تقييم النماذج على أكثر من random state. الهدف هو معرفة هل النموذج قوي فعلاً أم محظوظ بتقسيم واحد.</w:t>
       </w:r>
     </w:p>
     <w:tbl>
@@ -1250,17 +1563,27 @@
         <w:tblW w:type="auto" w:w="0"/>
         <w:jc w:val="center"/>
         <w:tblLook w:firstColumn="1" w:firstRow="1" w:lastColumn="0" w:lastRow="0" w:noHBand="0" w:noVBand="1" w:val="04A0"/>
+        <w:bidiVisual w:val="1"/>
       </w:tblPr>
       <w:tblGrid>
-        <w:gridCol w:w="3360"/>
-        <w:gridCol w:w="3360"/>
-        <w:gridCol w:w="3360"/>
+        <w:gridCol w:w="3969"/>
+        <w:gridCol w:w="2551"/>
+        <w:gridCol w:w="2268"/>
       </w:tblGrid>
       <w:tr>
+        <w:trPr>
+          <w:trHeight w:val="425" w:hRule="atLeast"/>
+        </w:trPr>
         <w:tc>
           <w:tcPr>
-            <w:tcW w:type="dxa" w:w="3360"/>
+            <w:tcW w:type="dxa" w:w="3437"/>
             <w:shd w:fill="1F4E79"/>
+            <w:tcMar>
+              <w:top w:w="120" w:type="dxa"/>
+              <w:start w:w="140" w:type="dxa"/>
+              <w:bottom w:w="120" w:type="dxa"/>
+              <w:end w:w="140" w:type="dxa"/>
+            </w:tcMar>
             <w:vAlign w:val="center"/>
           </w:tcPr>
           <w:p>
@@ -1271,7 +1594,7 @@
             <w:r/>
             <w:r>
               <w:rPr>
-                <w:rFonts w:ascii="Arial" w:hAnsi="Arial" w:cs="Arial"/>
+                <w:rFonts w:ascii="Tahoma" w:hAnsi="Tahoma" w:cs="Tahoma"/>
                 <w:b/>
                 <w:color w:val="FFFFFF"/>
                 <w:sz w:val="21"/>
@@ -1282,8 +1605,14 @@
         </w:tc>
         <w:tc>
           <w:tcPr>
-            <w:tcW w:type="dxa" w:w="3360"/>
+            <w:tcW w:type="dxa" w:w="3437"/>
             <w:shd w:fill="1F4E79"/>
+            <w:tcMar>
+              <w:top w:w="120" w:type="dxa"/>
+              <w:start w:w="140" w:type="dxa"/>
+              <w:bottom w:w="120" w:type="dxa"/>
+              <w:end w:w="140" w:type="dxa"/>
+            </w:tcMar>
             <w:vAlign w:val="center"/>
           </w:tcPr>
           <w:p>
@@ -1294,7 +1623,7 @@
             <w:r/>
             <w:r>
               <w:rPr>
-                <w:rFonts w:ascii="Arial" w:hAnsi="Arial" w:cs="Arial"/>
+                <w:rFonts w:ascii="Tahoma" w:hAnsi="Tahoma" w:cs="Tahoma"/>
                 <w:b/>
                 <w:color w:val="FFFFFF"/>
                 <w:sz w:val="21"/>
@@ -1305,8 +1634,14 @@
         </w:tc>
         <w:tc>
           <w:tcPr>
-            <w:tcW w:type="dxa" w:w="3360"/>
+            <w:tcW w:type="dxa" w:w="3437"/>
             <w:shd w:fill="1F4E79"/>
+            <w:tcMar>
+              <w:top w:w="120" w:type="dxa"/>
+              <w:start w:w="140" w:type="dxa"/>
+              <w:bottom w:w="120" w:type="dxa"/>
+              <w:end w:w="140" w:type="dxa"/>
+            </w:tcMar>
             <w:vAlign w:val="center"/>
           </w:tcPr>
           <w:p>
@@ -1317,7 +1652,7 @@
             <w:r/>
             <w:r>
               <w:rPr>
-                <w:rFonts w:ascii="Arial" w:hAnsi="Arial" w:cs="Arial"/>
+                <w:rFonts w:ascii="Tahoma" w:hAnsi="Tahoma" w:cs="Tahoma"/>
                 <w:b/>
                 <w:color w:val="FFFFFF"/>
                 <w:sz w:val="21"/>
@@ -1328,20 +1663,31 @@
         </w:tc>
       </w:tr>
       <w:tr>
+        <w:trPr>
+          <w:trHeight w:val="386" w:hRule="atLeast"/>
+        </w:trPr>
         <w:tc>
           <w:tcPr>
-            <w:tcW w:type="dxa" w:w="3360"/>
+            <w:tcW w:type="dxa" w:w="3969"/>
+            <w:tcMar>
+              <w:top w:w="120" w:type="dxa"/>
+              <w:start w:w="140" w:type="dxa"/>
+              <w:bottom w:w="120" w:type="dxa"/>
+              <w:end w:w="140" w:type="dxa"/>
+            </w:tcMar>
+            <w:shd w:fill="F8FBFD"/>
             <w:vAlign w:val="center"/>
           </w:tcPr>
           <w:p>
             <w:pPr>
               <w:bidi w:val="1"/>
+              <w:spacing w:after="60" w:line="276" w:lineRule="auto"/>
               <w:jc w:val="right"/>
             </w:pPr>
             <w:r/>
             <w:r>
               <w:rPr>
-                <w:rFonts w:ascii="Arial" w:hAnsi="Arial" w:cs="Arial"/>
+                <w:rFonts w:ascii="Tahoma" w:hAnsi="Tahoma" w:cs="Tahoma"/>
                 <w:b w:val="0"/>
                 <w:sz w:val="20"/>
               </w:rPr>
@@ -1351,18 +1697,26 @@
         </w:tc>
         <w:tc>
           <w:tcPr>
-            <w:tcW w:type="dxa" w:w="3360"/>
+            <w:tcW w:type="dxa" w:w="2551"/>
+            <w:tcMar>
+              <w:top w:w="120" w:type="dxa"/>
+              <w:start w:w="140" w:type="dxa"/>
+              <w:bottom w:w="120" w:type="dxa"/>
+              <w:end w:w="140" w:type="dxa"/>
+            </w:tcMar>
+            <w:shd w:fill="F8FBFD"/>
             <w:vAlign w:val="center"/>
           </w:tcPr>
           <w:p>
             <w:pPr>
               <w:bidi w:val="1"/>
+              <w:spacing w:after="60" w:line="276" w:lineRule="auto"/>
               <w:jc w:val="right"/>
             </w:pPr>
             <w:r/>
             <w:r>
               <w:rPr>
-                <w:rFonts w:ascii="Arial" w:hAnsi="Arial" w:cs="Arial"/>
+                <w:rFonts w:ascii="Tahoma" w:hAnsi="Tahoma" w:cs="Tahoma"/>
                 <w:b w:val="0"/>
                 <w:sz w:val="20"/>
               </w:rPr>
@@ -1372,18 +1726,26 @@
         </w:tc>
         <w:tc>
           <w:tcPr>
-            <w:tcW w:type="dxa" w:w="3360"/>
+            <w:tcW w:type="dxa" w:w="2268"/>
+            <w:tcMar>
+              <w:top w:w="120" w:type="dxa"/>
+              <w:start w:w="140" w:type="dxa"/>
+              <w:bottom w:w="120" w:type="dxa"/>
+              <w:end w:w="140" w:type="dxa"/>
+            </w:tcMar>
+            <w:shd w:fill="F8FBFD"/>
             <w:vAlign w:val="center"/>
           </w:tcPr>
           <w:p>
             <w:pPr>
               <w:bidi w:val="1"/>
+              <w:spacing w:after="60" w:line="276" w:lineRule="auto"/>
               <w:jc w:val="right"/>
             </w:pPr>
             <w:r/>
             <w:r>
               <w:rPr>
-                <w:rFonts w:ascii="Arial" w:hAnsi="Arial" w:cs="Arial"/>
+                <w:rFonts w:ascii="Tahoma" w:hAnsi="Tahoma" w:cs="Tahoma"/>
                 <w:b w:val="0"/>
                 <w:sz w:val="20"/>
               </w:rPr>
@@ -1393,20 +1755,30 @@
         </w:tc>
       </w:tr>
       <w:tr>
+        <w:trPr>
+          <w:trHeight w:val="386" w:hRule="atLeast"/>
+        </w:trPr>
         <w:tc>
           <w:tcPr>
-            <w:tcW w:type="dxa" w:w="3360"/>
+            <w:tcW w:type="dxa" w:w="3969"/>
+            <w:tcMar>
+              <w:top w:w="120" w:type="dxa"/>
+              <w:start w:w="140" w:type="dxa"/>
+              <w:bottom w:w="120" w:type="dxa"/>
+              <w:end w:w="140" w:type="dxa"/>
+            </w:tcMar>
             <w:vAlign w:val="center"/>
           </w:tcPr>
           <w:p>
             <w:pPr>
               <w:bidi w:val="1"/>
+              <w:spacing w:after="60" w:line="276" w:lineRule="auto"/>
               <w:jc w:val="right"/>
             </w:pPr>
             <w:r/>
             <w:r>
               <w:rPr>
-                <w:rFonts w:ascii="Arial" w:hAnsi="Arial" w:cs="Arial"/>
+                <w:rFonts w:ascii="Tahoma" w:hAnsi="Tahoma" w:cs="Tahoma"/>
                 <w:b w:val="0"/>
                 <w:sz w:val="20"/>
               </w:rPr>
@@ -1416,18 +1788,25 @@
         </w:tc>
         <w:tc>
           <w:tcPr>
-            <w:tcW w:type="dxa" w:w="3360"/>
+            <w:tcW w:type="dxa" w:w="2551"/>
+            <w:tcMar>
+              <w:top w:w="120" w:type="dxa"/>
+              <w:start w:w="140" w:type="dxa"/>
+              <w:bottom w:w="120" w:type="dxa"/>
+              <w:end w:w="140" w:type="dxa"/>
+            </w:tcMar>
             <w:vAlign w:val="center"/>
           </w:tcPr>
           <w:p>
             <w:pPr>
               <w:bidi w:val="1"/>
+              <w:spacing w:after="60" w:line="276" w:lineRule="auto"/>
               <w:jc w:val="right"/>
             </w:pPr>
             <w:r/>
             <w:r>
               <w:rPr>
-                <w:rFonts w:ascii="Arial" w:hAnsi="Arial" w:cs="Arial"/>
+                <w:rFonts w:ascii="Tahoma" w:hAnsi="Tahoma" w:cs="Tahoma"/>
                 <w:b w:val="0"/>
                 <w:sz w:val="20"/>
               </w:rPr>
@@ -1437,18 +1816,25 @@
         </w:tc>
         <w:tc>
           <w:tcPr>
-            <w:tcW w:type="dxa" w:w="3360"/>
+            <w:tcW w:type="dxa" w:w="2268"/>
+            <w:tcMar>
+              <w:top w:w="120" w:type="dxa"/>
+              <w:start w:w="140" w:type="dxa"/>
+              <w:bottom w:w="120" w:type="dxa"/>
+              <w:end w:w="140" w:type="dxa"/>
+            </w:tcMar>
             <w:vAlign w:val="center"/>
           </w:tcPr>
           <w:p>
             <w:pPr>
               <w:bidi w:val="1"/>
+              <w:spacing w:after="60" w:line="276" w:lineRule="auto"/>
               <w:jc w:val="right"/>
             </w:pPr>
             <w:r/>
             <w:r>
               <w:rPr>
-                <w:rFonts w:ascii="Arial" w:hAnsi="Arial" w:cs="Arial"/>
+                <w:rFonts w:ascii="Tahoma" w:hAnsi="Tahoma" w:cs="Tahoma"/>
                 <w:b w:val="0"/>
                 <w:sz w:val="20"/>
               </w:rPr>
@@ -1458,20 +1844,31 @@
         </w:tc>
       </w:tr>
       <w:tr>
+        <w:trPr>
+          <w:trHeight w:val="386" w:hRule="atLeast"/>
+        </w:trPr>
         <w:tc>
           <w:tcPr>
-            <w:tcW w:type="dxa" w:w="3360"/>
+            <w:tcW w:type="dxa" w:w="3969"/>
+            <w:tcMar>
+              <w:top w:w="120" w:type="dxa"/>
+              <w:start w:w="140" w:type="dxa"/>
+              <w:bottom w:w="120" w:type="dxa"/>
+              <w:end w:w="140" w:type="dxa"/>
+            </w:tcMar>
+            <w:shd w:fill="F8FBFD"/>
             <w:vAlign w:val="center"/>
           </w:tcPr>
           <w:p>
             <w:pPr>
               <w:bidi w:val="1"/>
+              <w:spacing w:after="60" w:line="276" w:lineRule="auto"/>
               <w:jc w:val="right"/>
             </w:pPr>
             <w:r/>
             <w:r>
               <w:rPr>
-                <w:rFonts w:ascii="Arial" w:hAnsi="Arial" w:cs="Arial"/>
+                <w:rFonts w:ascii="Tahoma" w:hAnsi="Tahoma" w:cs="Tahoma"/>
                 <w:b w:val="0"/>
                 <w:sz w:val="20"/>
               </w:rPr>
@@ -1481,18 +1878,26 @@
         </w:tc>
         <w:tc>
           <w:tcPr>
-            <w:tcW w:type="dxa" w:w="3360"/>
+            <w:tcW w:type="dxa" w:w="2551"/>
+            <w:tcMar>
+              <w:top w:w="120" w:type="dxa"/>
+              <w:start w:w="140" w:type="dxa"/>
+              <w:bottom w:w="120" w:type="dxa"/>
+              <w:end w:w="140" w:type="dxa"/>
+            </w:tcMar>
+            <w:shd w:fill="F8FBFD"/>
             <w:vAlign w:val="center"/>
           </w:tcPr>
           <w:p>
             <w:pPr>
               <w:bidi w:val="1"/>
+              <w:spacing w:after="60" w:line="276" w:lineRule="auto"/>
               <w:jc w:val="right"/>
             </w:pPr>
             <w:r/>
             <w:r>
               <w:rPr>
-                <w:rFonts w:ascii="Arial" w:hAnsi="Arial" w:cs="Arial"/>
+                <w:rFonts w:ascii="Tahoma" w:hAnsi="Tahoma" w:cs="Tahoma"/>
                 <w:b w:val="0"/>
                 <w:sz w:val="20"/>
               </w:rPr>
@@ -1502,18 +1907,26 @@
         </w:tc>
         <w:tc>
           <w:tcPr>
-            <w:tcW w:type="dxa" w:w="3360"/>
+            <w:tcW w:type="dxa" w:w="2268"/>
+            <w:tcMar>
+              <w:top w:w="120" w:type="dxa"/>
+              <w:start w:w="140" w:type="dxa"/>
+              <w:bottom w:w="120" w:type="dxa"/>
+              <w:end w:w="140" w:type="dxa"/>
+            </w:tcMar>
+            <w:shd w:fill="F8FBFD"/>
             <w:vAlign w:val="center"/>
           </w:tcPr>
           <w:p>
             <w:pPr>
               <w:bidi w:val="1"/>
+              <w:spacing w:after="60" w:line="276" w:lineRule="auto"/>
               <w:jc w:val="right"/>
             </w:pPr>
             <w:r/>
             <w:r>
               <w:rPr>
-                <w:rFonts w:ascii="Arial" w:hAnsi="Arial" w:cs="Arial"/>
+                <w:rFonts w:ascii="Tahoma" w:hAnsi="Tahoma" w:cs="Tahoma"/>
                 <w:b w:val="0"/>
                 <w:sz w:val="20"/>
               </w:rPr>
@@ -1523,20 +1936,30 @@
         </w:tc>
       </w:tr>
       <w:tr>
+        <w:trPr>
+          <w:trHeight w:val="386" w:hRule="atLeast"/>
+        </w:trPr>
         <w:tc>
           <w:tcPr>
-            <w:tcW w:type="dxa" w:w="3360"/>
+            <w:tcW w:type="dxa" w:w="3969"/>
+            <w:tcMar>
+              <w:top w:w="120" w:type="dxa"/>
+              <w:start w:w="140" w:type="dxa"/>
+              <w:bottom w:w="120" w:type="dxa"/>
+              <w:end w:w="140" w:type="dxa"/>
+            </w:tcMar>
             <w:vAlign w:val="center"/>
           </w:tcPr>
           <w:p>
             <w:pPr>
               <w:bidi w:val="1"/>
+              <w:spacing w:after="60" w:line="276" w:lineRule="auto"/>
               <w:jc w:val="right"/>
             </w:pPr>
             <w:r/>
             <w:r>
               <w:rPr>
-                <w:rFonts w:ascii="Arial" w:hAnsi="Arial" w:cs="Arial"/>
+                <w:rFonts w:ascii="Tahoma" w:hAnsi="Tahoma" w:cs="Tahoma"/>
                 <w:b w:val="0"/>
                 <w:sz w:val="20"/>
               </w:rPr>
@@ -1546,18 +1969,25 @@
         </w:tc>
         <w:tc>
           <w:tcPr>
-            <w:tcW w:type="dxa" w:w="3360"/>
+            <w:tcW w:type="dxa" w:w="2551"/>
+            <w:tcMar>
+              <w:top w:w="120" w:type="dxa"/>
+              <w:start w:w="140" w:type="dxa"/>
+              <w:bottom w:w="120" w:type="dxa"/>
+              <w:end w:w="140" w:type="dxa"/>
+            </w:tcMar>
             <w:vAlign w:val="center"/>
           </w:tcPr>
           <w:p>
             <w:pPr>
               <w:bidi w:val="1"/>
+              <w:spacing w:after="60" w:line="276" w:lineRule="auto"/>
               <w:jc w:val="right"/>
             </w:pPr>
             <w:r/>
             <w:r>
               <w:rPr>
-                <w:rFonts w:ascii="Arial" w:hAnsi="Arial" w:cs="Arial"/>
+                <w:rFonts w:ascii="Tahoma" w:hAnsi="Tahoma" w:cs="Tahoma"/>
                 <w:b w:val="0"/>
                 <w:sz w:val="20"/>
               </w:rPr>
@@ -1567,18 +1997,25 @@
         </w:tc>
         <w:tc>
           <w:tcPr>
-            <w:tcW w:type="dxa" w:w="3360"/>
+            <w:tcW w:type="dxa" w:w="2268"/>
+            <w:tcMar>
+              <w:top w:w="120" w:type="dxa"/>
+              <w:start w:w="140" w:type="dxa"/>
+              <w:bottom w:w="120" w:type="dxa"/>
+              <w:end w:w="140" w:type="dxa"/>
+            </w:tcMar>
             <w:vAlign w:val="center"/>
           </w:tcPr>
           <w:p>
             <w:pPr>
               <w:bidi w:val="1"/>
+              <w:spacing w:after="60" w:line="276" w:lineRule="auto"/>
               <w:jc w:val="right"/>
             </w:pPr>
             <w:r/>
             <w:r>
               <w:rPr>
-                <w:rFonts w:ascii="Arial" w:hAnsi="Arial" w:cs="Arial"/>
+                <w:rFonts w:ascii="Tahoma" w:hAnsi="Tahoma" w:cs="Tahoma"/>
                 <w:b w:val="0"/>
                 <w:sz w:val="20"/>
               </w:rPr>
@@ -1588,20 +2025,31 @@
         </w:tc>
       </w:tr>
       <w:tr>
+        <w:trPr>
+          <w:trHeight w:val="386" w:hRule="atLeast"/>
+        </w:trPr>
         <w:tc>
           <w:tcPr>
-            <w:tcW w:type="dxa" w:w="3360"/>
+            <w:tcW w:type="dxa" w:w="3969"/>
+            <w:tcMar>
+              <w:top w:w="120" w:type="dxa"/>
+              <w:start w:w="140" w:type="dxa"/>
+              <w:bottom w:w="120" w:type="dxa"/>
+              <w:end w:w="140" w:type="dxa"/>
+            </w:tcMar>
+            <w:shd w:fill="F8FBFD"/>
             <w:vAlign w:val="center"/>
           </w:tcPr>
           <w:p>
             <w:pPr>
               <w:bidi w:val="1"/>
+              <w:spacing w:after="60" w:line="276" w:lineRule="auto"/>
               <w:jc w:val="right"/>
             </w:pPr>
             <w:r/>
             <w:r>
               <w:rPr>
-                <w:rFonts w:ascii="Arial" w:hAnsi="Arial" w:cs="Arial"/>
+                <w:rFonts w:ascii="Tahoma" w:hAnsi="Tahoma" w:cs="Tahoma"/>
                 <w:b w:val="0"/>
                 <w:sz w:val="20"/>
               </w:rPr>
@@ -1611,18 +2059,26 @@
         </w:tc>
         <w:tc>
           <w:tcPr>
-            <w:tcW w:type="dxa" w:w="3360"/>
+            <w:tcW w:type="dxa" w:w="2551"/>
+            <w:tcMar>
+              <w:top w:w="120" w:type="dxa"/>
+              <w:start w:w="140" w:type="dxa"/>
+              <w:bottom w:w="120" w:type="dxa"/>
+              <w:end w:w="140" w:type="dxa"/>
+            </w:tcMar>
+            <w:shd w:fill="F8FBFD"/>
             <w:vAlign w:val="center"/>
           </w:tcPr>
           <w:p>
             <w:pPr>
               <w:bidi w:val="1"/>
+              <w:spacing w:after="60" w:line="276" w:lineRule="auto"/>
               <w:jc w:val="right"/>
             </w:pPr>
             <w:r/>
             <w:r>
               <w:rPr>
-                <w:rFonts w:ascii="Arial" w:hAnsi="Arial" w:cs="Arial"/>
+                <w:rFonts w:ascii="Tahoma" w:hAnsi="Tahoma" w:cs="Tahoma"/>
                 <w:b w:val="0"/>
                 <w:sz w:val="20"/>
               </w:rPr>
@@ -1632,18 +2088,26 @@
         </w:tc>
         <w:tc>
           <w:tcPr>
-            <w:tcW w:type="dxa" w:w="3360"/>
+            <w:tcW w:type="dxa" w:w="2268"/>
+            <w:tcMar>
+              <w:top w:w="120" w:type="dxa"/>
+              <w:start w:w="140" w:type="dxa"/>
+              <w:bottom w:w="120" w:type="dxa"/>
+              <w:end w:w="140" w:type="dxa"/>
+            </w:tcMar>
+            <w:shd w:fill="F8FBFD"/>
             <w:vAlign w:val="center"/>
           </w:tcPr>
           <w:p>
             <w:pPr>
               <w:bidi w:val="1"/>
+              <w:spacing w:after="60" w:line="276" w:lineRule="auto"/>
               <w:jc w:val="right"/>
             </w:pPr>
             <w:r/>
             <w:r>
               <w:rPr>
-                <w:rFonts w:ascii="Arial" w:hAnsi="Arial" w:cs="Arial"/>
+                <w:rFonts w:ascii="Tahoma" w:hAnsi="Tahoma" w:cs="Tahoma"/>
                 <w:b w:val="0"/>
                 <w:sz w:val="20"/>
               </w:rPr>
@@ -1653,20 +2117,30 @@
         </w:tc>
       </w:tr>
       <w:tr>
+        <w:trPr>
+          <w:trHeight w:val="386" w:hRule="atLeast"/>
+        </w:trPr>
         <w:tc>
           <w:tcPr>
-            <w:tcW w:type="dxa" w:w="3360"/>
+            <w:tcW w:type="dxa" w:w="3969"/>
+            <w:tcMar>
+              <w:top w:w="120" w:type="dxa"/>
+              <w:start w:w="140" w:type="dxa"/>
+              <w:bottom w:w="120" w:type="dxa"/>
+              <w:end w:w="140" w:type="dxa"/>
+            </w:tcMar>
             <w:vAlign w:val="center"/>
           </w:tcPr>
           <w:p>
             <w:pPr>
               <w:bidi w:val="1"/>
+              <w:spacing w:after="60" w:line="276" w:lineRule="auto"/>
               <w:jc w:val="right"/>
             </w:pPr>
             <w:r/>
             <w:r>
               <w:rPr>
-                <w:rFonts w:ascii="Arial" w:hAnsi="Arial" w:cs="Arial"/>
+                <w:rFonts w:ascii="Tahoma" w:hAnsi="Tahoma" w:cs="Tahoma"/>
                 <w:b w:val="0"/>
                 <w:sz w:val="20"/>
               </w:rPr>
@@ -1676,18 +2150,25 @@
         </w:tc>
         <w:tc>
           <w:tcPr>
-            <w:tcW w:type="dxa" w:w="3360"/>
+            <w:tcW w:type="dxa" w:w="2551"/>
+            <w:tcMar>
+              <w:top w:w="120" w:type="dxa"/>
+              <w:start w:w="140" w:type="dxa"/>
+              <w:bottom w:w="120" w:type="dxa"/>
+              <w:end w:w="140" w:type="dxa"/>
+            </w:tcMar>
             <w:vAlign w:val="center"/>
           </w:tcPr>
           <w:p>
             <w:pPr>
               <w:bidi w:val="1"/>
+              <w:spacing w:after="60" w:line="276" w:lineRule="auto"/>
               <w:jc w:val="right"/>
             </w:pPr>
             <w:r/>
             <w:r>
               <w:rPr>
-                <w:rFonts w:ascii="Arial" w:hAnsi="Arial" w:cs="Arial"/>
+                <w:rFonts w:ascii="Tahoma" w:hAnsi="Tahoma" w:cs="Tahoma"/>
                 <w:b w:val="0"/>
                 <w:sz w:val="20"/>
               </w:rPr>
@@ -1697,18 +2178,25 @@
         </w:tc>
         <w:tc>
           <w:tcPr>
-            <w:tcW w:type="dxa" w:w="3360"/>
+            <w:tcW w:type="dxa" w:w="2268"/>
+            <w:tcMar>
+              <w:top w:w="120" w:type="dxa"/>
+              <w:start w:w="140" w:type="dxa"/>
+              <w:bottom w:w="120" w:type="dxa"/>
+              <w:end w:w="140" w:type="dxa"/>
+            </w:tcMar>
             <w:vAlign w:val="center"/>
           </w:tcPr>
           <w:p>
             <w:pPr>
               <w:bidi w:val="1"/>
+              <w:spacing w:after="60" w:line="276" w:lineRule="auto"/>
               <w:jc w:val="right"/>
             </w:pPr>
             <w:r/>
             <w:r>
               <w:rPr>
-                <w:rFonts w:ascii="Arial" w:hAnsi="Arial" w:cs="Arial"/>
+                <w:rFonts w:ascii="Tahoma" w:hAnsi="Tahoma" w:cs="Tahoma"/>
                 <w:b w:val="0"/>
                 <w:sz w:val="20"/>
               </w:rPr>
@@ -1721,32 +2209,32 @@
     <w:p>
       <w:pPr>
         <w:bidi w:val="1"/>
-        <w:spacing w:before="200" w:after="120"/>
+        <w:spacing w:before="280" w:after="160" w:line="288" w:lineRule="auto"/>
         <w:jc w:val="right"/>
       </w:pPr>
       <w:r>
         <w:rPr>
-          <w:rFonts w:ascii="Arial" w:hAnsi="Arial" w:cs="Arial"/>
+          <w:rFonts w:ascii="Tahoma" w:hAnsi="Tahoma" w:cs="Tahoma"/>
           <w:b/>
           <w:color w:val="1F4E79"/>
-          <w:sz w:val="36"/>
+          <w:sz w:val="40"/>
         </w:rPr>
-        <w:t>7. فحص Train/Test Drift</w:t>
+        <w:t>7. فحص اختلاف Train و Test</w:t>
       </w:r>
     </w:p>
     <w:p>
       <w:pPr>
         <w:bidi w:val="1"/>
-        <w:spacing w:after="120"/>
+        <w:spacing w:before="0" w:after="160" w:line="324" w:lineRule="auto"/>
         <w:jc w:val="right"/>
       </w:pPr>
       <w:r>
         <w:rPr>
-          <w:rFonts w:ascii="Arial" w:hAnsi="Arial" w:cs="Arial"/>
+          <w:rFonts w:ascii="Tahoma" w:hAnsi="Tahoma" w:cs="Tahoma"/>
           <w:b w:val="0"/>
           <w:sz w:val="24"/>
         </w:rPr>
-        <w:t>أضفنا adversarial validation لنعرف هل train وtest متشابهان أم يوجد فرق في التوزيع. كانت قيمة AUC تقريباً 0.7727. هذه القيمة تعني أن هناك فرقاً ملحوظاً، لذلك تعاملنا بحذر مع أي تحسين داخلي لا يظهر بشكل مستقر.</w:t>
+        <w:t>أضفنا adversarial validation لمعرفة هل train وtest متشابهان أم توجد فروقات في التوزيع. قيمة AUC كانت تقريباً 0.7727. هذا يعني أن هناك فرقاً ملحوظاً، لذلك تعاملنا بحذر مع أي تحسين داخلي لا يظهر بشكل مستقر.</w:t>
       </w:r>
     </w:p>
     <w:tbl>
@@ -1755,18 +2243,28 @@
         <w:tblW w:type="auto" w:w="0"/>
         <w:jc w:val="center"/>
         <w:tblLook w:firstColumn="1" w:firstRow="1" w:lastColumn="0" w:lastRow="0" w:noHBand="0" w:noVBand="1" w:val="04A0"/>
+        <w:bidiVisual w:val="1"/>
       </w:tblPr>
       <w:tblGrid>
-        <w:gridCol w:w="2520"/>
-        <w:gridCol w:w="2520"/>
-        <w:gridCol w:w="2520"/>
-        <w:gridCol w:w="2520"/>
+        <w:gridCol w:w="2268"/>
+        <w:gridCol w:w="2154"/>
+        <w:gridCol w:w="2154"/>
+        <w:gridCol w:w="2154"/>
       </w:tblGrid>
       <w:tr>
+        <w:trPr>
+          <w:trHeight w:val="425" w:hRule="atLeast"/>
+        </w:trPr>
         <w:tc>
           <w:tcPr>
-            <w:tcW w:type="dxa" w:w="2520"/>
+            <w:tcW w:type="dxa" w:w="2578"/>
             <w:shd w:fill="1F4E79"/>
+            <w:tcMar>
+              <w:top w:w="120" w:type="dxa"/>
+              <w:start w:w="140" w:type="dxa"/>
+              <w:bottom w:w="120" w:type="dxa"/>
+              <w:end w:w="140" w:type="dxa"/>
+            </w:tcMar>
             <w:vAlign w:val="center"/>
           </w:tcPr>
           <w:p>
@@ -1777,7 +2275,7 @@
             <w:r/>
             <w:r>
               <w:rPr>
-                <w:rFonts w:ascii="Arial" w:hAnsi="Arial" w:cs="Arial"/>
+                <w:rFonts w:ascii="Tahoma" w:hAnsi="Tahoma" w:cs="Tahoma"/>
                 <w:b/>
                 <w:color w:val="FFFFFF"/>
                 <w:sz w:val="21"/>
@@ -1788,8 +2286,14 @@
         </w:tc>
         <w:tc>
           <w:tcPr>
-            <w:tcW w:type="dxa" w:w="2520"/>
+            <w:tcW w:type="dxa" w:w="2578"/>
             <w:shd w:fill="1F4E79"/>
+            <w:tcMar>
+              <w:top w:w="120" w:type="dxa"/>
+              <w:start w:w="140" w:type="dxa"/>
+              <w:bottom w:w="120" w:type="dxa"/>
+              <w:end w:w="140" w:type="dxa"/>
+            </w:tcMar>
             <w:vAlign w:val="center"/>
           </w:tcPr>
           <w:p>
@@ -1800,7 +2304,7 @@
             <w:r/>
             <w:r>
               <w:rPr>
-                <w:rFonts w:ascii="Arial" w:hAnsi="Arial" w:cs="Arial"/>
+                <w:rFonts w:ascii="Tahoma" w:hAnsi="Tahoma" w:cs="Tahoma"/>
                 <w:b/>
                 <w:color w:val="FFFFFF"/>
                 <w:sz w:val="21"/>
@@ -1811,8 +2315,14 @@
         </w:tc>
         <w:tc>
           <w:tcPr>
-            <w:tcW w:type="dxa" w:w="2520"/>
+            <w:tcW w:type="dxa" w:w="2578"/>
             <w:shd w:fill="1F4E79"/>
+            <w:tcMar>
+              <w:top w:w="120" w:type="dxa"/>
+              <w:start w:w="140" w:type="dxa"/>
+              <w:bottom w:w="120" w:type="dxa"/>
+              <w:end w:w="140" w:type="dxa"/>
+            </w:tcMar>
             <w:vAlign w:val="center"/>
           </w:tcPr>
           <w:p>
@@ -1823,7 +2333,7 @@
             <w:r/>
             <w:r>
               <w:rPr>
-                <w:rFonts w:ascii="Arial" w:hAnsi="Arial" w:cs="Arial"/>
+                <w:rFonts w:ascii="Tahoma" w:hAnsi="Tahoma" w:cs="Tahoma"/>
                 <w:b/>
                 <w:color w:val="FFFFFF"/>
                 <w:sz w:val="21"/>
@@ -1834,8 +2344,14 @@
         </w:tc>
         <w:tc>
           <w:tcPr>
-            <w:tcW w:type="dxa" w:w="2520"/>
+            <w:tcW w:type="dxa" w:w="2578"/>
             <w:shd w:fill="1F4E79"/>
+            <w:tcMar>
+              <w:top w:w="120" w:type="dxa"/>
+              <w:start w:w="140" w:type="dxa"/>
+              <w:bottom w:w="120" w:type="dxa"/>
+              <w:end w:w="140" w:type="dxa"/>
+            </w:tcMar>
             <w:vAlign w:val="center"/>
           </w:tcPr>
           <w:p>
@@ -1846,7 +2362,7 @@
             <w:r/>
             <w:r>
               <w:rPr>
-                <w:rFonts w:ascii="Arial" w:hAnsi="Arial" w:cs="Arial"/>
+                <w:rFonts w:ascii="Tahoma" w:hAnsi="Tahoma" w:cs="Tahoma"/>
                 <w:b/>
                 <w:color w:val="FFFFFF"/>
                 <w:sz w:val="21"/>
@@ -1857,20 +2373,31 @@
         </w:tc>
       </w:tr>
       <w:tr>
+        <w:trPr>
+          <w:trHeight w:val="386" w:hRule="atLeast"/>
+        </w:trPr>
         <w:tc>
           <w:tcPr>
-            <w:tcW w:type="dxa" w:w="2520"/>
+            <w:tcW w:type="dxa" w:w="2268"/>
+            <w:tcMar>
+              <w:top w:w="120" w:type="dxa"/>
+              <w:start w:w="140" w:type="dxa"/>
+              <w:bottom w:w="120" w:type="dxa"/>
+              <w:end w:w="140" w:type="dxa"/>
+            </w:tcMar>
+            <w:shd w:fill="F8FBFD"/>
             <w:vAlign w:val="center"/>
           </w:tcPr>
           <w:p>
             <w:pPr>
               <w:bidi w:val="1"/>
+              <w:spacing w:after="60" w:line="276" w:lineRule="auto"/>
               <w:jc w:val="right"/>
             </w:pPr>
             <w:r/>
             <w:r>
               <w:rPr>
-                <w:rFonts w:ascii="Arial" w:hAnsi="Arial" w:cs="Arial"/>
+                <w:rFonts w:ascii="Tahoma" w:hAnsi="Tahoma" w:cs="Tahoma"/>
                 <w:b w:val="0"/>
                 <w:sz w:val="20"/>
               </w:rPr>
@@ -1880,18 +2407,26 @@
         </w:tc>
         <w:tc>
           <w:tcPr>
-            <w:tcW w:type="dxa" w:w="2520"/>
+            <w:tcW w:type="dxa" w:w="2154"/>
+            <w:tcMar>
+              <w:top w:w="120" w:type="dxa"/>
+              <w:start w:w="140" w:type="dxa"/>
+              <w:bottom w:w="120" w:type="dxa"/>
+              <w:end w:w="140" w:type="dxa"/>
+            </w:tcMar>
+            <w:shd w:fill="F8FBFD"/>
             <w:vAlign w:val="center"/>
           </w:tcPr>
           <w:p>
             <w:pPr>
               <w:bidi w:val="1"/>
+              <w:spacing w:after="60" w:line="276" w:lineRule="auto"/>
               <w:jc w:val="right"/>
             </w:pPr>
             <w:r/>
             <w:r>
               <w:rPr>
-                <w:rFonts w:ascii="Arial" w:hAnsi="Arial" w:cs="Arial"/>
+                <w:rFonts w:ascii="Tahoma" w:hAnsi="Tahoma" w:cs="Tahoma"/>
                 <w:b w:val="0"/>
                 <w:sz w:val="20"/>
               </w:rPr>
@@ -1901,18 +2436,26 @@
         </w:tc>
         <w:tc>
           <w:tcPr>
-            <w:tcW w:type="dxa" w:w="2520"/>
+            <w:tcW w:type="dxa" w:w="2154"/>
+            <w:tcMar>
+              <w:top w:w="120" w:type="dxa"/>
+              <w:start w:w="140" w:type="dxa"/>
+              <w:bottom w:w="120" w:type="dxa"/>
+              <w:end w:w="140" w:type="dxa"/>
+            </w:tcMar>
+            <w:shd w:fill="F8FBFD"/>
             <w:vAlign w:val="center"/>
           </w:tcPr>
           <w:p>
             <w:pPr>
               <w:bidi w:val="1"/>
+              <w:spacing w:after="60" w:line="276" w:lineRule="auto"/>
               <w:jc w:val="right"/>
             </w:pPr>
             <w:r/>
             <w:r>
               <w:rPr>
-                <w:rFonts w:ascii="Arial" w:hAnsi="Arial" w:cs="Arial"/>
+                <w:rFonts w:ascii="Tahoma" w:hAnsi="Tahoma" w:cs="Tahoma"/>
                 <w:b w:val="0"/>
                 <w:sz w:val="20"/>
               </w:rPr>
@@ -1922,18 +2465,26 @@
         </w:tc>
         <w:tc>
           <w:tcPr>
-            <w:tcW w:type="dxa" w:w="2520"/>
+            <w:tcW w:type="dxa" w:w="2154"/>
+            <w:tcMar>
+              <w:top w:w="120" w:type="dxa"/>
+              <w:start w:w="140" w:type="dxa"/>
+              <w:bottom w:w="120" w:type="dxa"/>
+              <w:end w:w="140" w:type="dxa"/>
+            </w:tcMar>
+            <w:shd w:fill="F8FBFD"/>
             <w:vAlign w:val="center"/>
           </w:tcPr>
           <w:p>
             <w:pPr>
               <w:bidi w:val="1"/>
+              <w:spacing w:after="60" w:line="276" w:lineRule="auto"/>
               <w:jc w:val="right"/>
             </w:pPr>
             <w:r/>
             <w:r>
               <w:rPr>
-                <w:rFonts w:ascii="Arial" w:hAnsi="Arial" w:cs="Arial"/>
+                <w:rFonts w:ascii="Tahoma" w:hAnsi="Tahoma" w:cs="Tahoma"/>
                 <w:b w:val="0"/>
                 <w:sz w:val="20"/>
               </w:rPr>
@@ -1943,20 +2494,30 @@
         </w:tc>
       </w:tr>
       <w:tr>
+        <w:trPr>
+          <w:trHeight w:val="386" w:hRule="atLeast"/>
+        </w:trPr>
         <w:tc>
           <w:tcPr>
-            <w:tcW w:type="dxa" w:w="2520"/>
+            <w:tcW w:type="dxa" w:w="2268"/>
+            <w:tcMar>
+              <w:top w:w="120" w:type="dxa"/>
+              <w:start w:w="140" w:type="dxa"/>
+              <w:bottom w:w="120" w:type="dxa"/>
+              <w:end w:w="140" w:type="dxa"/>
+            </w:tcMar>
             <w:vAlign w:val="center"/>
           </w:tcPr>
           <w:p>
             <w:pPr>
               <w:bidi w:val="1"/>
+              <w:spacing w:after="60" w:line="276" w:lineRule="auto"/>
               <w:jc w:val="right"/>
             </w:pPr>
             <w:r/>
             <w:r>
               <w:rPr>
-                <w:rFonts w:ascii="Arial" w:hAnsi="Arial" w:cs="Arial"/>
+                <w:rFonts w:ascii="Tahoma" w:hAnsi="Tahoma" w:cs="Tahoma"/>
                 <w:b w:val="0"/>
                 <w:sz w:val="20"/>
               </w:rPr>
@@ -1966,18 +2527,25 @@
         </w:tc>
         <w:tc>
           <w:tcPr>
-            <w:tcW w:type="dxa" w:w="2520"/>
+            <w:tcW w:type="dxa" w:w="2154"/>
+            <w:tcMar>
+              <w:top w:w="120" w:type="dxa"/>
+              <w:start w:w="140" w:type="dxa"/>
+              <w:bottom w:w="120" w:type="dxa"/>
+              <w:end w:w="140" w:type="dxa"/>
+            </w:tcMar>
             <w:vAlign w:val="center"/>
           </w:tcPr>
           <w:p>
             <w:pPr>
               <w:bidi w:val="1"/>
+              <w:spacing w:after="60" w:line="276" w:lineRule="auto"/>
               <w:jc w:val="right"/>
             </w:pPr>
             <w:r/>
             <w:r>
               <w:rPr>
-                <w:rFonts w:ascii="Arial" w:hAnsi="Arial" w:cs="Arial"/>
+                <w:rFonts w:ascii="Tahoma" w:hAnsi="Tahoma" w:cs="Tahoma"/>
                 <w:b w:val="0"/>
                 <w:sz w:val="20"/>
               </w:rPr>
@@ -1987,18 +2555,25 @@
         </w:tc>
         <w:tc>
           <w:tcPr>
-            <w:tcW w:type="dxa" w:w="2520"/>
+            <w:tcW w:type="dxa" w:w="2154"/>
+            <w:tcMar>
+              <w:top w:w="120" w:type="dxa"/>
+              <w:start w:w="140" w:type="dxa"/>
+              <w:bottom w:w="120" w:type="dxa"/>
+              <w:end w:w="140" w:type="dxa"/>
+            </w:tcMar>
             <w:vAlign w:val="center"/>
           </w:tcPr>
           <w:p>
             <w:pPr>
               <w:bidi w:val="1"/>
+              <w:spacing w:after="60" w:line="276" w:lineRule="auto"/>
               <w:jc w:val="right"/>
             </w:pPr>
             <w:r/>
             <w:r>
               <w:rPr>
-                <w:rFonts w:ascii="Arial" w:hAnsi="Arial" w:cs="Arial"/>
+                <w:rFonts w:ascii="Tahoma" w:hAnsi="Tahoma" w:cs="Tahoma"/>
                 <w:b w:val="0"/>
                 <w:sz w:val="20"/>
               </w:rPr>
@@ -2008,18 +2583,25 @@
         </w:tc>
         <w:tc>
           <w:tcPr>
-            <w:tcW w:type="dxa" w:w="2520"/>
+            <w:tcW w:type="dxa" w:w="2154"/>
+            <w:tcMar>
+              <w:top w:w="120" w:type="dxa"/>
+              <w:start w:w="140" w:type="dxa"/>
+              <w:bottom w:w="120" w:type="dxa"/>
+              <w:end w:w="140" w:type="dxa"/>
+            </w:tcMar>
             <w:vAlign w:val="center"/>
           </w:tcPr>
           <w:p>
             <w:pPr>
               <w:bidi w:val="1"/>
+              <w:spacing w:after="60" w:line="276" w:lineRule="auto"/>
               <w:jc w:val="right"/>
             </w:pPr>
             <w:r/>
             <w:r>
               <w:rPr>
-                <w:rFonts w:ascii="Arial" w:hAnsi="Arial" w:cs="Arial"/>
+                <w:rFonts w:ascii="Tahoma" w:hAnsi="Tahoma" w:cs="Tahoma"/>
                 <w:b w:val="0"/>
                 <w:sz w:val="20"/>
               </w:rPr>
@@ -2029,20 +2611,31 @@
         </w:tc>
       </w:tr>
       <w:tr>
+        <w:trPr>
+          <w:trHeight w:val="386" w:hRule="atLeast"/>
+        </w:trPr>
         <w:tc>
           <w:tcPr>
-            <w:tcW w:type="dxa" w:w="2520"/>
+            <w:tcW w:type="dxa" w:w="2268"/>
+            <w:tcMar>
+              <w:top w:w="120" w:type="dxa"/>
+              <w:start w:w="140" w:type="dxa"/>
+              <w:bottom w:w="120" w:type="dxa"/>
+              <w:end w:w="140" w:type="dxa"/>
+            </w:tcMar>
+            <w:shd w:fill="F8FBFD"/>
             <w:vAlign w:val="center"/>
           </w:tcPr>
           <w:p>
             <w:pPr>
               <w:bidi w:val="1"/>
+              <w:spacing w:after="60" w:line="276" w:lineRule="auto"/>
               <w:jc w:val="right"/>
             </w:pPr>
             <w:r/>
             <w:r>
               <w:rPr>
-                <w:rFonts w:ascii="Arial" w:hAnsi="Arial" w:cs="Arial"/>
+                <w:rFonts w:ascii="Tahoma" w:hAnsi="Tahoma" w:cs="Tahoma"/>
                 <w:b w:val="0"/>
                 <w:sz w:val="20"/>
               </w:rPr>
@@ -2052,18 +2645,26 @@
         </w:tc>
         <w:tc>
           <w:tcPr>
-            <w:tcW w:type="dxa" w:w="2520"/>
+            <w:tcW w:type="dxa" w:w="2154"/>
+            <w:tcMar>
+              <w:top w:w="120" w:type="dxa"/>
+              <w:start w:w="140" w:type="dxa"/>
+              <w:bottom w:w="120" w:type="dxa"/>
+              <w:end w:w="140" w:type="dxa"/>
+            </w:tcMar>
+            <w:shd w:fill="F8FBFD"/>
             <w:vAlign w:val="center"/>
           </w:tcPr>
           <w:p>
             <w:pPr>
               <w:bidi w:val="1"/>
+              <w:spacing w:after="60" w:line="276" w:lineRule="auto"/>
               <w:jc w:val="right"/>
             </w:pPr>
             <w:r/>
             <w:r>
               <w:rPr>
-                <w:rFonts w:ascii="Arial" w:hAnsi="Arial" w:cs="Arial"/>
+                <w:rFonts w:ascii="Tahoma" w:hAnsi="Tahoma" w:cs="Tahoma"/>
                 <w:b w:val="0"/>
                 <w:sz w:val="20"/>
               </w:rPr>
@@ -2073,18 +2674,26 @@
         </w:tc>
         <w:tc>
           <w:tcPr>
-            <w:tcW w:type="dxa" w:w="2520"/>
+            <w:tcW w:type="dxa" w:w="2154"/>
+            <w:tcMar>
+              <w:top w:w="120" w:type="dxa"/>
+              <w:start w:w="140" w:type="dxa"/>
+              <w:bottom w:w="120" w:type="dxa"/>
+              <w:end w:w="140" w:type="dxa"/>
+            </w:tcMar>
+            <w:shd w:fill="F8FBFD"/>
             <w:vAlign w:val="center"/>
           </w:tcPr>
           <w:p>
             <w:pPr>
               <w:bidi w:val="1"/>
+              <w:spacing w:after="60" w:line="276" w:lineRule="auto"/>
               <w:jc w:val="right"/>
             </w:pPr>
             <w:r/>
             <w:r>
               <w:rPr>
-                <w:rFonts w:ascii="Arial" w:hAnsi="Arial" w:cs="Arial"/>
+                <w:rFonts w:ascii="Tahoma" w:hAnsi="Tahoma" w:cs="Tahoma"/>
                 <w:b w:val="0"/>
                 <w:sz w:val="20"/>
               </w:rPr>
@@ -2094,18 +2703,26 @@
         </w:tc>
         <w:tc>
           <w:tcPr>
-            <w:tcW w:type="dxa" w:w="2520"/>
+            <w:tcW w:type="dxa" w:w="2154"/>
+            <w:tcMar>
+              <w:top w:w="120" w:type="dxa"/>
+              <w:start w:w="140" w:type="dxa"/>
+              <w:bottom w:w="120" w:type="dxa"/>
+              <w:end w:w="140" w:type="dxa"/>
+            </w:tcMar>
+            <w:shd w:fill="F8FBFD"/>
             <w:vAlign w:val="center"/>
           </w:tcPr>
           <w:p>
             <w:pPr>
               <w:bidi w:val="1"/>
+              <w:spacing w:after="60" w:line="276" w:lineRule="auto"/>
               <w:jc w:val="right"/>
             </w:pPr>
             <w:r/>
             <w:r>
               <w:rPr>
-                <w:rFonts w:ascii="Arial" w:hAnsi="Arial" w:cs="Arial"/>
+                <w:rFonts w:ascii="Tahoma" w:hAnsi="Tahoma" w:cs="Tahoma"/>
                 <w:b w:val="0"/>
                 <w:sz w:val="20"/>
               </w:rPr>
@@ -2115,20 +2732,30 @@
         </w:tc>
       </w:tr>
       <w:tr>
+        <w:trPr>
+          <w:trHeight w:val="386" w:hRule="atLeast"/>
+        </w:trPr>
         <w:tc>
           <w:tcPr>
-            <w:tcW w:type="dxa" w:w="2520"/>
+            <w:tcW w:type="dxa" w:w="2268"/>
+            <w:tcMar>
+              <w:top w:w="120" w:type="dxa"/>
+              <w:start w:w="140" w:type="dxa"/>
+              <w:bottom w:w="120" w:type="dxa"/>
+              <w:end w:w="140" w:type="dxa"/>
+            </w:tcMar>
             <w:vAlign w:val="center"/>
           </w:tcPr>
           <w:p>
             <w:pPr>
               <w:bidi w:val="1"/>
+              <w:spacing w:after="60" w:line="276" w:lineRule="auto"/>
               <w:jc w:val="right"/>
             </w:pPr>
             <w:r/>
             <w:r>
               <w:rPr>
-                <w:rFonts w:ascii="Arial" w:hAnsi="Arial" w:cs="Arial"/>
+                <w:rFonts w:ascii="Tahoma" w:hAnsi="Tahoma" w:cs="Tahoma"/>
                 <w:b w:val="0"/>
                 <w:sz w:val="20"/>
               </w:rPr>
@@ -2138,18 +2765,25 @@
         </w:tc>
         <w:tc>
           <w:tcPr>
-            <w:tcW w:type="dxa" w:w="2520"/>
+            <w:tcW w:type="dxa" w:w="2154"/>
+            <w:tcMar>
+              <w:top w:w="120" w:type="dxa"/>
+              <w:start w:w="140" w:type="dxa"/>
+              <w:bottom w:w="120" w:type="dxa"/>
+              <w:end w:w="140" w:type="dxa"/>
+            </w:tcMar>
             <w:vAlign w:val="center"/>
           </w:tcPr>
           <w:p>
             <w:pPr>
               <w:bidi w:val="1"/>
+              <w:spacing w:after="60" w:line="276" w:lineRule="auto"/>
               <w:jc w:val="right"/>
             </w:pPr>
             <w:r/>
             <w:r>
               <w:rPr>
-                <w:rFonts w:ascii="Arial" w:hAnsi="Arial" w:cs="Arial"/>
+                <w:rFonts w:ascii="Tahoma" w:hAnsi="Tahoma" w:cs="Tahoma"/>
                 <w:b w:val="0"/>
                 <w:sz w:val="20"/>
               </w:rPr>
@@ -2159,18 +2793,25 @@
         </w:tc>
         <w:tc>
           <w:tcPr>
-            <w:tcW w:type="dxa" w:w="2520"/>
+            <w:tcW w:type="dxa" w:w="2154"/>
+            <w:tcMar>
+              <w:top w:w="120" w:type="dxa"/>
+              <w:start w:w="140" w:type="dxa"/>
+              <w:bottom w:w="120" w:type="dxa"/>
+              <w:end w:w="140" w:type="dxa"/>
+            </w:tcMar>
             <w:vAlign w:val="center"/>
           </w:tcPr>
           <w:p>
             <w:pPr>
               <w:bidi w:val="1"/>
+              <w:spacing w:after="60" w:line="276" w:lineRule="auto"/>
               <w:jc w:val="right"/>
             </w:pPr>
             <w:r/>
             <w:r>
               <w:rPr>
-                <w:rFonts w:ascii="Arial" w:hAnsi="Arial" w:cs="Arial"/>
+                <w:rFonts w:ascii="Tahoma" w:hAnsi="Tahoma" w:cs="Tahoma"/>
                 <w:b w:val="0"/>
                 <w:sz w:val="20"/>
               </w:rPr>
@@ -2180,18 +2821,25 @@
         </w:tc>
         <w:tc>
           <w:tcPr>
-            <w:tcW w:type="dxa" w:w="2520"/>
+            <w:tcW w:type="dxa" w:w="2154"/>
+            <w:tcMar>
+              <w:top w:w="120" w:type="dxa"/>
+              <w:start w:w="140" w:type="dxa"/>
+              <w:bottom w:w="120" w:type="dxa"/>
+              <w:end w:w="140" w:type="dxa"/>
+            </w:tcMar>
             <w:vAlign w:val="center"/>
           </w:tcPr>
           <w:p>
             <w:pPr>
               <w:bidi w:val="1"/>
+              <w:spacing w:after="60" w:line="276" w:lineRule="auto"/>
               <w:jc w:val="right"/>
             </w:pPr>
             <w:r/>
             <w:r>
               <w:rPr>
-                <w:rFonts w:ascii="Arial" w:hAnsi="Arial" w:cs="Arial"/>
+                <w:rFonts w:ascii="Tahoma" w:hAnsi="Tahoma" w:cs="Tahoma"/>
                 <w:b w:val="0"/>
                 <w:sz w:val="20"/>
               </w:rPr>
@@ -2201,20 +2849,31 @@
         </w:tc>
       </w:tr>
       <w:tr>
+        <w:trPr>
+          <w:trHeight w:val="386" w:hRule="atLeast"/>
+        </w:trPr>
         <w:tc>
           <w:tcPr>
-            <w:tcW w:type="dxa" w:w="2520"/>
+            <w:tcW w:type="dxa" w:w="2268"/>
+            <w:tcMar>
+              <w:top w:w="120" w:type="dxa"/>
+              <w:start w:w="140" w:type="dxa"/>
+              <w:bottom w:w="120" w:type="dxa"/>
+              <w:end w:w="140" w:type="dxa"/>
+            </w:tcMar>
+            <w:shd w:fill="F8FBFD"/>
             <w:vAlign w:val="center"/>
           </w:tcPr>
           <w:p>
             <w:pPr>
               <w:bidi w:val="1"/>
+              <w:spacing w:after="60" w:line="276" w:lineRule="auto"/>
               <w:jc w:val="right"/>
             </w:pPr>
             <w:r/>
             <w:r>
               <w:rPr>
-                <w:rFonts w:ascii="Arial" w:hAnsi="Arial" w:cs="Arial"/>
+                <w:rFonts w:ascii="Tahoma" w:hAnsi="Tahoma" w:cs="Tahoma"/>
                 <w:b w:val="0"/>
                 <w:sz w:val="20"/>
               </w:rPr>
@@ -2224,18 +2883,26 @@
         </w:tc>
         <w:tc>
           <w:tcPr>
-            <w:tcW w:type="dxa" w:w="2520"/>
+            <w:tcW w:type="dxa" w:w="2154"/>
+            <w:tcMar>
+              <w:top w:w="120" w:type="dxa"/>
+              <w:start w:w="140" w:type="dxa"/>
+              <w:bottom w:w="120" w:type="dxa"/>
+              <w:end w:w="140" w:type="dxa"/>
+            </w:tcMar>
+            <w:shd w:fill="F8FBFD"/>
             <w:vAlign w:val="center"/>
           </w:tcPr>
           <w:p>
             <w:pPr>
               <w:bidi w:val="1"/>
+              <w:spacing w:after="60" w:line="276" w:lineRule="auto"/>
               <w:jc w:val="right"/>
             </w:pPr>
             <w:r/>
             <w:r>
               <w:rPr>
-                <w:rFonts w:ascii="Arial" w:hAnsi="Arial" w:cs="Arial"/>
+                <w:rFonts w:ascii="Tahoma" w:hAnsi="Tahoma" w:cs="Tahoma"/>
                 <w:b w:val="0"/>
                 <w:sz w:val="20"/>
               </w:rPr>
@@ -2245,18 +2912,26 @@
         </w:tc>
         <w:tc>
           <w:tcPr>
-            <w:tcW w:type="dxa" w:w="2520"/>
+            <w:tcW w:type="dxa" w:w="2154"/>
+            <w:tcMar>
+              <w:top w:w="120" w:type="dxa"/>
+              <w:start w:w="140" w:type="dxa"/>
+              <w:bottom w:w="120" w:type="dxa"/>
+              <w:end w:w="140" w:type="dxa"/>
+            </w:tcMar>
+            <w:shd w:fill="F8FBFD"/>
             <w:vAlign w:val="center"/>
           </w:tcPr>
           <w:p>
             <w:pPr>
               <w:bidi w:val="1"/>
+              <w:spacing w:after="60" w:line="276" w:lineRule="auto"/>
               <w:jc w:val="right"/>
             </w:pPr>
             <w:r/>
             <w:r>
               <w:rPr>
-                <w:rFonts w:ascii="Arial" w:hAnsi="Arial" w:cs="Arial"/>
+                <w:rFonts w:ascii="Tahoma" w:hAnsi="Tahoma" w:cs="Tahoma"/>
                 <w:b w:val="0"/>
                 <w:sz w:val="20"/>
               </w:rPr>
@@ -2266,18 +2941,26 @@
         </w:tc>
         <w:tc>
           <w:tcPr>
-            <w:tcW w:type="dxa" w:w="2520"/>
+            <w:tcW w:type="dxa" w:w="2154"/>
+            <w:tcMar>
+              <w:top w:w="120" w:type="dxa"/>
+              <w:start w:w="140" w:type="dxa"/>
+              <w:bottom w:w="120" w:type="dxa"/>
+              <w:end w:w="140" w:type="dxa"/>
+            </w:tcMar>
+            <w:shd w:fill="F8FBFD"/>
             <w:vAlign w:val="center"/>
           </w:tcPr>
           <w:p>
             <w:pPr>
               <w:bidi w:val="1"/>
+              <w:spacing w:after="60" w:line="276" w:lineRule="auto"/>
               <w:jc w:val="right"/>
             </w:pPr>
             <w:r/>
             <w:r>
               <w:rPr>
-                <w:rFonts w:ascii="Arial" w:hAnsi="Arial" w:cs="Arial"/>
+                <w:rFonts w:ascii="Tahoma" w:hAnsi="Tahoma" w:cs="Tahoma"/>
                 <w:b w:val="0"/>
                 <w:sz w:val="20"/>
               </w:rPr>
@@ -2287,20 +2970,30 @@
         </w:tc>
       </w:tr>
       <w:tr>
+        <w:trPr>
+          <w:trHeight w:val="386" w:hRule="atLeast"/>
+        </w:trPr>
         <w:tc>
           <w:tcPr>
-            <w:tcW w:type="dxa" w:w="2520"/>
+            <w:tcW w:type="dxa" w:w="2268"/>
+            <w:tcMar>
+              <w:top w:w="120" w:type="dxa"/>
+              <w:start w:w="140" w:type="dxa"/>
+              <w:bottom w:w="120" w:type="dxa"/>
+              <w:end w:w="140" w:type="dxa"/>
+            </w:tcMar>
             <w:vAlign w:val="center"/>
           </w:tcPr>
           <w:p>
             <w:pPr>
               <w:bidi w:val="1"/>
+              <w:spacing w:after="60" w:line="276" w:lineRule="auto"/>
               <w:jc w:val="right"/>
             </w:pPr>
             <w:r/>
             <w:r>
               <w:rPr>
-                <w:rFonts w:ascii="Arial" w:hAnsi="Arial" w:cs="Arial"/>
+                <w:rFonts w:ascii="Tahoma" w:hAnsi="Tahoma" w:cs="Tahoma"/>
                 <w:b w:val="0"/>
                 <w:sz w:val="20"/>
               </w:rPr>
@@ -2310,18 +3003,25 @@
         </w:tc>
         <w:tc>
           <w:tcPr>
-            <w:tcW w:type="dxa" w:w="2520"/>
+            <w:tcW w:type="dxa" w:w="2154"/>
+            <w:tcMar>
+              <w:top w:w="120" w:type="dxa"/>
+              <w:start w:w="140" w:type="dxa"/>
+              <w:bottom w:w="120" w:type="dxa"/>
+              <w:end w:w="140" w:type="dxa"/>
+            </w:tcMar>
             <w:vAlign w:val="center"/>
           </w:tcPr>
           <w:p>
             <w:pPr>
               <w:bidi w:val="1"/>
+              <w:spacing w:after="60" w:line="276" w:lineRule="auto"/>
               <w:jc w:val="right"/>
             </w:pPr>
             <w:r/>
             <w:r>
               <w:rPr>
-                <w:rFonts w:ascii="Arial" w:hAnsi="Arial" w:cs="Arial"/>
+                <w:rFonts w:ascii="Tahoma" w:hAnsi="Tahoma" w:cs="Tahoma"/>
                 <w:b w:val="0"/>
                 <w:sz w:val="20"/>
               </w:rPr>
@@ -2331,18 +3031,25 @@
         </w:tc>
         <w:tc>
           <w:tcPr>
-            <w:tcW w:type="dxa" w:w="2520"/>
+            <w:tcW w:type="dxa" w:w="2154"/>
+            <w:tcMar>
+              <w:top w:w="120" w:type="dxa"/>
+              <w:start w:w="140" w:type="dxa"/>
+              <w:bottom w:w="120" w:type="dxa"/>
+              <w:end w:w="140" w:type="dxa"/>
+            </w:tcMar>
             <w:vAlign w:val="center"/>
           </w:tcPr>
           <w:p>
             <w:pPr>
               <w:bidi w:val="1"/>
+              <w:spacing w:after="60" w:line="276" w:lineRule="auto"/>
               <w:jc w:val="right"/>
             </w:pPr>
             <w:r/>
             <w:r>
               <w:rPr>
-                <w:rFonts w:ascii="Arial" w:hAnsi="Arial" w:cs="Arial"/>
+                <w:rFonts w:ascii="Tahoma" w:hAnsi="Tahoma" w:cs="Tahoma"/>
                 <w:b w:val="0"/>
                 <w:sz w:val="20"/>
               </w:rPr>
@@ -2352,18 +3059,25 @@
         </w:tc>
         <w:tc>
           <w:tcPr>
-            <w:tcW w:type="dxa" w:w="2520"/>
+            <w:tcW w:type="dxa" w:w="2154"/>
+            <w:tcMar>
+              <w:top w:w="120" w:type="dxa"/>
+              <w:start w:w="140" w:type="dxa"/>
+              <w:bottom w:w="120" w:type="dxa"/>
+              <w:end w:w="140" w:type="dxa"/>
+            </w:tcMar>
             <w:vAlign w:val="center"/>
           </w:tcPr>
           <w:p>
             <w:pPr>
               <w:bidi w:val="1"/>
+              <w:spacing w:after="60" w:line="276" w:lineRule="auto"/>
               <w:jc w:val="right"/>
             </w:pPr>
             <w:r/>
             <w:r>
               <w:rPr>
-                <w:rFonts w:ascii="Arial" w:hAnsi="Arial" w:cs="Arial"/>
+                <w:rFonts w:ascii="Tahoma" w:hAnsi="Tahoma" w:cs="Tahoma"/>
                 <w:b w:val="0"/>
                 <w:sz w:val="20"/>
               </w:rPr>
@@ -2373,20 +3087,31 @@
         </w:tc>
       </w:tr>
       <w:tr>
+        <w:trPr>
+          <w:trHeight w:val="386" w:hRule="atLeast"/>
+        </w:trPr>
         <w:tc>
           <w:tcPr>
-            <w:tcW w:type="dxa" w:w="2520"/>
+            <w:tcW w:type="dxa" w:w="2268"/>
+            <w:tcMar>
+              <w:top w:w="120" w:type="dxa"/>
+              <w:start w:w="140" w:type="dxa"/>
+              <w:bottom w:w="120" w:type="dxa"/>
+              <w:end w:w="140" w:type="dxa"/>
+            </w:tcMar>
+            <w:shd w:fill="F8FBFD"/>
             <w:vAlign w:val="center"/>
           </w:tcPr>
           <w:p>
             <w:pPr>
               <w:bidi w:val="1"/>
+              <w:spacing w:after="60" w:line="276" w:lineRule="auto"/>
               <w:jc w:val="right"/>
             </w:pPr>
             <w:r/>
             <w:r>
               <w:rPr>
-                <w:rFonts w:ascii="Arial" w:hAnsi="Arial" w:cs="Arial"/>
+                <w:rFonts w:ascii="Tahoma" w:hAnsi="Tahoma" w:cs="Tahoma"/>
                 <w:b w:val="0"/>
                 <w:sz w:val="20"/>
               </w:rPr>
@@ -2396,18 +3121,26 @@
         </w:tc>
         <w:tc>
           <w:tcPr>
-            <w:tcW w:type="dxa" w:w="2520"/>
+            <w:tcW w:type="dxa" w:w="2154"/>
+            <w:tcMar>
+              <w:top w:w="120" w:type="dxa"/>
+              <w:start w:w="140" w:type="dxa"/>
+              <w:bottom w:w="120" w:type="dxa"/>
+              <w:end w:w="140" w:type="dxa"/>
+            </w:tcMar>
+            <w:shd w:fill="F8FBFD"/>
             <w:vAlign w:val="center"/>
           </w:tcPr>
           <w:p>
             <w:pPr>
               <w:bidi w:val="1"/>
+              <w:spacing w:after="60" w:line="276" w:lineRule="auto"/>
               <w:jc w:val="right"/>
             </w:pPr>
             <w:r/>
             <w:r>
               <w:rPr>
-                <w:rFonts w:ascii="Arial" w:hAnsi="Arial" w:cs="Arial"/>
+                <w:rFonts w:ascii="Tahoma" w:hAnsi="Tahoma" w:cs="Tahoma"/>
                 <w:b w:val="0"/>
                 <w:sz w:val="20"/>
               </w:rPr>
@@ -2417,18 +3150,26 @@
         </w:tc>
         <w:tc>
           <w:tcPr>
-            <w:tcW w:type="dxa" w:w="2520"/>
+            <w:tcW w:type="dxa" w:w="2154"/>
+            <w:tcMar>
+              <w:top w:w="120" w:type="dxa"/>
+              <w:start w:w="140" w:type="dxa"/>
+              <w:bottom w:w="120" w:type="dxa"/>
+              <w:end w:w="140" w:type="dxa"/>
+            </w:tcMar>
+            <w:shd w:fill="F8FBFD"/>
             <w:vAlign w:val="center"/>
           </w:tcPr>
           <w:p>
             <w:pPr>
               <w:bidi w:val="1"/>
+              <w:spacing w:after="60" w:line="276" w:lineRule="auto"/>
               <w:jc w:val="right"/>
             </w:pPr>
             <w:r/>
             <w:r>
               <w:rPr>
-                <w:rFonts w:ascii="Arial" w:hAnsi="Arial" w:cs="Arial"/>
+                <w:rFonts w:ascii="Tahoma" w:hAnsi="Tahoma" w:cs="Tahoma"/>
                 <w:b w:val="0"/>
                 <w:sz w:val="20"/>
               </w:rPr>
@@ -2438,18 +3179,26 @@
         </w:tc>
         <w:tc>
           <w:tcPr>
-            <w:tcW w:type="dxa" w:w="2520"/>
+            <w:tcW w:type="dxa" w:w="2154"/>
+            <w:tcMar>
+              <w:top w:w="120" w:type="dxa"/>
+              <w:start w:w="140" w:type="dxa"/>
+              <w:bottom w:w="120" w:type="dxa"/>
+              <w:end w:w="140" w:type="dxa"/>
+            </w:tcMar>
+            <w:shd w:fill="F8FBFD"/>
             <w:vAlign w:val="center"/>
           </w:tcPr>
           <w:p>
             <w:pPr>
               <w:bidi w:val="1"/>
+              <w:spacing w:after="60" w:line="276" w:lineRule="auto"/>
               <w:jc w:val="right"/>
             </w:pPr>
             <w:r/>
             <w:r>
               <w:rPr>
-                <w:rFonts w:ascii="Arial" w:hAnsi="Arial" w:cs="Arial"/>
+                <w:rFonts w:ascii="Tahoma" w:hAnsi="Tahoma" w:cs="Tahoma"/>
                 <w:b w:val="0"/>
                 <w:sz w:val="20"/>
               </w:rPr>
@@ -2459,20 +3208,30 @@
         </w:tc>
       </w:tr>
       <w:tr>
+        <w:trPr>
+          <w:trHeight w:val="386" w:hRule="atLeast"/>
+        </w:trPr>
         <w:tc>
           <w:tcPr>
-            <w:tcW w:type="dxa" w:w="2520"/>
+            <w:tcW w:type="dxa" w:w="2268"/>
+            <w:tcMar>
+              <w:top w:w="120" w:type="dxa"/>
+              <w:start w:w="140" w:type="dxa"/>
+              <w:bottom w:w="120" w:type="dxa"/>
+              <w:end w:w="140" w:type="dxa"/>
+            </w:tcMar>
             <w:vAlign w:val="center"/>
           </w:tcPr>
           <w:p>
             <w:pPr>
               <w:bidi w:val="1"/>
+              <w:spacing w:after="60" w:line="276" w:lineRule="auto"/>
               <w:jc w:val="right"/>
             </w:pPr>
             <w:r/>
             <w:r>
               <w:rPr>
-                <w:rFonts w:ascii="Arial" w:hAnsi="Arial" w:cs="Arial"/>
+                <w:rFonts w:ascii="Tahoma" w:hAnsi="Tahoma" w:cs="Tahoma"/>
                 <w:b w:val="0"/>
                 <w:sz w:val="20"/>
               </w:rPr>
@@ -2482,18 +3241,25 @@
         </w:tc>
         <w:tc>
           <w:tcPr>
-            <w:tcW w:type="dxa" w:w="2520"/>
+            <w:tcW w:type="dxa" w:w="2154"/>
+            <w:tcMar>
+              <w:top w:w="120" w:type="dxa"/>
+              <w:start w:w="140" w:type="dxa"/>
+              <w:bottom w:w="120" w:type="dxa"/>
+              <w:end w:w="140" w:type="dxa"/>
+            </w:tcMar>
             <w:vAlign w:val="center"/>
           </w:tcPr>
           <w:p>
             <w:pPr>
               <w:bidi w:val="1"/>
+              <w:spacing w:after="60" w:line="276" w:lineRule="auto"/>
               <w:jc w:val="right"/>
             </w:pPr>
             <w:r/>
             <w:r>
               <w:rPr>
-                <w:rFonts w:ascii="Arial" w:hAnsi="Arial" w:cs="Arial"/>
+                <w:rFonts w:ascii="Tahoma" w:hAnsi="Tahoma" w:cs="Tahoma"/>
                 <w:b w:val="0"/>
                 <w:sz w:val="20"/>
               </w:rPr>
@@ -2503,18 +3269,25 @@
         </w:tc>
         <w:tc>
           <w:tcPr>
-            <w:tcW w:type="dxa" w:w="2520"/>
+            <w:tcW w:type="dxa" w:w="2154"/>
+            <w:tcMar>
+              <w:top w:w="120" w:type="dxa"/>
+              <w:start w:w="140" w:type="dxa"/>
+              <w:bottom w:w="120" w:type="dxa"/>
+              <w:end w:w="140" w:type="dxa"/>
+            </w:tcMar>
             <w:vAlign w:val="center"/>
           </w:tcPr>
           <w:p>
             <w:pPr>
               <w:bidi w:val="1"/>
+              <w:spacing w:after="60" w:line="276" w:lineRule="auto"/>
               <w:jc w:val="right"/>
             </w:pPr>
             <w:r/>
             <w:r>
               <w:rPr>
-                <w:rFonts w:ascii="Arial" w:hAnsi="Arial" w:cs="Arial"/>
+                <w:rFonts w:ascii="Tahoma" w:hAnsi="Tahoma" w:cs="Tahoma"/>
                 <w:b w:val="0"/>
                 <w:sz w:val="20"/>
               </w:rPr>
@@ -2524,18 +3297,25 @@
         </w:tc>
         <w:tc>
           <w:tcPr>
-            <w:tcW w:type="dxa" w:w="2520"/>
+            <w:tcW w:type="dxa" w:w="2154"/>
+            <w:tcMar>
+              <w:top w:w="120" w:type="dxa"/>
+              <w:start w:w="140" w:type="dxa"/>
+              <w:bottom w:w="120" w:type="dxa"/>
+              <w:end w:w="140" w:type="dxa"/>
+            </w:tcMar>
             <w:vAlign w:val="center"/>
           </w:tcPr>
           <w:p>
             <w:pPr>
               <w:bidi w:val="1"/>
+              <w:spacing w:after="60" w:line="276" w:lineRule="auto"/>
               <w:jc w:val="right"/>
             </w:pPr>
             <w:r/>
             <w:r>
               <w:rPr>
-                <w:rFonts w:ascii="Arial" w:hAnsi="Arial" w:cs="Arial"/>
+                <w:rFonts w:ascii="Tahoma" w:hAnsi="Tahoma" w:cs="Tahoma"/>
                 <w:b w:val="0"/>
                 <w:sz w:val="20"/>
               </w:rPr>
@@ -2548,15 +3328,15 @@
     <w:p>
       <w:pPr>
         <w:bidi w:val="1"/>
-        <w:spacing w:before="200" w:after="120"/>
+        <w:spacing w:before="280" w:after="160" w:line="288" w:lineRule="auto"/>
         <w:jc w:val="right"/>
       </w:pPr>
       <w:r>
         <w:rPr>
-          <w:rFonts w:ascii="Arial" w:hAnsi="Arial" w:cs="Arial"/>
+          <w:rFonts w:ascii="Tahoma" w:hAnsi="Tahoma" w:cs="Tahoma"/>
           <w:b/>
           <w:color w:val="1F4E79"/>
-          <w:sz w:val="36"/>
+          <w:sz w:val="40"/>
         </w:rPr>
         <w:t>8. فحص أوزان الـ Ensemble</w:t>
       </w:r>
@@ -2564,107 +3344,16 @@
     <w:p>
       <w:pPr>
         <w:bidi w:val="1"/>
-        <w:spacing w:after="120"/>
+        <w:spacing w:before="0" w:after="160" w:line="324" w:lineRule="auto"/>
         <w:jc w:val="right"/>
       </w:pPr>
       <w:r>
         <w:rPr>
-          <w:rFonts w:ascii="Arial" w:hAnsi="Arial" w:cs="Arial"/>
+          <w:rFonts w:ascii="Tahoma" w:hAnsi="Tahoma" w:cs="Tahoma"/>
           <w:b w:val="0"/>
           <w:sz w:val="24"/>
         </w:rPr>
         <w:t>أضفنا holdout blending audit حتى لا نختار أوزان ensemble بناء على نفس OOF rows ثم نقيم عليها مباشرة. هذا الفحص يقسم OOF داخلياً إلى جزء لاختيار الأوزان وجزء آخر للتقييم.</w:t>
-      </w:r>
-    </w:p>
-    <w:p>
-      <w:pPr>
-        <w:bidi w:val="1"/>
-        <w:spacing w:after="120"/>
-        <w:jc w:val="right"/>
-      </w:pPr>
-      <w:r>
-        <w:rPr>
-          <w:rFonts w:ascii="Arial" w:hAnsi="Arial" w:cs="Arial"/>
-          <w:b w:val="0"/>
-          <w:sz w:val="24"/>
-        </w:rPr>
-        <w:t>الاستراتيجية النهائية الحالية هي: stable_holdout_average. السياسة النهائية هي: conservative_private_safe_subset.</w:t>
-      </w:r>
-    </w:p>
-    <w:p>
-      <w:pPr>
-        <w:bidi w:val="1"/>
-        <w:spacing w:after="120"/>
-        <w:jc w:val="right"/>
-      </w:pPr>
-      <w:r>
-        <w:rPr>
-          <w:rFonts w:ascii="Arial" w:hAnsi="Arial" w:cs="Arial"/>
-          <w:b w:val="0"/>
-          <w:sz w:val="24"/>
-        </w:rPr>
-        <w:t>OOF Macro F1 النهائي المحافظ: 0.991702.</w:t>
-      </w:r>
-    </w:p>
-    <w:p>
-      <w:pPr>
-        <w:bidi w:val="1"/>
-        <w:spacing w:after="120"/>
-        <w:jc w:val="right"/>
-      </w:pPr>
-      <w:r>
-        <w:rPr>
-          <w:rFonts w:ascii="Arial" w:hAnsi="Arial" w:cs="Arial"/>
-          <w:b w:val="0"/>
-          <w:sz w:val="24"/>
-        </w:rPr>
-        <w:t>متوسط holdout valid Macro F1: 0.991614.</w:t>
-      </w:r>
-    </w:p>
-    <w:p>
-      <w:pPr>
-        <w:bidi w:val="1"/>
-        <w:spacing w:after="120"/>
-        <w:jc w:val="right"/>
-      </w:pPr>
-      <w:r>
-        <w:rPr>
-          <w:rFonts w:ascii="Arial" w:hAnsi="Arial" w:cs="Arial"/>
-          <w:b w:val="0"/>
-          <w:sz w:val="24"/>
-        </w:rPr>
-        <w:t>اخترنا السياسة المحافظة لأن النسخة الجريئة أعطت OOF أعلى لكنها نزلت على Public leaderboard. لذلك أبقينا التحليلات الجديدة للتوثيق والفهم، واستخدمنا final ensemble أقل مخاطرة.</w:t>
-      </w:r>
-    </w:p>
-    <w:p>
-      <w:pPr>
-        <w:bidi w:val="1"/>
-        <w:spacing w:before="200" w:after="120"/>
-        <w:jc w:val="right"/>
-      </w:pPr>
-      <w:r>
-        <w:rPr>
-          <w:rFonts w:ascii="Arial" w:hAnsi="Arial" w:cs="Arial"/>
-          <w:b/>
-          <w:color w:val="1F4E79"/>
-          <w:sz w:val="36"/>
-        </w:rPr>
-        <w:t>9. النموذج النهائي وملف الرفع</w:t>
-      </w:r>
-    </w:p>
-    <w:p>
-      <w:pPr>
-        <w:bidi w:val="1"/>
-        <w:spacing w:after="120"/>
-        <w:jc w:val="right"/>
-      </w:pPr>
-      <w:r>
-        <w:rPr>
-          <w:rFonts w:ascii="Arial" w:hAnsi="Arial" w:cs="Arial"/>
-          <w:b w:val="0"/>
-          <w:sz w:val="24"/>
-        </w:rPr>
-        <w:t>ملف الرفع النهائي هو submission.csv وتم توليده من النماذج، وليس يدوياً. التوزيع النهائي للتنبؤات:</w:t>
       </w:r>
     </w:p>
     <w:tbl>
@@ -2673,16 +3362,26 @@
         <w:tblW w:type="auto" w:w="0"/>
         <w:jc w:val="center"/>
         <w:tblLook w:firstColumn="1" w:firstRow="1" w:lastColumn="0" w:lastRow="0" w:noHBand="0" w:noVBand="1" w:val="04A0"/>
+        <w:bidiVisual w:val="1"/>
       </w:tblPr>
       <w:tblGrid>
-        <w:gridCol w:w="5040"/>
-        <w:gridCol w:w="5040"/>
+        <w:gridCol w:w="3969"/>
+        <w:gridCol w:w="4819"/>
       </w:tblGrid>
       <w:tr>
+        <w:trPr>
+          <w:trHeight w:val="425" w:hRule="atLeast"/>
+        </w:trPr>
         <w:tc>
           <w:tcPr>
-            <w:tcW w:type="dxa" w:w="5040"/>
+            <w:tcW w:type="dxa" w:w="5156"/>
             <w:shd w:fill="1F4E79"/>
+            <w:tcMar>
+              <w:top w:w="120" w:type="dxa"/>
+              <w:start w:w="140" w:type="dxa"/>
+              <w:bottom w:w="120" w:type="dxa"/>
+              <w:end w:w="140" w:type="dxa"/>
+            </w:tcMar>
             <w:vAlign w:val="center"/>
           </w:tcPr>
           <w:p>
@@ -2693,7 +3392,392 @@
             <w:r/>
             <w:r>
               <w:rPr>
-                <w:rFonts w:ascii="Arial" w:hAnsi="Arial" w:cs="Arial"/>
+                <w:rFonts w:ascii="Tahoma" w:hAnsi="Tahoma" w:cs="Tahoma"/>
+                <w:b/>
+                <w:color w:val="FFFFFF"/>
+                <w:sz w:val="21"/>
+              </w:rPr>
+              <w:t>البند</w:t>
+            </w:r>
+          </w:p>
+        </w:tc>
+        <w:tc>
+          <w:tcPr>
+            <w:tcW w:type="dxa" w:w="5156"/>
+            <w:shd w:fill="1F4E79"/>
+            <w:tcMar>
+              <w:top w:w="120" w:type="dxa"/>
+              <w:start w:w="140" w:type="dxa"/>
+              <w:bottom w:w="120" w:type="dxa"/>
+              <w:end w:w="140" w:type="dxa"/>
+            </w:tcMar>
+            <w:vAlign w:val="center"/>
+          </w:tcPr>
+          <w:p>
+            <w:pPr>
+              <w:bidi w:val="1"/>
+              <w:jc w:val="right"/>
+            </w:pPr>
+            <w:r/>
+            <w:r>
+              <w:rPr>
+                <w:rFonts w:ascii="Tahoma" w:hAnsi="Tahoma" w:cs="Tahoma"/>
+                <w:b/>
+                <w:color w:val="FFFFFF"/>
+                <w:sz w:val="21"/>
+              </w:rPr>
+              <w:t>القيمة</w:t>
+            </w:r>
+          </w:p>
+        </w:tc>
+      </w:tr>
+      <w:tr>
+        <w:trPr>
+          <w:trHeight w:val="386" w:hRule="atLeast"/>
+        </w:trPr>
+        <w:tc>
+          <w:tcPr>
+            <w:tcW w:type="dxa" w:w="3969"/>
+            <w:tcMar>
+              <w:top w:w="120" w:type="dxa"/>
+              <w:start w:w="140" w:type="dxa"/>
+              <w:bottom w:w="120" w:type="dxa"/>
+              <w:end w:w="140" w:type="dxa"/>
+            </w:tcMar>
+            <w:shd w:fill="F8FBFD"/>
+            <w:vAlign w:val="center"/>
+          </w:tcPr>
+          <w:p>
+            <w:pPr>
+              <w:bidi w:val="1"/>
+              <w:spacing w:after="60" w:line="276" w:lineRule="auto"/>
+              <w:jc w:val="right"/>
+            </w:pPr>
+            <w:r/>
+            <w:r>
+              <w:rPr>
+                <w:rFonts w:ascii="Tahoma" w:hAnsi="Tahoma" w:cs="Tahoma"/>
+                <w:b w:val="0"/>
+                <w:sz w:val="20"/>
+              </w:rPr>
+              <w:t>استراتيجية الأوزان</w:t>
+            </w:r>
+          </w:p>
+        </w:tc>
+        <w:tc>
+          <w:tcPr>
+            <w:tcW w:type="dxa" w:w="4819"/>
+            <w:tcMar>
+              <w:top w:w="120" w:type="dxa"/>
+              <w:start w:w="140" w:type="dxa"/>
+              <w:bottom w:w="120" w:type="dxa"/>
+              <w:end w:w="140" w:type="dxa"/>
+            </w:tcMar>
+            <w:shd w:fill="F8FBFD"/>
+            <w:vAlign w:val="center"/>
+          </w:tcPr>
+          <w:p>
+            <w:pPr>
+              <w:bidi w:val="1"/>
+              <w:spacing w:after="60" w:line="276" w:lineRule="auto"/>
+              <w:jc w:val="right"/>
+            </w:pPr>
+            <w:r/>
+            <w:r>
+              <w:rPr>
+                <w:rFonts w:ascii="Tahoma" w:hAnsi="Tahoma" w:cs="Tahoma"/>
+                <w:b w:val="0"/>
+                <w:sz w:val="20"/>
+              </w:rPr>
+              <w:t>stable_holdout_average</w:t>
+            </w:r>
+          </w:p>
+        </w:tc>
+      </w:tr>
+      <w:tr>
+        <w:trPr>
+          <w:trHeight w:val="386" w:hRule="atLeast"/>
+        </w:trPr>
+        <w:tc>
+          <w:tcPr>
+            <w:tcW w:type="dxa" w:w="3969"/>
+            <w:tcMar>
+              <w:top w:w="120" w:type="dxa"/>
+              <w:start w:w="140" w:type="dxa"/>
+              <w:bottom w:w="120" w:type="dxa"/>
+              <w:end w:w="140" w:type="dxa"/>
+            </w:tcMar>
+            <w:vAlign w:val="center"/>
+          </w:tcPr>
+          <w:p>
+            <w:pPr>
+              <w:bidi w:val="1"/>
+              <w:spacing w:after="60" w:line="276" w:lineRule="auto"/>
+              <w:jc w:val="right"/>
+            </w:pPr>
+            <w:r/>
+            <w:r>
+              <w:rPr>
+                <w:rFonts w:ascii="Tahoma" w:hAnsi="Tahoma" w:cs="Tahoma"/>
+                <w:b w:val="0"/>
+                <w:sz w:val="20"/>
+              </w:rPr>
+              <w:t>سياسة النموذج النهائي</w:t>
+            </w:r>
+          </w:p>
+        </w:tc>
+        <w:tc>
+          <w:tcPr>
+            <w:tcW w:type="dxa" w:w="4819"/>
+            <w:tcMar>
+              <w:top w:w="120" w:type="dxa"/>
+              <w:start w:w="140" w:type="dxa"/>
+              <w:bottom w:w="120" w:type="dxa"/>
+              <w:end w:w="140" w:type="dxa"/>
+            </w:tcMar>
+            <w:vAlign w:val="center"/>
+          </w:tcPr>
+          <w:p>
+            <w:pPr>
+              <w:bidi w:val="1"/>
+              <w:spacing w:after="60" w:line="276" w:lineRule="auto"/>
+              <w:jc w:val="right"/>
+            </w:pPr>
+            <w:r/>
+            <w:r>
+              <w:rPr>
+                <w:rFonts w:ascii="Tahoma" w:hAnsi="Tahoma" w:cs="Tahoma"/>
+                <w:b w:val="0"/>
+                <w:sz w:val="20"/>
+              </w:rPr>
+              <w:t>conservative_private_safe_subset</w:t>
+            </w:r>
+          </w:p>
+        </w:tc>
+      </w:tr>
+      <w:tr>
+        <w:trPr>
+          <w:trHeight w:val="386" w:hRule="atLeast"/>
+        </w:trPr>
+        <w:tc>
+          <w:tcPr>
+            <w:tcW w:type="dxa" w:w="3969"/>
+            <w:tcMar>
+              <w:top w:w="120" w:type="dxa"/>
+              <w:start w:w="140" w:type="dxa"/>
+              <w:bottom w:w="120" w:type="dxa"/>
+              <w:end w:w="140" w:type="dxa"/>
+            </w:tcMar>
+            <w:shd w:fill="F8FBFD"/>
+            <w:vAlign w:val="center"/>
+          </w:tcPr>
+          <w:p>
+            <w:pPr>
+              <w:bidi w:val="1"/>
+              <w:spacing w:after="60" w:line="276" w:lineRule="auto"/>
+              <w:jc w:val="right"/>
+            </w:pPr>
+            <w:r/>
+            <w:r>
+              <w:rPr>
+                <w:rFonts w:ascii="Tahoma" w:hAnsi="Tahoma" w:cs="Tahoma"/>
+                <w:b w:val="0"/>
+                <w:sz w:val="20"/>
+              </w:rPr>
+              <w:t>OOF Macro F1 النهائي</w:t>
+            </w:r>
+          </w:p>
+        </w:tc>
+        <w:tc>
+          <w:tcPr>
+            <w:tcW w:type="dxa" w:w="4819"/>
+            <w:tcMar>
+              <w:top w:w="120" w:type="dxa"/>
+              <w:start w:w="140" w:type="dxa"/>
+              <w:bottom w:w="120" w:type="dxa"/>
+              <w:end w:w="140" w:type="dxa"/>
+            </w:tcMar>
+            <w:shd w:fill="F8FBFD"/>
+            <w:vAlign w:val="center"/>
+          </w:tcPr>
+          <w:p>
+            <w:pPr>
+              <w:bidi w:val="1"/>
+              <w:spacing w:after="60" w:line="276" w:lineRule="auto"/>
+              <w:jc w:val="right"/>
+            </w:pPr>
+            <w:r/>
+            <w:r>
+              <w:rPr>
+                <w:rFonts w:ascii="Tahoma" w:hAnsi="Tahoma" w:cs="Tahoma"/>
+                <w:b w:val="0"/>
+                <w:sz w:val="20"/>
+              </w:rPr>
+              <w:t>0.991702</w:t>
+            </w:r>
+          </w:p>
+        </w:tc>
+      </w:tr>
+      <w:tr>
+        <w:trPr>
+          <w:trHeight w:val="386" w:hRule="atLeast"/>
+        </w:trPr>
+        <w:tc>
+          <w:tcPr>
+            <w:tcW w:type="dxa" w:w="3969"/>
+            <w:tcMar>
+              <w:top w:w="120" w:type="dxa"/>
+              <w:start w:w="140" w:type="dxa"/>
+              <w:bottom w:w="120" w:type="dxa"/>
+              <w:end w:w="140" w:type="dxa"/>
+            </w:tcMar>
+            <w:vAlign w:val="center"/>
+          </w:tcPr>
+          <w:p>
+            <w:pPr>
+              <w:bidi w:val="1"/>
+              <w:spacing w:after="60" w:line="276" w:lineRule="auto"/>
+              <w:jc w:val="right"/>
+            </w:pPr>
+            <w:r/>
+            <w:r>
+              <w:rPr>
+                <w:rFonts w:ascii="Tahoma" w:hAnsi="Tahoma" w:cs="Tahoma"/>
+                <w:b w:val="0"/>
+                <w:sz w:val="20"/>
+              </w:rPr>
+              <w:t>متوسط holdout valid Macro F1</w:t>
+            </w:r>
+          </w:p>
+        </w:tc>
+        <w:tc>
+          <w:tcPr>
+            <w:tcW w:type="dxa" w:w="4819"/>
+            <w:tcMar>
+              <w:top w:w="120" w:type="dxa"/>
+              <w:start w:w="140" w:type="dxa"/>
+              <w:bottom w:w="120" w:type="dxa"/>
+              <w:end w:w="140" w:type="dxa"/>
+            </w:tcMar>
+            <w:vAlign w:val="center"/>
+          </w:tcPr>
+          <w:p>
+            <w:pPr>
+              <w:bidi w:val="1"/>
+              <w:spacing w:after="60" w:line="276" w:lineRule="auto"/>
+              <w:jc w:val="right"/>
+            </w:pPr>
+            <w:r/>
+            <w:r>
+              <w:rPr>
+                <w:rFonts w:ascii="Tahoma" w:hAnsi="Tahoma" w:cs="Tahoma"/>
+                <w:b w:val="0"/>
+                <w:sz w:val="20"/>
+              </w:rPr>
+              <w:t>0.991614</w:t>
+            </w:r>
+          </w:p>
+        </w:tc>
+      </w:tr>
+    </w:tbl>
+    <w:p>
+      <w:pPr>
+        <w:bidi w:val="1"/>
+        <w:spacing w:before="0" w:after="160" w:line="324" w:lineRule="auto"/>
+        <w:jc w:val="right"/>
+      </w:pPr>
+      <w:r>
+        <w:rPr>
+          <w:rFonts w:ascii="Tahoma" w:hAnsi="Tahoma" w:cs="Tahoma"/>
+          <w:b w:val="0"/>
+          <w:sz w:val="24"/>
+        </w:rPr>
+        <w:t>اخترنا السياسة المحافظة لأن النسخة الجريئة أعطت OOF أعلى لكنها نزلت على Public leaderboard. لذلك أبقينا التحليلات الجديدة للتوثيق والفهم، واستخدمنا final ensemble أقل مخاطرة.</w:t>
+      </w:r>
+    </w:p>
+    <w:p>
+      <w:pPr>
+        <w:bidi w:val="1"/>
+        <w:spacing w:before="280" w:after="160" w:line="288" w:lineRule="auto"/>
+        <w:jc w:val="right"/>
+      </w:pPr>
+      <w:r>
+        <w:rPr>
+          <w:rFonts w:ascii="Tahoma" w:hAnsi="Tahoma" w:cs="Tahoma"/>
+          <w:b/>
+          <w:color w:val="1F4E79"/>
+          <w:sz w:val="40"/>
+        </w:rPr>
+        <w:t>9. النموذج النهائي وملف الرفع</w:t>
+      </w:r>
+    </w:p>
+    <w:p>
+      <w:pPr>
+        <w:bidi w:val="1"/>
+        <w:spacing w:before="0" w:after="160" w:line="324" w:lineRule="auto"/>
+        <w:jc w:val="right"/>
+      </w:pPr>
+      <w:r>
+        <w:rPr>
+          <w:rFonts w:ascii="Tahoma" w:hAnsi="Tahoma" w:cs="Tahoma"/>
+          <w:b w:val="0"/>
+          <w:sz w:val="24"/>
+        </w:rPr>
+        <w:t>ملف الرفع النهائي تم توليده من النماذج، وليس يدوياً. التوزيع النهائي للتنبؤات هو:</w:t>
+      </w:r>
+    </w:p>
+    <w:p>
+      <w:pPr>
+        <w:spacing w:after="160"/>
+        <w:ind w:left="283" w:right="283"/>
+        <w:jc w:val="left"/>
+        <w:shd w:fill="F2F2F2"/>
+      </w:pPr>
+      <w:r>
+        <w:rPr>
+          <w:rFonts w:ascii="Consolas" w:hAnsi="Consolas"/>
+          <w:sz w:val="21"/>
+        </w:rPr>
+        <w:t>submission.csv</w:t>
+      </w:r>
+    </w:p>
+    <w:tbl>
+      <w:tblPr>
+        <w:tblStyle w:val="TableGrid"/>
+        <w:tblW w:type="auto" w:w="0"/>
+        <w:jc w:val="center"/>
+        <w:tblLook w:firstColumn="1" w:firstRow="1" w:lastColumn="0" w:lastRow="0" w:noHBand="0" w:noVBand="1" w:val="04A0"/>
+        <w:bidiVisual w:val="1"/>
+      </w:tblPr>
+      <w:tblGrid>
+        <w:gridCol w:w="3969"/>
+        <w:gridCol w:w="2835"/>
+      </w:tblGrid>
+      <w:tr>
+        <w:trPr>
+          <w:trHeight w:val="425" w:hRule="atLeast"/>
+        </w:trPr>
+        <w:tc>
+          <w:tcPr>
+            <w:tcW w:type="dxa" w:w="5156"/>
+            <w:shd w:fill="1F4E79"/>
+            <w:tcMar>
+              <w:top w:w="120" w:type="dxa"/>
+              <w:start w:w="140" w:type="dxa"/>
+              <w:bottom w:w="120" w:type="dxa"/>
+              <w:end w:w="140" w:type="dxa"/>
+            </w:tcMar>
+            <w:vAlign w:val="center"/>
+          </w:tcPr>
+          <w:p>
+            <w:pPr>
+              <w:bidi w:val="1"/>
+              <w:jc w:val="right"/>
+            </w:pPr>
+            <w:r/>
+            <w:r>
+              <w:rPr>
+                <w:rFonts w:ascii="Tahoma" w:hAnsi="Tahoma" w:cs="Tahoma"/>
                 <w:b/>
                 <w:color w:val="FFFFFF"/>
                 <w:sz w:val="21"/>
@@ -2704,8 +3788,14 @@
         </w:tc>
         <w:tc>
           <w:tcPr>
-            <w:tcW w:type="dxa" w:w="5040"/>
+            <w:tcW w:type="dxa" w:w="5156"/>
             <w:shd w:fill="1F4E79"/>
+            <w:tcMar>
+              <w:top w:w="120" w:type="dxa"/>
+              <w:start w:w="140" w:type="dxa"/>
+              <w:bottom w:w="120" w:type="dxa"/>
+              <w:end w:w="140" w:type="dxa"/>
+            </w:tcMar>
             <w:vAlign w:val="center"/>
           </w:tcPr>
           <w:p>
@@ -2716,7 +3806,7 @@
             <w:r/>
             <w:r>
               <w:rPr>
-                <w:rFonts w:ascii="Arial" w:hAnsi="Arial" w:cs="Arial"/>
+                <w:rFonts w:ascii="Tahoma" w:hAnsi="Tahoma" w:cs="Tahoma"/>
                 <w:b/>
                 <w:color w:val="FFFFFF"/>
                 <w:sz w:val="21"/>
@@ -2727,20 +3817,31 @@
         </w:tc>
       </w:tr>
       <w:tr>
+        <w:trPr>
+          <w:trHeight w:val="386" w:hRule="atLeast"/>
+        </w:trPr>
         <w:tc>
           <w:tcPr>
-            <w:tcW w:type="dxa" w:w="5040"/>
+            <w:tcW w:type="dxa" w:w="3969"/>
+            <w:tcMar>
+              <w:top w:w="120" w:type="dxa"/>
+              <w:start w:w="140" w:type="dxa"/>
+              <w:bottom w:w="120" w:type="dxa"/>
+              <w:end w:w="140" w:type="dxa"/>
+            </w:tcMar>
+            <w:shd w:fill="F8FBFD"/>
             <w:vAlign w:val="center"/>
           </w:tcPr>
           <w:p>
             <w:pPr>
               <w:bidi w:val="1"/>
+              <w:spacing w:after="60" w:line="276" w:lineRule="auto"/>
               <w:jc w:val="right"/>
             </w:pPr>
             <w:r/>
             <w:r>
               <w:rPr>
-                <w:rFonts w:ascii="Arial" w:hAnsi="Arial" w:cs="Arial"/>
+                <w:rFonts w:ascii="Tahoma" w:hAnsi="Tahoma" w:cs="Tahoma"/>
                 <w:b w:val="0"/>
                 <w:sz w:val="20"/>
               </w:rPr>
@@ -2750,18 +3851,26 @@
         </w:tc>
         <w:tc>
           <w:tcPr>
-            <w:tcW w:type="dxa" w:w="5040"/>
+            <w:tcW w:type="dxa" w:w="2835"/>
+            <w:tcMar>
+              <w:top w:w="120" w:type="dxa"/>
+              <w:start w:w="140" w:type="dxa"/>
+              <w:bottom w:w="120" w:type="dxa"/>
+              <w:end w:w="140" w:type="dxa"/>
+            </w:tcMar>
+            <w:shd w:fill="F8FBFD"/>
             <w:vAlign w:val="center"/>
           </w:tcPr>
           <w:p>
             <w:pPr>
               <w:bidi w:val="1"/>
+              <w:spacing w:after="60" w:line="276" w:lineRule="auto"/>
               <w:jc w:val="right"/>
             </w:pPr>
             <w:r/>
             <w:r>
               <w:rPr>
-                <w:rFonts w:ascii="Arial" w:hAnsi="Arial" w:cs="Arial"/>
+                <w:rFonts w:ascii="Tahoma" w:hAnsi="Tahoma" w:cs="Tahoma"/>
                 <w:b w:val="0"/>
                 <w:sz w:val="20"/>
               </w:rPr>
@@ -2771,20 +3880,30 @@
         </w:tc>
       </w:tr>
       <w:tr>
+        <w:trPr>
+          <w:trHeight w:val="386" w:hRule="atLeast"/>
+        </w:trPr>
         <w:tc>
           <w:tcPr>
-            <w:tcW w:type="dxa" w:w="5040"/>
+            <w:tcW w:type="dxa" w:w="3969"/>
+            <w:tcMar>
+              <w:top w:w="120" w:type="dxa"/>
+              <w:start w:w="140" w:type="dxa"/>
+              <w:bottom w:w="120" w:type="dxa"/>
+              <w:end w:w="140" w:type="dxa"/>
+            </w:tcMar>
             <w:vAlign w:val="center"/>
           </w:tcPr>
           <w:p>
             <w:pPr>
               <w:bidi w:val="1"/>
+              <w:spacing w:after="60" w:line="276" w:lineRule="auto"/>
               <w:jc w:val="right"/>
             </w:pPr>
             <w:r/>
             <w:r>
               <w:rPr>
-                <w:rFonts w:ascii="Arial" w:hAnsi="Arial" w:cs="Arial"/>
+                <w:rFonts w:ascii="Tahoma" w:hAnsi="Tahoma" w:cs="Tahoma"/>
                 <w:b w:val="0"/>
                 <w:sz w:val="20"/>
               </w:rPr>
@@ -2794,18 +3913,25 @@
         </w:tc>
         <w:tc>
           <w:tcPr>
-            <w:tcW w:type="dxa" w:w="5040"/>
+            <w:tcW w:type="dxa" w:w="2835"/>
+            <w:tcMar>
+              <w:top w:w="120" w:type="dxa"/>
+              <w:start w:w="140" w:type="dxa"/>
+              <w:bottom w:w="120" w:type="dxa"/>
+              <w:end w:w="140" w:type="dxa"/>
+            </w:tcMar>
             <w:vAlign w:val="center"/>
           </w:tcPr>
           <w:p>
             <w:pPr>
               <w:bidi w:val="1"/>
+              <w:spacing w:after="60" w:line="276" w:lineRule="auto"/>
               <w:jc w:val="right"/>
             </w:pPr>
             <w:r/>
             <w:r>
               <w:rPr>
-                <w:rFonts w:ascii="Arial" w:hAnsi="Arial" w:cs="Arial"/>
+                <w:rFonts w:ascii="Tahoma" w:hAnsi="Tahoma" w:cs="Tahoma"/>
                 <w:b w:val="0"/>
                 <w:sz w:val="20"/>
               </w:rPr>
@@ -2815,20 +3941,31 @@
         </w:tc>
       </w:tr>
       <w:tr>
+        <w:trPr>
+          <w:trHeight w:val="386" w:hRule="atLeast"/>
+        </w:trPr>
         <w:tc>
           <w:tcPr>
-            <w:tcW w:type="dxa" w:w="5040"/>
+            <w:tcW w:type="dxa" w:w="3969"/>
+            <w:tcMar>
+              <w:top w:w="120" w:type="dxa"/>
+              <w:start w:w="140" w:type="dxa"/>
+              <w:bottom w:w="120" w:type="dxa"/>
+              <w:end w:w="140" w:type="dxa"/>
+            </w:tcMar>
+            <w:shd w:fill="F8FBFD"/>
             <w:vAlign w:val="center"/>
           </w:tcPr>
           <w:p>
             <w:pPr>
               <w:bidi w:val="1"/>
+              <w:spacing w:after="60" w:line="276" w:lineRule="auto"/>
               <w:jc w:val="right"/>
             </w:pPr>
             <w:r/>
             <w:r>
               <w:rPr>
-                <w:rFonts w:ascii="Arial" w:hAnsi="Arial" w:cs="Arial"/>
+                <w:rFonts w:ascii="Tahoma" w:hAnsi="Tahoma" w:cs="Tahoma"/>
                 <w:b w:val="0"/>
                 <w:sz w:val="20"/>
               </w:rPr>
@@ -2838,18 +3975,26 @@
         </w:tc>
         <w:tc>
           <w:tcPr>
-            <w:tcW w:type="dxa" w:w="5040"/>
+            <w:tcW w:type="dxa" w:w="2835"/>
+            <w:tcMar>
+              <w:top w:w="120" w:type="dxa"/>
+              <w:start w:w="140" w:type="dxa"/>
+              <w:bottom w:w="120" w:type="dxa"/>
+              <w:end w:w="140" w:type="dxa"/>
+            </w:tcMar>
+            <w:shd w:fill="F8FBFD"/>
             <w:vAlign w:val="center"/>
           </w:tcPr>
           <w:p>
             <w:pPr>
               <w:bidi w:val="1"/>
+              <w:spacing w:after="60" w:line="276" w:lineRule="auto"/>
               <w:jc w:val="right"/>
             </w:pPr>
             <w:r/>
             <w:r>
               <w:rPr>
-                <w:rFonts w:ascii="Arial" w:hAnsi="Arial" w:cs="Arial"/>
+                <w:rFonts w:ascii="Tahoma" w:hAnsi="Tahoma" w:cs="Tahoma"/>
                 <w:b w:val="0"/>
                 <w:sz w:val="20"/>
               </w:rPr>
@@ -2862,30 +4007,30 @@
     <w:p>
       <w:pPr>
         <w:bidi w:val="1"/>
-        <w:spacing w:after="120"/>
+        <w:spacing w:before="0" w:after="160" w:line="324" w:lineRule="auto"/>
         <w:jc w:val="right"/>
       </w:pPr>
       <w:r>
         <w:rPr>
-          <w:rFonts w:ascii="Arial" w:hAnsi="Arial" w:cs="Arial"/>
+          <w:rFonts w:ascii="Tahoma" w:hAnsi="Tahoma" w:cs="Tahoma"/>
           <w:b w:val="0"/>
           <w:sz w:val="24"/>
         </w:rPr>
-        <w:t>نتيجة Public الحالية بعد السياسة المحافظة: 0.98046. هذه النتيجة ليست ضماناً للـ Private، لكنها أفضل من النسخة الجريئة التي رفعت OOF داخلياً ثم انخفضت على Public.</w:t>
+        <w:t>نتيجة Public الحالية بعد السياسة المحافظة هي 0.98046. هذه النتيجة ليست ضماناً للـ Private، لكنها أفضل من النسخة الجريئة التي رفعت OOF داخلياً ثم انخفضت على Public.</w:t>
       </w:r>
     </w:p>
     <w:p>
       <w:pPr>
         <w:bidi w:val="1"/>
-        <w:spacing w:before="200" w:after="120"/>
+        <w:spacing w:before="280" w:after="160" w:line="288" w:lineRule="auto"/>
         <w:jc w:val="right"/>
       </w:pPr>
       <w:r>
         <w:rPr>
-          <w:rFonts w:ascii="Arial" w:hAnsi="Arial" w:cs="Arial"/>
+          <w:rFonts w:ascii="Tahoma" w:hAnsi="Tahoma" w:cs="Tahoma"/>
           <w:b/>
           <w:color w:val="1F4E79"/>
-          <w:sz w:val="36"/>
+          <w:sz w:val="40"/>
         </w:rPr>
         <w:t>10. إدارة البيانات باستخدام DVC</w:t>
       </w:r>
@@ -2893,12 +4038,12 @@
     <w:p>
       <w:pPr>
         <w:bidi w:val="1"/>
-        <w:spacing w:after="120"/>
+        <w:spacing w:before="0" w:after="160" w:line="324" w:lineRule="auto"/>
         <w:jc w:val="right"/>
       </w:pPr>
       <w:r>
         <w:rPr>
-          <w:rFonts w:ascii="Arial" w:hAnsi="Arial" w:cs="Arial"/>
+          <w:rFonts w:ascii="Tahoma" w:hAnsi="Tahoma" w:cs="Tahoma"/>
           <w:b w:val="0"/>
           <w:sz w:val="24"/>
         </w:rPr>
@@ -2907,28 +4052,28 @@
     </w:p>
     <w:p>
       <w:pPr>
-        <w:bidi w:val="1"/>
-        <w:spacing w:after="120"/>
-        <w:jc w:val="right"/>
+        <w:spacing w:after="160"/>
+        <w:ind w:left="283" w:right="283"/>
+        <w:jc w:val="left"/>
+        <w:shd w:fill="F2F2F2"/>
       </w:pPr>
       <w:r>
         <w:rPr>
-          <w:rFonts w:ascii="Arial" w:hAnsi="Arial" w:cs="Arial"/>
-          <w:b w:val="0"/>
-          <w:sz w:val="24"/>
+          <w:rFonts w:ascii="Consolas" w:hAnsi="Consolas"/>
+          <w:sz w:val="21"/>
         </w:rPr>
-        <w:t>الملفات المتتبعة عبر DVC: train_data.csv.dvc, test_data.csv.dvc, sample_submission.csv.dvc.</w:t>
+        <w:t>train_data.csv.dvc, test_data.csv.dvc, sample_submission.csv.dvc</w:t>
       </w:r>
     </w:p>
     <w:p>
       <w:pPr>
         <w:bidi w:val="1"/>
-        <w:spacing w:after="120"/>
+        <w:spacing w:before="0" w:after="160" w:line="324" w:lineRule="auto"/>
         <w:jc w:val="right"/>
       </w:pPr>
       <w:r>
         <w:rPr>
-          <w:rFonts w:ascii="Arial" w:hAnsi="Arial" w:cs="Arial"/>
+          <w:rFonts w:ascii="Tahoma" w:hAnsi="Tahoma" w:cs="Tahoma"/>
           <w:b w:val="0"/>
           <w:sz w:val="24"/>
         </w:rPr>
@@ -2937,15 +4082,15 @@
     </w:p>
     <w:p>
       <w:pPr>
-        <w:bidi w:val="1"/>
-        <w:spacing w:after="120"/>
-        <w:jc w:val="right"/>
+        <w:spacing w:after="160"/>
+        <w:ind w:left="283" w:right="283"/>
+        <w:jc w:val="left"/>
+        <w:shd w:fill="F2F2F2"/>
       </w:pPr>
       <w:r>
         <w:rPr>
-          <w:rFonts w:ascii="Arial" w:hAnsi="Arial" w:cs="Arial"/>
-          <w:b/>
-          <w:sz w:val="24"/>
+          <w:rFonts w:ascii="Consolas" w:hAnsi="Consolas"/>
+          <w:sz w:val="21"/>
         </w:rPr>
         <w:t>dvc pull</w:t>
       </w:r>
@@ -2953,12 +4098,12 @@
     <w:p>
       <w:pPr>
         <w:bidi w:val="1"/>
-        <w:spacing w:after="120"/>
+        <w:spacing w:before="0" w:after="160" w:line="324" w:lineRule="auto"/>
         <w:jc w:val="right"/>
       </w:pPr>
       <w:r>
         <w:rPr>
-          <w:rFonts w:ascii="Arial" w:hAnsi="Arial" w:cs="Arial"/>
+          <w:rFonts w:ascii="Tahoma" w:hAnsi="Tahoma" w:cs="Tahoma"/>
           <w:b w:val="0"/>
           <w:sz w:val="24"/>
         </w:rPr>
@@ -2967,15 +4112,15 @@
     </w:p>
     <w:p>
       <w:pPr>
-        <w:bidi w:val="1"/>
-        <w:spacing w:after="120"/>
-        <w:jc w:val="right"/>
+        <w:spacing w:after="160"/>
+        <w:ind w:left="283" w:right="283"/>
+        <w:jc w:val="left"/>
+        <w:shd w:fill="F2F2F2"/>
       </w:pPr>
       <w:r>
         <w:rPr>
-          <w:rFonts w:ascii="Arial" w:hAnsi="Arial" w:cs="Arial"/>
-          <w:b/>
-          <w:sz w:val="24"/>
+          <w:rFonts w:ascii="Consolas" w:hAnsi="Consolas"/>
+          <w:sz w:val="21"/>
         </w:rPr>
         <w:t>dvc remote modify storage url "PATH_TO_TEAMMATE_GOOGLE_DRIVE_FOLDER"</w:t>
       </w:r>
@@ -2983,15 +4128,15 @@
     <w:p>
       <w:pPr>
         <w:bidi w:val="1"/>
-        <w:spacing w:before="200" w:after="120"/>
+        <w:spacing w:before="280" w:after="160" w:line="288" w:lineRule="auto"/>
         <w:jc w:val="right"/>
       </w:pPr>
       <w:r>
         <w:rPr>
-          <w:rFonts w:ascii="Arial" w:hAnsi="Arial" w:cs="Arial"/>
+          <w:rFonts w:ascii="Tahoma" w:hAnsi="Tahoma" w:cs="Tahoma"/>
           <w:b/>
           <w:color w:val="1F4E79"/>
-          <w:sz w:val="36"/>
+          <w:sz w:val="40"/>
         </w:rPr>
         <w:t>11. آلية عمل الفريق على GitHub وMLflow</w:t>
       </w:r>
@@ -2999,30 +4144,30 @@
     <w:p>
       <w:pPr>
         <w:bidi w:val="1"/>
-        <w:spacing w:after="120"/>
+        <w:spacing w:before="0" w:after="160" w:line="324" w:lineRule="auto"/>
         <w:jc w:val="right"/>
       </w:pPr>
       <w:r>
         <w:rPr>
-          <w:rFonts w:ascii="Arial" w:hAnsi="Arial" w:cs="Arial"/>
+          <w:rFonts w:ascii="Tahoma" w:hAnsi="Tahoma" w:cs="Tahoma"/>
           <w:b w:val="0"/>
           <w:sz w:val="24"/>
         </w:rPr>
-        <w:t>يمكن لأعضاء الفريق الذين تمت دعوتهم على GitHub أن يسحبوا المشروع ويعملوا على فروع branches خاصة بهم. الأفضل ألا يرفع الجميع مباشرة على main حتى لا تتداخل التجارب أو يحدث conflict في mlflow.db.</w:t>
+        <w:t>يمكن لأعضاء الفريق الذين تمت دعوتهم على GitHub أن يسحبوا المشروع ويعملوا على branches خاصة بهم. الأفضل ألا يرفع الجميع مباشرة على main حتى لا تتداخل التجارب أو يحدث conflict في mlflow.db.</w:t>
       </w:r>
     </w:p>
     <w:p>
       <w:pPr>
         <w:bidi w:val="1"/>
-        <w:spacing w:after="60"/>
-        <w:ind w:right="360"/>
+        <w:spacing w:after="100" w:line="300" w:lineRule="auto"/>
+        <w:ind w:right="255"/>
         <w:jc w:val="right"/>
       </w:pPr>
       <w:r>
         <w:rPr>
-          <w:rFonts w:ascii="Arial" w:hAnsi="Arial" w:cs="Arial"/>
+          <w:rFonts w:ascii="Tahoma" w:hAnsi="Tahoma" w:cs="Tahoma"/>
           <w:b w:val="0"/>
-          <w:sz w:val="24"/>
+          <w:sz w:val="23"/>
         </w:rPr>
         <w:t>• كل عضو يعمل على branch منفصل عند تجربة تعديل كبير.</w:t>
       </w:r>
@@ -3030,15 +4175,15 @@
     <w:p>
       <w:pPr>
         <w:bidi w:val="1"/>
-        <w:spacing w:after="60"/>
-        <w:ind w:right="360"/>
+        <w:spacing w:after="100" w:line="300" w:lineRule="auto"/>
+        <w:ind w:right="255"/>
         <w:jc w:val="right"/>
       </w:pPr>
       <w:r>
         <w:rPr>
-          <w:rFonts w:ascii="Arial" w:hAnsi="Arial" w:cs="Arial"/>
+          <w:rFonts w:ascii="Tahoma" w:hAnsi="Tahoma" w:cs="Tahoma"/>
           <w:b w:val="0"/>
-          <w:sz w:val="24"/>
+          <w:sz w:val="23"/>
         </w:rPr>
         <w:t>• بعد أي تجربة ناجحة، يرسل Pull Request أو يخبر الفريق بالملفات والنتائج.</w:t>
       </w:r>
@@ -3046,15 +4191,15 @@
     <w:p>
       <w:pPr>
         <w:bidi w:val="1"/>
-        <w:spacing w:after="60"/>
-        <w:ind w:right="360"/>
+        <w:spacing w:after="100" w:line="300" w:lineRule="auto"/>
+        <w:ind w:right="255"/>
         <w:jc w:val="right"/>
       </w:pPr>
       <w:r>
         <w:rPr>
-          <w:rFonts w:ascii="Arial" w:hAnsi="Arial" w:cs="Arial"/>
+          <w:rFonts w:ascii="Tahoma" w:hAnsi="Tahoma" w:cs="Tahoma"/>
           <w:b w:val="0"/>
-          <w:sz w:val="24"/>
+          <w:sz w:val="23"/>
         </w:rPr>
         <w:t>• لا نعتمد على Public score فقط لاختيار الحل النهائي.</w:t>
       </w:r>
@@ -3062,31 +4207,31 @@
     <w:p>
       <w:pPr>
         <w:bidi w:val="1"/>
-        <w:spacing w:after="60"/>
-        <w:ind w:right="360"/>
+        <w:spacing w:after="100" w:line="300" w:lineRule="auto"/>
+        <w:ind w:right="255"/>
         <w:jc w:val="right"/>
       </w:pPr>
       <w:r>
         <w:rPr>
-          <w:rFonts w:ascii="Arial" w:hAnsi="Arial" w:cs="Arial"/>
+          <w:rFonts w:ascii="Tahoma" w:hAnsi="Tahoma" w:cs="Tahoma"/>
           <w:b w:val="0"/>
-          <w:sz w:val="24"/>
+          <w:sz w:val="23"/>
         </w:rPr>
-        <w:t>• mlflow.db ملف واحد، لذلك قد يحدث conflict إذا عدله أكثر من شخص في نفس الوقت.</w:t>
+        <w:t>• ملف mlflow.db ملف واحد، لذلك قد يحدث conflict إذا عدله أكثر من شخص في نفس الوقت.</w:t>
       </w:r>
     </w:p>
     <w:p>
       <w:pPr>
         <w:bidi w:val="1"/>
-        <w:spacing w:after="60"/>
-        <w:ind w:right="360"/>
+        <w:spacing w:after="100" w:line="300" w:lineRule="auto"/>
+        <w:ind w:right="255"/>
         <w:jc w:val="right"/>
       </w:pPr>
       <w:r>
         <w:rPr>
-          <w:rFonts w:ascii="Arial" w:hAnsi="Arial" w:cs="Arial"/>
+          <w:rFonts w:ascii="Tahoma" w:hAnsi="Tahoma" w:cs="Tahoma"/>
           <w:b w:val="0"/>
-          <w:sz w:val="24"/>
+          <w:sz w:val="23"/>
         </w:rPr>
         <w:t>• عند الدمج النهائي، نختار أفضل تجربة موثقة ونشغل النوتبوك مرة واحدة ثم نأخذ screenshot من MLflow.</w:t>
       </w:r>
@@ -3094,15 +4239,15 @@
     <w:p>
       <w:pPr>
         <w:bidi w:val="1"/>
-        <w:spacing w:before="200" w:after="120"/>
+        <w:spacing w:before="280" w:after="160" w:line="288" w:lineRule="auto"/>
         <w:jc w:val="right"/>
       </w:pPr>
       <w:r>
         <w:rPr>
-          <w:rFonts w:ascii="Arial" w:hAnsi="Arial" w:cs="Arial"/>
+          <w:rFonts w:ascii="Tahoma" w:hAnsi="Tahoma" w:cs="Tahoma"/>
           <w:b/>
           <w:color w:val="1F4E79"/>
-          <w:sz w:val="36"/>
+          <w:sz w:val="40"/>
         </w:rPr>
         <w:t>12. قائمة التحقق قبل التسليم</w:t>
       </w:r>
@@ -3110,15 +4255,15 @@
     <w:p>
       <w:pPr>
         <w:bidi w:val="1"/>
-        <w:spacing w:after="60"/>
-        <w:ind w:right="360"/>
+        <w:spacing w:after="100" w:line="300" w:lineRule="auto"/>
+        <w:ind w:right="255"/>
         <w:jc w:val="right"/>
       </w:pPr>
       <w:r>
         <w:rPr>
-          <w:rFonts w:ascii="Arial" w:hAnsi="Arial" w:cs="Arial"/>
+          <w:rFonts w:ascii="Tahoma" w:hAnsi="Tahoma" w:cs="Tahoma"/>
           <w:b w:val="0"/>
-          <w:sz w:val="24"/>
+          <w:sz w:val="23"/>
         </w:rPr>
         <w:t>• تشغيل classification_pipeline.ipynb من البداية للنهاية بدون أخطاء.</w:t>
       </w:r>
@@ -3126,15 +4271,15 @@
     <w:p>
       <w:pPr>
         <w:bidi w:val="1"/>
-        <w:spacing w:after="60"/>
-        <w:ind w:right="360"/>
+        <w:spacing w:after="100" w:line="300" w:lineRule="auto"/>
+        <w:ind w:right="255"/>
         <w:jc w:val="right"/>
       </w:pPr>
       <w:r>
         <w:rPr>
-          <w:rFonts w:ascii="Arial" w:hAnsi="Arial" w:cs="Arial"/>
+          <w:rFonts w:ascii="Tahoma" w:hAnsi="Tahoma" w:cs="Tahoma"/>
           <w:b w:val="0"/>
-          <w:sz w:val="24"/>
+          <w:sz w:val="23"/>
         </w:rPr>
         <w:t>• التأكد أن submission.csv يحتوي عمودين فقط: ID و target.</w:t>
       </w:r>
@@ -3142,31 +4287,31 @@
     <w:p>
       <w:pPr>
         <w:bidi w:val="1"/>
-        <w:spacing w:after="60"/>
-        <w:ind w:right="360"/>
+        <w:spacing w:after="100" w:line="300" w:lineRule="auto"/>
+        <w:ind w:right="255"/>
         <w:jc w:val="right"/>
       </w:pPr>
       <w:r>
         <w:rPr>
-          <w:rFonts w:ascii="Arial" w:hAnsi="Arial" w:cs="Arial"/>
+          <w:rFonts w:ascii="Tahoma" w:hAnsi="Tahoma" w:cs="Tahoma"/>
           <w:b w:val="0"/>
-          <w:sz w:val="24"/>
+          <w:sz w:val="23"/>
         </w:rPr>
-        <w:t>• التأكد أن توزيع submission.csv هو class1=81, class2=188, class3=2931 للنسخة الحالية.</w:t>
+        <w:t>• التأكد أن توزيع submission.csv هو class1=81 و class2=188 و class3=2931 للنسخة الحالية.</w:t>
       </w:r>
     </w:p>
     <w:p>
       <w:pPr>
         <w:bidi w:val="1"/>
-        <w:spacing w:after="60"/>
-        <w:ind w:right="360"/>
+        <w:spacing w:after="100" w:line="300" w:lineRule="auto"/>
+        <w:ind w:right="255"/>
         <w:jc w:val="right"/>
       </w:pPr>
       <w:r>
         <w:rPr>
-          <w:rFonts w:ascii="Arial" w:hAnsi="Arial" w:cs="Arial"/>
+          <w:rFonts w:ascii="Tahoma" w:hAnsi="Tahoma" w:cs="Tahoma"/>
           <w:b w:val="0"/>
-          <w:sz w:val="24"/>
+          <w:sz w:val="23"/>
         </w:rPr>
         <w:t>• فتح MLflow UI وأخذ screenshot واضح لجدول التجارب.</w:t>
       </w:r>
@@ -3174,15 +4319,15 @@
     <w:p>
       <w:pPr>
         <w:bidi w:val="1"/>
-        <w:spacing w:after="60"/>
-        <w:ind w:right="360"/>
+        <w:spacing w:after="100" w:line="300" w:lineRule="auto"/>
+        <w:ind w:right="255"/>
         <w:jc w:val="right"/>
       </w:pPr>
       <w:r>
         <w:rPr>
-          <w:rFonts w:ascii="Arial" w:hAnsi="Arial" w:cs="Arial"/>
+          <w:rFonts w:ascii="Tahoma" w:hAnsi="Tahoma" w:cs="Tahoma"/>
           <w:b w:val="0"/>
-          <w:sz w:val="24"/>
+          <w:sz w:val="23"/>
         </w:rPr>
         <w:t>• رفع ملفات ipynb وpy وMLOps Report في النموذج المطلوب.</w:t>
       </w:r>
@@ -3190,15 +4335,15 @@
     <w:p>
       <w:pPr>
         <w:bidi w:val="1"/>
-        <w:spacing w:after="60"/>
-        <w:ind w:right="360"/>
+        <w:spacing w:after="100" w:line="300" w:lineRule="auto"/>
+        <w:ind w:right="255"/>
         <w:jc w:val="right"/>
       </w:pPr>
       <w:r>
         <w:rPr>
-          <w:rFonts w:ascii="Arial" w:hAnsi="Arial" w:cs="Arial"/>
+          <w:rFonts w:ascii="Tahoma" w:hAnsi="Tahoma" w:cs="Tahoma"/>
           <w:b w:val="0"/>
-          <w:sz w:val="24"/>
+          <w:sz w:val="23"/>
         </w:rPr>
         <w:t>• عدم ضغط الملفات لأن التعليمات تقول لا تضغط الملف أبداً.</w:t>
       </w:r>
@@ -3206,15 +4351,15 @@
     <w:p>
       <w:pPr>
         <w:bidi w:val="1"/>
-        <w:spacing w:before="200" w:after="120"/>
+        <w:spacing w:before="280" w:after="160" w:line="288" w:lineRule="auto"/>
         <w:jc w:val="right"/>
       </w:pPr>
       <w:r>
         <w:rPr>
-          <w:rFonts w:ascii="Arial" w:hAnsi="Arial" w:cs="Arial"/>
+          <w:rFonts w:ascii="Tahoma" w:hAnsi="Tahoma" w:cs="Tahoma"/>
           <w:b/>
           <w:color w:val="1F4E79"/>
-          <w:sz w:val="36"/>
+          <w:sz w:val="40"/>
         </w:rPr>
         <w:t>13. الخلاصة</w:t>
       </w:r>
@@ -3222,12 +4367,12 @@
     <w:p>
       <w:pPr>
         <w:bidi w:val="1"/>
-        <w:spacing w:after="120"/>
+        <w:spacing w:before="0" w:after="160" w:line="324" w:lineRule="auto"/>
         <w:jc w:val="right"/>
       </w:pPr>
       <w:r>
         <w:rPr>
-          <w:rFonts w:ascii="Arial" w:hAnsi="Arial" w:cs="Arial"/>
+          <w:rFonts w:ascii="Tahoma" w:hAnsi="Tahoma" w:cs="Tahoma"/>
           <w:b w:val="0"/>
           <w:sz w:val="24"/>
         </w:rPr>
@@ -3236,9 +4381,10 @@
     </w:p>
     <w:sectPr>
       <w:pgSz w:w="12240" w:h="15840"/>
-      <w:pgMar w:top="1008" w:right="1080" w:bottom="1008" w:left="1080" w:header="720" w:footer="720" w:gutter="0"/>
+      <w:pgMar w:top="964" w:right="964" w:bottom="964" w:left="964" w:header="720" w:footer="720" w:gutter="0"/>
       <w:cols w:space="720"/>
       <w:docGrid w:linePitch="360"/>
+      <w:bidi/>
     </w:sectPr>
   </w:body>
 </w:document>
@@ -3608,7 +4754,7 @@
     <w:qFormat/>
     <w:rsid w:val="00FC693F"/>
     <w:rPr>
-      <w:rFonts w:ascii="Arial" w:hAnsi="Arial" w:cs="Arial"/>
+      <w:rFonts w:ascii="Tahoma" w:hAnsi="Tahoma" w:cs="Tahoma"/>
       <w:sz w:val="24"/>
     </w:rPr>
   </w:style>

</xml_diff>